<commit_message>
Update mobile guide screenshots
</commit_message>
<xml_diff>
--- a/docs/Pointers on Using the Interclub Snooker App (Mobile Friendly).docx
+++ b/docs/Pointers on Using the Interclub Snooker App (Mobile Friendly).docx
@@ -2,139 +2,125 @@
 <file path=word/document.xml><?xml version="1.0" encoding="utf-8"?>
 <w:document xmlns:wpc="http://schemas.microsoft.com/office/word/2010/wordprocessingCanvas" xmlns:mo="http://schemas.microsoft.com/office/mac/office/2008/main" xmlns:mc="http://schemas.openxmlformats.org/markup-compatibility/2006" xmlns:mv="urn:schemas-microsoft-com:mac:vml" xmlns:o="urn:schemas-microsoft-com:office:office" xmlns:r="http://schemas.openxmlformats.org/officeDocument/2006/relationships" xmlns:m="http://schemas.openxmlformats.org/officeDocument/2006/math" xmlns:v="urn:schemas-microsoft-com:vml" xmlns:wp14="http://schemas.microsoft.com/office/word/2010/wordprocessingDrawing" xmlns:wp="http://schemas.openxmlformats.org/drawingml/2006/wordprocessingDrawing" xmlns:w10="urn:schemas-microsoft-com:office:word" xmlns:w="http://schemas.openxmlformats.org/wordprocessingml/2006/main" xmlns:w14="http://schemas.microsoft.com/office/word/2010/wordml" xmlns:wpg="http://schemas.microsoft.com/office/word/2010/wordprocessingGroup" xmlns:wpi="http://schemas.microsoft.com/office/word/2010/wordprocessingInk" xmlns:wne="http://schemas.microsoft.com/office/word/2006/wordml" xmlns:wps="http://schemas.microsoft.com/office/word/2010/wordprocessingShape" mc:Ignorable="w14 wp14">
   <w:body>
+    <w:tbl>
+      <w:tblPr>
+        <w:tblW w:type="auto" w:w="0"/>
+        <w:jc w:val="center"/>
+        <w:tblLook w:firstColumn="1" w:firstRow="1" w:lastColumn="0" w:lastRow="0" w:noHBand="0" w:noVBand="1" w:val="04A0"/>
+      </w:tblPr>
+      <w:tblGrid>
+        <w:gridCol w:w="10699"/>
+      </w:tblGrid>
+      <w:tr>
+        <w:tc>
+          <w:tcPr>
+            <w:tcW w:type="dxa" w:w="10699"/>
+            <w:shd w:fill="10233F"/>
+            <w:tcBorders>
+              <w:top w:val="single" w:sz="8" w:space="0" w:color="10233F"/>
+              <w:left w:val="single" w:sz="8" w:space="0" w:color="10233F"/>
+              <w:bottom w:val="single" w:sz="8" w:space="0" w:color="10233F"/>
+              <w:right w:val="single" w:sz="8" w:space="0" w:color="10233F"/>
+            </w:tcBorders>
+          </w:tcPr>
+          <w:p>
+            <w:pPr>
+              <w:spacing w:after="0" w:before="200"/>
+            </w:pPr>
+            <w:r>
+              <w:rPr>
+                <w:rFonts w:ascii="Arial" w:hAnsi="Arial" w:eastAsia="Arial"/>
+                <w:b/>
+                <w:color w:val="FFFFFF"/>
+                <w:sz w:val="20"/>
+              </w:rPr>
+              <w:t>INTERCLUB SNOOKER</w:t>
+            </w:r>
+          </w:p>
+          <w:p>
+            <w:pPr>
+              <w:spacing w:after="40"/>
+            </w:pPr>
+            <w:r>
+              <w:rPr>
+                <w:rFonts w:ascii="Arial" w:hAnsi="Arial" w:eastAsia="Arial"/>
+                <w:b/>
+                <w:color w:val="FFFFFF"/>
+                <w:sz w:val="44"/>
+              </w:rPr>
+              <w:t>Pointers on Using the App</w:t>
+            </w:r>
+          </w:p>
+          <w:p>
+            <w:pPr>
+              <w:spacing w:after="200"/>
+            </w:pPr>
+            <w:r>
+              <w:rPr>
+                <w:rFonts w:ascii="Arial" w:hAnsi="Arial" w:eastAsia="Arial"/>
+                <w:color w:val="D7DEE9"/>
+                <w:sz w:val="20"/>
+              </w:rPr>
+              <w:t>Mobile friendly guide for players and managers</w:t>
+            </w:r>
+          </w:p>
+        </w:tc>
+      </w:tr>
+    </w:tbl>
     <w:p>
       <w:pPr>
-        <w:pStyle w:val="Title"/>
-        <w:spacing w:after="200"/>
-        <w:jc w:val="center"/>
+        <w:spacing w:before="160" w:after="60" w:line="252" w:lineRule="auto"/>
       </w:pPr>
       <w:r>
         <w:rPr>
-          <w:color w:val="000000"/>
+          <w:rFonts w:ascii="Arial" w:hAnsi="Arial" w:eastAsia="Arial"/>
+          <w:b/>
+          <w:color w:val="10233F"/>
+          <w:sz w:val="24"/>
         </w:rPr>
-        <w:t>Pointers on Using the Interclub Snooker App (Mobile Friendly)</w:t>
-      </w:r>
-    </w:p>
-    <w:p>
-      <w:pPr>
-        <w:spacing w:after="160"/>
-        <w:jc w:val="center"/>
-      </w:pPr>
-      <w:r>
-        <w:drawing>
-          <wp:inline xmlns:a="http://schemas.openxmlformats.org/drawingml/2006/main" xmlns:pic="http://schemas.openxmlformats.org/drawingml/2006/picture">
-            <wp:extent cx="685800" cy="849630"/>
-            <wp:docPr id="1" name="Picture 1"/>
-            <wp:cNvGraphicFramePr>
-              <a:graphicFrameLocks noChangeAspect="1"/>
-            </wp:cNvGraphicFramePr>
-            <a:graphic>
-              <a:graphicData uri="http://schemas.openxmlformats.org/drawingml/2006/picture">
-                <pic:pic>
-                  <pic:nvPicPr>
-                    <pic:cNvPr id="0" name="snooker-logo.png"/>
-                    <pic:cNvPicPr/>
-                  </pic:nvPicPr>
-                  <pic:blipFill>
-                    <a:blip r:embed="rId9"/>
-                    <a:stretch>
-                      <a:fillRect/>
-                    </a:stretch>
-                  </pic:blipFill>
-                  <pic:spPr>
-                    <a:xfrm>
-                      <a:off x="0" y="0"/>
-                      <a:ext cx="685800" cy="849630"/>
-                    </a:xfrm>
-                    <a:prstGeom prst="rect"/>
-                  </pic:spPr>
-                </pic:pic>
-              </a:graphicData>
-            </a:graphic>
-          </wp:inline>
-        </w:drawing>
-      </w:r>
-    </w:p>
-    <w:p>
-      <w:pPr>
-        <w:spacing w:after="280"/>
-        <w:jc w:val="center"/>
-      </w:pPr>
-      <w:r>
-        <w:rPr>
-          <w:color w:val="6C5A73"/>
-          <w:sz w:val="23"/>
-        </w:rPr>
-        <w:t>A quick phone friendly guide for signing in, following your team, picking lineups, and entering match scores and breaks.</w:t>
-      </w:r>
-    </w:p>
-    <w:p>
-      <w:pPr>
-        <w:pStyle w:val="Heading1"/>
-        <w:spacing w:before="280" w:after="100"/>
-      </w:pPr>
-      <w:r>
-        <w:rPr>
-          <w:color w:val="000000"/>
-        </w:rPr>
-        <w:t>What this guide covers</w:t>
+        <w:t>Quick version</w:t>
       </w:r>
     </w:p>
     <w:p>
       <w:pPr>
         <w:pStyle w:val="ListBullet"/>
-        <w:spacing w:after="60"/>
+        <w:spacing w:after="40" w:line="240" w:lineRule="auto"/>
       </w:pPr>
       <w:r>
-        <w:t>How to sign in or activate an account from an invite.</w:t>
+        <w:rPr>
+          <w:rFonts w:ascii="Arial" w:hAnsi="Arial" w:eastAsia="Arial"/>
+          <w:color w:val="10233F"/>
+          <w:sz w:val="17"/>
+        </w:rPr>
+        <w:t>Players use the app to see their own stats, league table, fixtures/results, club information and competitions.</w:t>
       </w:r>
     </w:p>
     <w:p>
       <w:pPr>
         <w:pStyle w:val="ListBullet"/>
-        <w:spacing w:after="60"/>
+        <w:spacing w:after="40" w:line="240" w:lineRule="auto"/>
       </w:pPr>
       <w:r>
-        <w:t>What players see on the home page during the season.</w:t>
+        <w:rPr>
+          <w:rFonts w:ascii="Arial" w:hAnsi="Arial" w:eastAsia="Arial"/>
+          <w:color w:val="10233F"/>
+          <w:sz w:val="17"/>
+        </w:rPr>
+        <w:t>Managers get team controls for their own matches: pick the team, publish the team sheet, enter scores and record breaks.</w:t>
       </w:r>
     </w:p>
     <w:p>
       <w:pPr>
         <w:pStyle w:val="ListBullet"/>
-        <w:spacing w:after="60"/>
-      </w:pPr>
-      <w:r>
-        <w:t>How managers pick and publish a team lineup.</w:t>
-      </w:r>
-    </w:p>
-    <w:p>
-      <w:pPr>
-        <w:pStyle w:val="ListBullet"/>
-        <w:spacing w:after="60"/>
-      </w:pPr>
-      <w:r>
-        <w:t>How managers enter scores and record breaks on match night.</w:t>
-      </w:r>
-    </w:p>
-    <w:p>
-      <w:pPr>
-        <w:pStyle w:val="ListBullet"/>
-        <w:spacing w:after="60"/>
-      </w:pPr>
-      <w:r>
-        <w:t>Where to find fixtures, tables, player stats, club bookings and competitions.</w:t>
-      </w:r>
-    </w:p>
-    <w:p>
-      <w:pPr>
-        <w:pStyle w:val="Heading1"/>
-        <w:spacing w:before="280" w:after="100"/>
+        <w:spacing w:after="40" w:line="240" w:lineRule="auto"/>
       </w:pPr>
       <w:r>
         <w:rPr>
-          <w:color w:val="000000"/>
+          <w:rFonts w:ascii="Arial" w:hAnsi="Arial" w:eastAsia="Arial"/>
+          <w:color w:val="10233F"/>
+          <w:sz w:val="17"/>
         </w:rPr>
-        <w:t>Role summary</w:t>
+        <w:t>The season picker is no longer shown in the main app. Your current role and team drive what you see.</w:t>
       </w:r>
     </w:p>
     <w:tbl>
@@ -145,1403 +131,138 @@
         <w:tblLook w:firstColumn="1" w:firstRow="1" w:lastColumn="0" w:lastRow="0" w:noHBand="0" w:noVBand="1" w:val="04A0"/>
       </w:tblPr>
       <w:tblGrid>
-        <w:gridCol w:w="3355"/>
-        <w:gridCol w:w="3355"/>
+        <w:gridCol w:w="5616"/>
+        <w:gridCol w:w="3528"/>
       </w:tblGrid>
       <w:tr>
         <w:tc>
           <w:tcPr>
-            <w:tcW w:type="dxa" w:w="1512"/>
-            <w:shd w:fill="10233F"/>
+            <w:tcW w:type="dxa" w:w="5349"/>
+            <w:vAlign w:val="top"/>
             <w:tcBorders>
-              <w:top w:val="single" w:sz="6" w:space="0" w:color="D9D9D9"/>
-              <w:left w:val="single" w:sz="6" w:space="0" w:color="D9D9D9"/>
-              <w:bottom w:val="single" w:sz="6" w:space="0" w:color="D9D9D9"/>
-              <w:right w:val="single" w:sz="6" w:space="0" w:color="D9D9D9"/>
-              <w:insideH w:val="single" w:sz="6" w:space="0" w:color="D9D9D9"/>
-              <w:insideV w:val="single" w:sz="6" w:space="0" w:color="D9D9D9"/>
+              <w:top w:val="single" w:sz="8" w:space="0" w:color="E6E0EB"/>
+              <w:left w:val="single" w:sz="8" w:space="0" w:color="E6E0EB"/>
+              <w:bottom w:val="single" w:sz="8" w:space="0" w:color="E6E0EB"/>
+              <w:right w:val="single" w:sz="8" w:space="0" w:color="E6E0EB"/>
             </w:tcBorders>
-            <w:vAlign w:val="center"/>
+            <w:shd w:fill="FFFFFF"/>
           </w:tcPr>
           <w:p>
             <w:pPr>
-              <w:jc w:val="center"/>
+              <w:spacing w:after="80"/>
             </w:pPr>
             <w:r>
               <w:rPr>
+                <w:rFonts w:ascii="Arial" w:hAnsi="Arial" w:eastAsia="Arial"/>
                 <w:b/>
-                <w:color w:val="FFFFFF"/>
-                <w:sz w:val="19"/>
+                <w:color w:val="25002B"/>
+                <w:sz w:val="21"/>
               </w:rPr>
-              <w:t>Role</w:t>
+              <w:t>SIGN IN</w:t>
+            </w:r>
+          </w:p>
+          <w:p>
+            <w:pPr>
+              <w:pStyle w:val="ListBullet"/>
+              <w:spacing w:after="40" w:line="240" w:lineRule="auto"/>
+            </w:pPr>
+            <w:r>
+              <w:rPr>
+                <w:rFonts w:ascii="Arial" w:hAnsi="Arial" w:eastAsia="Arial"/>
+                <w:color w:val="10233F"/>
+                <w:sz w:val="17"/>
+              </w:rPr>
+              <w:t>Use the email/password created through your invite, or use Google if that email matches your account.</w:t>
+            </w:r>
+          </w:p>
+          <w:p>
+            <w:pPr>
+              <w:pStyle w:val="ListBullet"/>
+              <w:spacing w:after="40" w:line="240" w:lineRule="auto"/>
+            </w:pPr>
+            <w:r>
+              <w:rPr>
+                <w:rFonts w:ascii="Arial" w:hAnsi="Arial" w:eastAsia="Arial"/>
+                <w:color w:val="10233F"/>
+                <w:sz w:val="17"/>
+              </w:rPr>
+              <w:t>New users should start from the invite link sent by the club or league administrator.</w:t>
+            </w:r>
+          </w:p>
+          <w:p>
+            <w:pPr>
+              <w:pStyle w:val="ListBullet"/>
+              <w:spacing w:after="40" w:line="240" w:lineRule="auto"/>
+            </w:pPr>
+            <w:r>
+              <w:rPr>
+                <w:rFonts w:ascii="Arial" w:hAnsi="Arial" w:eastAsia="Arial"/>
+                <w:color w:val="10233F"/>
+                <w:sz w:val="17"/>
+              </w:rPr>
+              <w:t>Once you are signed in, the app opens around your role and team.</w:t>
             </w:r>
           </w:p>
         </w:tc>
         <w:tc>
           <w:tcPr>
-            <w:tcW w:type="dxa" w:w="5112"/>
-            <w:shd w:fill="10233F"/>
+            <w:tcW w:type="dxa" w:w="5349"/>
+            <w:vAlign w:val="top"/>
             <w:tcBorders>
-              <w:top w:val="single" w:sz="6" w:space="0" w:color="D9D9D9"/>
-              <w:left w:val="single" w:sz="6" w:space="0" w:color="D9D9D9"/>
-              <w:bottom w:val="single" w:sz="6" w:space="0" w:color="D9D9D9"/>
-              <w:right w:val="single" w:sz="6" w:space="0" w:color="D9D9D9"/>
-              <w:insideH w:val="single" w:sz="6" w:space="0" w:color="D9D9D9"/>
-              <w:insideV w:val="single" w:sz="6" w:space="0" w:color="D9D9D9"/>
+              <w:top w:val="single" w:sz="8" w:space="0" w:color="E6E0EB"/>
+              <w:left w:val="single" w:sz="8" w:space="0" w:color="E6E0EB"/>
+              <w:bottom w:val="single" w:sz="8" w:space="0" w:color="E6E0EB"/>
+              <w:right w:val="single" w:sz="8" w:space="0" w:color="E6E0EB"/>
             </w:tcBorders>
-            <w:vAlign w:val="center"/>
+            <w:shd w:fill="FFFFFF"/>
           </w:tcPr>
           <w:p>
             <w:pPr>
-              <w:jc w:val="left"/>
-            </w:pPr>
-            <w:r>
-              <w:rPr>
-                <w:b/>
-                <w:color w:val="FFFFFF"/>
-                <w:sz w:val="19"/>
-              </w:rPr>
-              <w:t>What you can do</w:t>
-            </w:r>
-          </w:p>
-        </w:tc>
-      </w:tr>
-      <w:tr>
-        <w:tc>
-          <w:tcPr>
-            <w:tcW w:type="dxa" w:w="1512"/>
-            <w:shd w:fill="FFFFFF"/>
-            <w:tcBorders>
-              <w:top w:val="single" w:sz="6" w:space="0" w:color="D9D9D9"/>
-              <w:left w:val="single" w:sz="6" w:space="0" w:color="D9D9D9"/>
-              <w:bottom w:val="single" w:sz="6" w:space="0" w:color="D9D9D9"/>
-              <w:right w:val="single" w:sz="6" w:space="0" w:color="D9D9D9"/>
-              <w:insideH w:val="single" w:sz="6" w:space="0" w:color="D9D9D9"/>
-              <w:insideV w:val="single" w:sz="6" w:space="0" w:color="D9D9D9"/>
-            </w:tcBorders>
-            <w:vAlign w:val="center"/>
-          </w:tcPr>
-          <w:p>
-            <w:pPr>
+              <w:spacing w:after="0"/>
               <w:jc w:val="center"/>
             </w:pPr>
             <w:r>
-              <w:rPr>
-                <w:sz w:val="19"/>
-              </w:rPr>
-              <w:t>Player</w:t>
-            </w:r>
-          </w:p>
-        </w:tc>
-        <w:tc>
-          <w:tcPr>
-            <w:tcW w:type="dxa" w:w="5112"/>
-            <w:shd w:fill="FFFFFF"/>
-            <w:tcBorders>
-              <w:top w:val="single" w:sz="6" w:space="0" w:color="D9D9D9"/>
-              <w:left w:val="single" w:sz="6" w:space="0" w:color="D9D9D9"/>
-              <w:bottom w:val="single" w:sz="6" w:space="0" w:color="D9D9D9"/>
-              <w:right w:val="single" w:sz="6" w:space="0" w:color="D9D9D9"/>
-              <w:insideH w:val="single" w:sz="6" w:space="0" w:color="D9D9D9"/>
-              <w:insideV w:val="single" w:sz="6" w:space="0" w:color="D9D9D9"/>
-            </w:tcBorders>
-            <w:vAlign w:val="center"/>
-          </w:tcPr>
-          <w:p>
-            <w:pPr>
-              <w:jc w:val="left"/>
-            </w:pPr>
-            <w:r>
-              <w:rPr>
-                <w:sz w:val="19"/>
-              </w:rPr>
-              <w:t>View your team, fixtures, tables, personal stats and match details when active.</w:t>
-            </w:r>
-          </w:p>
-        </w:tc>
-      </w:tr>
-      <w:tr>
-        <w:tc>
-          <w:tcPr>
-            <w:tcW w:type="dxa" w:w="1512"/>
-            <w:shd w:fill="FFFFFF"/>
-            <w:tcBorders>
-              <w:top w:val="single" w:sz="6" w:space="0" w:color="D9D9D9"/>
-              <w:left w:val="single" w:sz="6" w:space="0" w:color="D9D9D9"/>
-              <w:bottom w:val="single" w:sz="6" w:space="0" w:color="D9D9D9"/>
-              <w:right w:val="single" w:sz="6" w:space="0" w:color="D9D9D9"/>
-              <w:insideH w:val="single" w:sz="6" w:space="0" w:color="D9D9D9"/>
-              <w:insideV w:val="single" w:sz="6" w:space="0" w:color="D9D9D9"/>
-            </w:tcBorders>
-            <w:vAlign w:val="center"/>
-          </w:tcPr>
-          <w:p>
-            <w:pPr>
-              <w:jc w:val="center"/>
-            </w:pPr>
-            <w:r>
-              <w:rPr>
-                <w:sz w:val="19"/>
-              </w:rPr>
-              <w:t>Manager</w:t>
-            </w:r>
-          </w:p>
-        </w:tc>
-        <w:tc>
-          <w:tcPr>
-            <w:tcW w:type="dxa" w:w="5112"/>
-            <w:shd w:fill="FFFFFF"/>
-            <w:tcBorders>
-              <w:top w:val="single" w:sz="6" w:space="0" w:color="D9D9D9"/>
-              <w:left w:val="single" w:sz="6" w:space="0" w:color="D9D9D9"/>
-              <w:bottom w:val="single" w:sz="6" w:space="0" w:color="D9D9D9"/>
-              <w:right w:val="single" w:sz="6" w:space="0" w:color="D9D9D9"/>
-              <w:insideH w:val="single" w:sz="6" w:space="0" w:color="D9D9D9"/>
-              <w:insideV w:val="single" w:sz="6" w:space="0" w:color="D9D9D9"/>
-            </w:tcBorders>
-            <w:vAlign w:val="center"/>
-          </w:tcPr>
-          <w:p>
-            <w:pPr>
-              <w:jc w:val="left"/>
-            </w:pPr>
-            <w:r>
-              <w:rPr>
-                <w:sz w:val="19"/>
-              </w:rPr>
-              <w:t>Everything a player can do, plus pick lineups, publish teams, enter scores and record breaks.</w:t>
-            </w:r>
-          </w:p>
-        </w:tc>
-      </w:tr>
-      <w:tr>
-        <w:tc>
-          <w:tcPr>
-            <w:tcW w:type="dxa" w:w="1512"/>
-            <w:shd w:fill="FFFFFF"/>
-            <w:tcBorders>
-              <w:top w:val="single" w:sz="6" w:space="0" w:color="D9D9D9"/>
-              <w:left w:val="single" w:sz="6" w:space="0" w:color="D9D9D9"/>
-              <w:bottom w:val="single" w:sz="6" w:space="0" w:color="D9D9D9"/>
-              <w:right w:val="single" w:sz="6" w:space="0" w:color="D9D9D9"/>
-              <w:insideH w:val="single" w:sz="6" w:space="0" w:color="D9D9D9"/>
-              <w:insideV w:val="single" w:sz="6" w:space="0" w:color="D9D9D9"/>
-            </w:tcBorders>
-            <w:vAlign w:val="center"/>
-          </w:tcPr>
-          <w:p>
-            <w:pPr>
-              <w:jc w:val="center"/>
-            </w:pPr>
-            <w:r>
-              <w:rPr>
-                <w:sz w:val="19"/>
-              </w:rPr>
-              <w:t>Club member</w:t>
-            </w:r>
-          </w:p>
-        </w:tc>
-        <w:tc>
-          <w:tcPr>
-            <w:tcW w:type="dxa" w:w="5112"/>
-            <w:shd w:fill="FFFFFF"/>
-            <w:tcBorders>
-              <w:top w:val="single" w:sz="6" w:space="0" w:color="D9D9D9"/>
-              <w:left w:val="single" w:sz="6" w:space="0" w:color="D9D9D9"/>
-              <w:bottom w:val="single" w:sz="6" w:space="0" w:color="D9D9D9"/>
-              <w:right w:val="single" w:sz="6" w:space="0" w:color="D9D9D9"/>
-              <w:insideH w:val="single" w:sz="6" w:space="0" w:color="D9D9D9"/>
-              <w:insideV w:val="single" w:sz="6" w:space="0" w:color="D9D9D9"/>
-            </w:tcBorders>
-            <w:vAlign w:val="center"/>
-          </w:tcPr>
-          <w:p>
-            <w:pPr>
-              <w:jc w:val="left"/>
-            </w:pPr>
-            <w:r>
-              <w:rPr>
-                <w:sz w:val="19"/>
-              </w:rPr>
-              <w:t>Book club tables, enter competitions, and view club information.</w:t>
+              <w:drawing>
+                <wp:inline xmlns:a="http://schemas.openxmlformats.org/drawingml/2006/main" xmlns:pic="http://schemas.openxmlformats.org/drawingml/2006/picture">
+                  <wp:extent cx="1783080" cy="3593592"/>
+                  <wp:docPr id="1" name="Picture 1"/>
+                  <wp:cNvGraphicFramePr>
+                    <a:graphicFrameLocks noChangeAspect="1"/>
+                  </wp:cNvGraphicFramePr>
+                  <a:graphic>
+                    <a:graphicData uri="http://schemas.openxmlformats.org/drawingml/2006/picture">
+                      <pic:pic>
+                        <pic:nvPicPr>
+                          <pic:cNvPr id="0" name="01-login.png"/>
+                          <pic:cNvPicPr/>
+                        </pic:nvPicPr>
+                        <pic:blipFill>
+                          <a:blip r:embed="rId9"/>
+                          <a:stretch>
+                            <a:fillRect/>
+                          </a:stretch>
+                        </pic:blipFill>
+                        <pic:spPr>
+                          <a:xfrm>
+                            <a:off x="0" y="0"/>
+                            <a:ext cx="1783080" cy="3593592"/>
+                          </a:xfrm>
+                          <a:prstGeom prst="rect"/>
+                        </pic:spPr>
+                      </pic:pic>
+                    </a:graphicData>
+                  </a:graphic>
+                </wp:inline>
+              </w:drawing>
             </w:r>
           </w:p>
         </w:tc>
       </w:tr>
     </w:tbl>
     <w:p>
-      <w:r>
-        <w:br w:type="page"/>
-      </w:r>
-    </w:p>
-    <w:p>
       <w:pPr>
-        <w:pStyle w:val="Heading1"/>
-        <w:spacing w:before="280" w:after="100"/>
+        <w:spacing w:after="40"/>
       </w:pPr>
-      <w:r>
-        <w:rPr>
-          <w:color w:val="000000"/>
-        </w:rPr>
-        <w:t>Signing in</w:t>
-      </w:r>
-    </w:p>
-    <w:p>
-      <w:pPr>
-        <w:spacing w:before="0" w:after="160"/>
-      </w:pPr>
-      <w:r>
-        <w:t>The app is invite only. You cannot create a new account unless an administrator has set you up first.</w:t>
-      </w:r>
-    </w:p>
-    <w:p>
-      <w:pPr>
-        <w:pStyle w:val="ListNumber"/>
-        <w:spacing w:after="60"/>
-      </w:pPr>
-      <w:r>
-        <w:t>Open interclubsnooker.com on your phone.</w:t>
-      </w:r>
-    </w:p>
-    <w:p>
-      <w:pPr>
-        <w:pStyle w:val="ListNumber"/>
-        <w:spacing w:after="60"/>
-      </w:pPr>
-      <w:r>
-        <w:t>Use your email and password, or Sign in with Google if your account is connected to Google.</w:t>
-      </w:r>
-    </w:p>
-    <w:p>
-      <w:pPr>
-        <w:pStyle w:val="ListNumber"/>
-        <w:spacing w:after="60"/>
-      </w:pPr>
-      <w:r>
-        <w:t>If you received an activation email, tap the activation link first, set your password, and then continue into the app.</w:t>
-      </w:r>
-    </w:p>
-    <w:p>
-      <w:pPr>
-        <w:pStyle w:val="ListNumber"/>
-        <w:spacing w:after="60"/>
-      </w:pPr>
-      <w:r>
-        <w:t>After login, choose your season and role if more than one is available.</w:t>
-      </w:r>
-    </w:p>
-    <w:p>
-      <w:pPr>
-        <w:spacing w:before="80" w:after="40"/>
-        <w:jc w:val="center"/>
-      </w:pPr>
-      <w:r>
-        <w:drawing>
-          <wp:inline xmlns:a="http://schemas.openxmlformats.org/drawingml/2006/main" xmlns:pic="http://schemas.openxmlformats.org/drawingml/2006/picture">
-            <wp:extent cx="2514600" cy="5441852"/>
-            <wp:docPr id="2" name="Picture 2"/>
-            <wp:cNvGraphicFramePr>
-              <a:graphicFrameLocks noChangeAspect="1"/>
-            </wp:cNvGraphicFramePr>
-            <a:graphic>
-              <a:graphicData uri="http://schemas.openxmlformats.org/drawingml/2006/picture">
-                <pic:pic>
-                  <pic:nvPicPr>
-                    <pic:cNvPr id="0" name="01-login.png"/>
-                    <pic:cNvPicPr/>
-                  </pic:nvPicPr>
-                  <pic:blipFill>
-                    <a:blip r:embed="rId10"/>
-                    <a:stretch>
-                      <a:fillRect/>
-                    </a:stretch>
-                  </pic:blipFill>
-                  <pic:spPr>
-                    <a:xfrm>
-                      <a:off x="0" y="0"/>
-                      <a:ext cx="2514600" cy="5441852"/>
-                    </a:xfrm>
-                    <a:prstGeom prst="rect"/>
-                  </pic:spPr>
-                </pic:pic>
-              </a:graphicData>
-            </a:graphic>
-          </wp:inline>
-        </w:drawing>
-      </w:r>
-    </w:p>
-    <w:p>
-      <w:pPr>
-        <w:spacing w:after="160"/>
-        <w:jc w:val="center"/>
-      </w:pPr>
-      <w:r>
-        <w:rPr>
-          <w:i/>
-          <w:color w:val="6C5A73"/>
-          <w:sz w:val="17"/>
-        </w:rPr>
-        <w:t>Sign in page for existing users</w:t>
-      </w:r>
-    </w:p>
-    <w:p>
-      <w:pPr>
-        <w:spacing w:before="80" w:after="40"/>
-        <w:jc w:val="center"/>
-      </w:pPr>
-      <w:r>
-        <w:drawing>
-          <wp:inline xmlns:a="http://schemas.openxmlformats.org/drawingml/2006/main" xmlns:pic="http://schemas.openxmlformats.org/drawingml/2006/picture">
-            <wp:extent cx="2514600" cy="5441852"/>
-            <wp:docPr id="3" name="Picture 3"/>
-            <wp:cNvGraphicFramePr>
-              <a:graphicFrameLocks noChangeAspect="1"/>
-            </wp:cNvGraphicFramePr>
-            <a:graphic>
-              <a:graphicData uri="http://schemas.openxmlformats.org/drawingml/2006/picture">
-                <pic:pic>
-                  <pic:nvPicPr>
-                    <pic:cNvPr id="0" name="02-player-home.png"/>
-                    <pic:cNvPicPr/>
-                  </pic:nvPicPr>
-                  <pic:blipFill>
-                    <a:blip r:embed="rId11"/>
-                    <a:stretch>
-                      <a:fillRect/>
-                    </a:stretch>
-                  </pic:blipFill>
-                  <pic:spPr>
-                    <a:xfrm>
-                      <a:off x="0" y="0"/>
-                      <a:ext cx="2514600" cy="5441852"/>
-                    </a:xfrm>
-                    <a:prstGeom prst="rect"/>
-                  </pic:spPr>
-                </pic:pic>
-              </a:graphicData>
-            </a:graphic>
-          </wp:inline>
-        </w:drawing>
-      </w:r>
-    </w:p>
-    <w:p>
-      <w:pPr>
-        <w:spacing w:after="160"/>
-        <w:jc w:val="center"/>
-      </w:pPr>
-      <w:r>
-        <w:rPr>
-          <w:i/>
-          <w:color w:val="6C5A73"/>
-          <w:sz w:val="17"/>
-        </w:rPr>
-        <w:t>Player home after signing in</w:t>
-      </w:r>
-    </w:p>
-    <w:p>
-      <w:r>
-        <w:br w:type="page"/>
-      </w:r>
-    </w:p>
-    <w:p>
-      <w:pPr>
-        <w:pStyle w:val="Heading1"/>
-        <w:spacing w:before="280" w:after="100"/>
-      </w:pPr>
-      <w:r>
-        <w:rPr>
-          <w:color w:val="000000"/>
-        </w:rPr>
-        <w:t>Home page basics</w:t>
-      </w:r>
-    </w:p>
-    <w:p>
-      <w:pPr>
-        <w:spacing w:before="0" w:after="160"/>
-      </w:pPr>
-      <w:r>
-        <w:t>The home page changes depending on your role. Most players will have one role and will not need to switch. If you have more than one role, use the role selector at the top of the page.</w:t>
-      </w:r>
-    </w:p>
-    <w:p>
-      <w:pPr>
-        <w:pStyle w:val="ListBullet"/>
-        <w:spacing w:after="60"/>
-      </w:pPr>
-      <w:r>
-        <w:t>Players see their team, their league position, fixtures and results, personal stats and club options.</w:t>
-      </w:r>
-    </w:p>
-    <w:p>
-      <w:pPr>
-        <w:pStyle w:val="ListBullet"/>
-        <w:spacing w:after="60"/>
-      </w:pPr>
-      <w:r>
-        <w:t>Managers see their team view first, including the next match, squad information and scoring tools.</w:t>
-      </w:r>
-    </w:p>
-    <w:p>
-      <w:pPr>
-        <w:pStyle w:val="ListBullet"/>
-        <w:spacing w:after="60"/>
-      </w:pPr>
-      <w:r>
-        <w:t>Club members see club options such as bookings and competitions without interclub match tools.</w:t>
-      </w:r>
-    </w:p>
-    <w:p>
-      <w:pPr>
-        <w:spacing w:before="40" w:after="160"/>
-      </w:pPr>
-      <w:r>
-        <w:rPr>
-          <w:b/>
-          <w:color w:val="10233F"/>
-        </w:rPr>
-        <w:t xml:space="preserve">Tip. </w:t>
-      </w:r>
-      <w:r>
-        <w:t>When you move between bottom menu tabs, the screen should reset to the top of the selected page.</w:t>
-      </w:r>
-    </w:p>
-    <w:p>
-      <w:pPr>
-        <w:pStyle w:val="Heading1"/>
-        <w:spacing w:before="280" w:after="100"/>
-      </w:pPr>
-      <w:r>
-        <w:rPr>
-          <w:color w:val="000000"/>
-        </w:rPr>
-        <w:t>Following fixtures and results</w:t>
-      </w:r>
-    </w:p>
-    <w:p>
-      <w:pPr>
-        <w:spacing w:before="0" w:after="160"/>
-      </w:pPr>
-      <w:r>
-        <w:t>The fixtures panel is arranged week by week. Use the arrows to move between weeks. Your team match is highlighted when it appears in the week.</w:t>
-      </w:r>
-    </w:p>
-    <w:p>
-      <w:pPr>
-        <w:spacing w:before="80" w:after="40"/>
-        <w:jc w:val="center"/>
-      </w:pPr>
-      <w:r>
-        <w:drawing>
-          <wp:inline xmlns:a="http://schemas.openxmlformats.org/drawingml/2006/main" xmlns:pic="http://schemas.openxmlformats.org/drawingml/2006/picture">
-            <wp:extent cx="2514600" cy="5441852"/>
-            <wp:docPr id="4" name="Picture 4"/>
-            <wp:cNvGraphicFramePr>
-              <a:graphicFrameLocks noChangeAspect="1"/>
-            </wp:cNvGraphicFramePr>
-            <a:graphic>
-              <a:graphicData uri="http://schemas.openxmlformats.org/drawingml/2006/picture">
-                <pic:pic>
-                  <pic:nvPicPr>
-                    <pic:cNvPr id="0" name="03-player-fixtures.png"/>
-                    <pic:cNvPicPr/>
-                  </pic:nvPicPr>
-                  <pic:blipFill>
-                    <a:blip r:embed="rId12"/>
-                    <a:stretch>
-                      <a:fillRect/>
-                    </a:stretch>
-                  </pic:blipFill>
-                  <pic:spPr>
-                    <a:xfrm>
-                      <a:off x="0" y="0"/>
-                      <a:ext cx="2514600" cy="5441852"/>
-                    </a:xfrm>
-                    <a:prstGeom prst="rect"/>
-                  </pic:spPr>
-                </pic:pic>
-              </a:graphicData>
-            </a:graphic>
-          </wp:inline>
-        </w:drawing>
-      </w:r>
-    </w:p>
-    <w:p>
-      <w:pPr>
-        <w:spacing w:after="160"/>
-        <w:jc w:val="center"/>
-      </w:pPr>
-      <w:r>
-        <w:rPr>
-          <w:i/>
-          <w:color w:val="6C5A73"/>
-          <w:sz w:val="17"/>
-        </w:rPr>
-        <w:t>Weekly fixtures and results view</w:t>
-      </w:r>
-    </w:p>
-    <w:p>
-      <w:r>
-        <w:br w:type="page"/>
-      </w:r>
-    </w:p>
-    <w:p>
-      <w:pPr>
-        <w:pStyle w:val="Heading1"/>
-        <w:spacing w:before="280" w:after="100"/>
-      </w:pPr>
-      <w:r>
-        <w:rPr>
-          <w:color w:val="000000"/>
-        </w:rPr>
-        <w:t>Picking a team as manager</w:t>
-      </w:r>
-    </w:p>
-    <w:p>
-      <w:pPr>
-        <w:spacing w:before="0" w:after="160"/>
-      </w:pPr>
-      <w:r>
-        <w:t>Only managers and assistant managers can pick lineups. Players can see friendlies or match details only when their team is involved, but they cannot create or edit them.</w:t>
-      </w:r>
-    </w:p>
-    <w:p>
-      <w:pPr>
-        <w:pStyle w:val="ListNumber"/>
-        <w:spacing w:after="60"/>
-      </w:pPr>
-      <w:r>
-        <w:t>Go to Fixtures or the next match area on Home.</w:t>
-      </w:r>
-    </w:p>
-    <w:p>
-      <w:pPr>
-        <w:pStyle w:val="ListNumber"/>
-        <w:spacing w:after="60"/>
-      </w:pPr>
-      <w:r>
-        <w:t>Open your team match.</w:t>
-      </w:r>
-    </w:p>
-    <w:p>
-      <w:pPr>
-        <w:pStyle w:val="ListNumber"/>
-        <w:spacing w:after="60"/>
-      </w:pPr>
-      <w:r>
-        <w:t>Tap Pick team if the lineup has not been published.</w:t>
-      </w:r>
-    </w:p>
-    <w:p>
-      <w:pPr>
-        <w:pStyle w:val="ListNumber"/>
-        <w:spacing w:after="60"/>
-      </w:pPr>
-      <w:r>
-        <w:t>Tap each slot and choose the player for that position.</w:t>
-      </w:r>
-    </w:p>
-    <w:p>
-      <w:pPr>
-        <w:pStyle w:val="ListNumber"/>
-        <w:spacing w:after="60"/>
-      </w:pPr>
-      <w:r>
-        <w:t>Save draft if you are not ready. Publish lineup when it is final. A published lineup is locked.</w:t>
-      </w:r>
-    </w:p>
-    <w:p>
-      <w:pPr>
-        <w:spacing w:before="80" w:after="40"/>
-        <w:jc w:val="center"/>
-      </w:pPr>
-      <w:r>
-        <w:drawing>
-          <wp:inline xmlns:a="http://schemas.openxmlformats.org/drawingml/2006/main" xmlns:pic="http://schemas.openxmlformats.org/drawingml/2006/picture">
-            <wp:extent cx="2514600" cy="5441852"/>
-            <wp:docPr id="5" name="Picture 5"/>
-            <wp:cNvGraphicFramePr>
-              <a:graphicFrameLocks noChangeAspect="1"/>
-            </wp:cNvGraphicFramePr>
-            <a:graphic>
-              <a:graphicData uri="http://schemas.openxmlformats.org/drawingml/2006/picture">
-                <pic:pic>
-                  <pic:nvPicPr>
-                    <pic:cNvPr id="0" name="05-manager-next-matches.png"/>
-                    <pic:cNvPicPr/>
-                  </pic:nvPicPr>
-                  <pic:blipFill>
-                    <a:blip r:embed="rId13"/>
-                    <a:stretch>
-                      <a:fillRect/>
-                    </a:stretch>
-                  </pic:blipFill>
-                  <pic:spPr>
-                    <a:xfrm>
-                      <a:off x="0" y="0"/>
-                      <a:ext cx="2514600" cy="5441852"/>
-                    </a:xfrm>
-                    <a:prstGeom prst="rect"/>
-                  </pic:spPr>
-                </pic:pic>
-              </a:graphicData>
-            </a:graphic>
-          </wp:inline>
-        </w:drawing>
-      </w:r>
-    </w:p>
-    <w:p>
-      <w:pPr>
-        <w:spacing w:after="160"/>
-        <w:jc w:val="center"/>
-      </w:pPr>
-      <w:r>
-        <w:rPr>
-          <w:i/>
-          <w:color w:val="6C5A73"/>
-          <w:sz w:val="17"/>
-        </w:rPr>
-        <w:t>Manager fixture panel before team selection</w:t>
-      </w:r>
-    </w:p>
-    <w:p>
-      <w:pPr>
-        <w:spacing w:before="80" w:after="40"/>
-        <w:jc w:val="center"/>
-      </w:pPr>
-      <w:r>
-        <w:drawing>
-          <wp:inline xmlns:a="http://schemas.openxmlformats.org/drawingml/2006/main" xmlns:pic="http://schemas.openxmlformats.org/drawingml/2006/picture">
-            <wp:extent cx="2514600" cy="5441852"/>
-            <wp:docPr id="6" name="Picture 6"/>
-            <wp:cNvGraphicFramePr>
-              <a:graphicFrameLocks noChangeAspect="1"/>
-            </wp:cNvGraphicFramePr>
-            <a:graphic>
-              <a:graphicData uri="http://schemas.openxmlformats.org/drawingml/2006/picture">
-                <pic:pic>
-                  <pic:nvPicPr>
-                    <pic:cNvPr id="0" name="07-open-match.png"/>
-                    <pic:cNvPicPr/>
-                  </pic:nvPicPr>
-                  <pic:blipFill>
-                    <a:blip r:embed="rId14"/>
-                    <a:stretch>
-                      <a:fillRect/>
-                    </a:stretch>
-                  </pic:blipFill>
-                  <pic:spPr>
-                    <a:xfrm>
-                      <a:off x="0" y="0"/>
-                      <a:ext cx="2514600" cy="5441852"/>
-                    </a:xfrm>
-                    <a:prstGeom prst="rect"/>
-                  </pic:spPr>
-                </pic:pic>
-              </a:graphicData>
-            </a:graphic>
-          </wp:inline>
-        </w:drawing>
-      </w:r>
-    </w:p>
-    <w:p>
-      <w:pPr>
-        <w:spacing w:after="160"/>
-        <w:jc w:val="center"/>
-      </w:pPr>
-      <w:r>
-        <w:rPr>
-          <w:i/>
-          <w:color w:val="6C5A73"/>
-          <w:sz w:val="17"/>
-        </w:rPr>
-        <w:t>Team sheet with match positions</w:t>
-      </w:r>
-    </w:p>
-    <w:p>
-      <w:r>
-        <w:br w:type="page"/>
-      </w:r>
-    </w:p>
-    <w:p>
-      <w:pPr>
-        <w:pStyle w:val="Heading1"/>
-        <w:spacing w:before="280" w:after="100"/>
-      </w:pPr>
-      <w:r>
-        <w:rPr>
-          <w:color w:val="000000"/>
-        </w:rPr>
-        <w:t>Choosing players</w:t>
-      </w:r>
-    </w:p>
-    <w:p>
-      <w:pPr>
-        <w:spacing w:before="0" w:after="160"/>
-      </w:pPr>
-      <w:r>
-        <w:t>The player picker is designed for mobile. Tap the position, choose the player, then continue down the list.</w:t>
-      </w:r>
-    </w:p>
-    <w:p>
-      <w:pPr>
-        <w:pStyle w:val="ListBullet"/>
-        <w:spacing w:after="60"/>
-      </w:pPr>
-      <w:r>
-        <w:t>In league matches, a player can only be selected once in the lineup.</w:t>
-      </w:r>
-    </w:p>
-    <w:p>
-      <w:pPr>
-        <w:pStyle w:val="ListBullet"/>
-        <w:spacing w:after="60"/>
-      </w:pPr>
-      <w:r>
-        <w:t>In friendlies, a player may be used more than once if needed.</w:t>
-      </w:r>
-    </w:p>
-    <w:p>
-      <w:pPr>
-        <w:pStyle w:val="ListBullet"/>
-        <w:spacing w:after="60"/>
-      </w:pPr>
-      <w:r>
-        <w:t>The C League format is singles in games 1, 3 and 5, with doubles in games 2 and 4.</w:t>
-      </w:r>
-    </w:p>
-    <w:p>
-      <w:pPr>
-        <w:spacing w:before="80" w:after="40"/>
-        <w:jc w:val="center"/>
-      </w:pPr>
-      <w:r>
-        <w:drawing>
-          <wp:inline xmlns:a="http://schemas.openxmlformats.org/drawingml/2006/main" xmlns:pic="http://schemas.openxmlformats.org/drawingml/2006/picture">
-            <wp:extent cx="2514600" cy="5441852"/>
-            <wp:docPr id="7" name="Picture 7"/>
-            <wp:cNvGraphicFramePr>
-              <a:graphicFrameLocks noChangeAspect="1"/>
-            </wp:cNvGraphicFramePr>
-            <a:graphic>
-              <a:graphicData uri="http://schemas.openxmlformats.org/drawingml/2006/picture">
-                <pic:pic>
-                  <pic:nvPicPr>
-                    <pic:cNvPr id="0" name="08-pick-player.png"/>
-                    <pic:cNvPicPr/>
-                  </pic:nvPicPr>
-                  <pic:blipFill>
-                    <a:blip r:embed="rId15"/>
-                    <a:stretch>
-                      <a:fillRect/>
-                    </a:stretch>
-                  </pic:blipFill>
-                  <pic:spPr>
-                    <a:xfrm>
-                      <a:off x="0" y="0"/>
-                      <a:ext cx="2514600" cy="5441852"/>
-                    </a:xfrm>
-                    <a:prstGeom prst="rect"/>
-                  </pic:spPr>
-                </pic:pic>
-              </a:graphicData>
-            </a:graphic>
-          </wp:inline>
-        </w:drawing>
-      </w:r>
-    </w:p>
-    <w:p>
-      <w:pPr>
-        <w:spacing w:after="160"/>
-        <w:jc w:val="center"/>
-      </w:pPr>
-      <w:r>
-        <w:rPr>
-          <w:i/>
-          <w:color w:val="6C5A73"/>
-          <w:sz w:val="17"/>
-        </w:rPr>
-        <w:t>Player picker for one lineup slot</w:t>
-      </w:r>
-    </w:p>
-    <w:p>
-      <w:pPr>
-        <w:spacing w:before="80" w:after="40"/>
-        <w:jc w:val="center"/>
-      </w:pPr>
-      <w:r>
-        <w:drawing>
-          <wp:inline xmlns:a="http://schemas.openxmlformats.org/drawingml/2006/main" xmlns:pic="http://schemas.openxmlformats.org/drawingml/2006/picture">
-            <wp:extent cx="2514600" cy="5441852"/>
-            <wp:docPr id="8" name="Picture 8"/>
-            <wp:cNvGraphicFramePr>
-              <a:graphicFrameLocks noChangeAspect="1"/>
-            </wp:cNvGraphicFramePr>
-            <a:graphic>
-              <a:graphicData uri="http://schemas.openxmlformats.org/drawingml/2006/picture">
-                <pic:pic>
-                  <pic:nvPicPr>
-                    <pic:cNvPr id="0" name="04-manager-home.png"/>
-                    <pic:cNvPicPr/>
-                  </pic:nvPicPr>
-                  <pic:blipFill>
-                    <a:blip r:embed="rId16"/>
-                    <a:stretch>
-                      <a:fillRect/>
-                    </a:stretch>
-                  </pic:blipFill>
-                  <pic:spPr>
-                    <a:xfrm>
-                      <a:off x="0" y="0"/>
-                      <a:ext cx="2514600" cy="5441852"/>
-                    </a:xfrm>
-                    <a:prstGeom prst="rect"/>
-                  </pic:spPr>
-                </pic:pic>
-              </a:graphicData>
-            </a:graphic>
-          </wp:inline>
-        </w:drawing>
-      </w:r>
-    </w:p>
-    <w:p>
-      <w:pPr>
-        <w:spacing w:after="160"/>
-        <w:jc w:val="center"/>
-      </w:pPr>
-      <w:r>
-        <w:rPr>
-          <w:i/>
-          <w:color w:val="6C5A73"/>
-          <w:sz w:val="17"/>
-        </w:rPr>
-        <w:t>Manager home and season selector</w:t>
-      </w:r>
-    </w:p>
-    <w:p>
-      <w:r>
-        <w:br w:type="page"/>
-      </w:r>
-    </w:p>
-    <w:p>
-      <w:pPr>
-        <w:pStyle w:val="Heading1"/>
-        <w:spacing w:before="280" w:after="100"/>
-      </w:pPr>
-      <w:r>
-        <w:rPr>
-          <w:color w:val="000000"/>
-        </w:rPr>
-        <w:t>Entering scores on match night</w:t>
-      </w:r>
-    </w:p>
-    <w:p>
-      <w:pPr>
-        <w:spacing w:before="0" w:after="160"/>
-      </w:pPr>
-      <w:r>
-        <w:t>When both teams have published lineups, the match becomes the focus. Managers can enter results game by game. Players can view active match details but cannot edit scores.</w:t>
-      </w:r>
-    </w:p>
-    <w:p>
-      <w:pPr>
-        <w:pStyle w:val="ListNumber"/>
-        <w:spacing w:after="60"/>
-      </w:pPr>
-      <w:r>
-        <w:t>Open the match from Fixtures or Home.</w:t>
-      </w:r>
-    </w:p>
-    <w:p>
-      <w:pPr>
-        <w:pStyle w:val="ListNumber"/>
-        <w:spacing w:after="60"/>
-      </w:pPr>
-      <w:r>
-        <w:t>For each game, tap the winning team or player side.</w:t>
-      </w:r>
-    </w:p>
-    <w:p>
-      <w:pPr>
-        <w:pStyle w:val="ListNumber"/>
-        <w:spacing w:after="60"/>
-      </w:pPr>
-      <w:r>
-        <w:t>Check the running score after each game.</w:t>
-      </w:r>
-    </w:p>
-    <w:p>
-      <w:pPr>
-        <w:pStyle w:val="ListNumber"/>
-        <w:spacing w:after="60"/>
-      </w:pPr>
-      <w:r>
-        <w:t>When all games are correct, press Match Completed. After that, the match is locked.</w:t>
-      </w:r>
-    </w:p>
-    <w:p>
-      <w:pPr>
-        <w:spacing w:before="80" w:after="40"/>
-        <w:jc w:val="center"/>
-      </w:pPr>
-      <w:r>
-        <w:drawing>
-          <wp:inline xmlns:a="http://schemas.openxmlformats.org/drawingml/2006/main" xmlns:pic="http://schemas.openxmlformats.org/drawingml/2006/picture">
-            <wp:extent cx="2514600" cy="5441852"/>
-            <wp:docPr id="9" name="Picture 9"/>
-            <wp:cNvGraphicFramePr>
-              <a:graphicFrameLocks noChangeAspect="1"/>
-            </wp:cNvGraphicFramePr>
-            <a:graphic>
-              <a:graphicData uri="http://schemas.openxmlformats.org/drawingml/2006/picture">
-                <pic:pic>
-                  <pic:nvPicPr>
-                    <pic:cNvPr id="0" name="09-score-entry-example.png"/>
-                    <pic:cNvPicPr/>
-                  </pic:nvPicPr>
-                  <pic:blipFill>
-                    <a:blip r:embed="rId17"/>
-                    <a:stretch>
-                      <a:fillRect/>
-                    </a:stretch>
-                  </pic:blipFill>
-                  <pic:spPr>
-                    <a:xfrm>
-                      <a:off x="0" y="0"/>
-                      <a:ext cx="2514600" cy="5441852"/>
-                    </a:xfrm>
-                    <a:prstGeom prst="rect"/>
-                  </pic:spPr>
-                </pic:pic>
-              </a:graphicData>
-            </a:graphic>
-          </wp:inline>
-        </w:drawing>
-      </w:r>
-    </w:p>
-    <w:p>
-      <w:pPr>
-        <w:spacing w:after="160"/>
-        <w:jc w:val="center"/>
-      </w:pPr>
-      <w:r>
-        <w:rPr>
-          <w:i/>
-          <w:color w:val="6C5A73"/>
-          <w:sz w:val="17"/>
-        </w:rPr>
-        <w:t>Simple score entry during a match</w:t>
-      </w:r>
-    </w:p>
-    <w:p>
-      <w:r>
-        <w:br w:type="page"/>
-      </w:r>
-    </w:p>
-    <w:p>
-      <w:pPr>
-        <w:pStyle w:val="Heading1"/>
-        <w:spacing w:before="280" w:after="100"/>
-      </w:pPr>
-      <w:r>
-        <w:rPr>
-          <w:color w:val="000000"/>
-        </w:rPr>
-        <w:t>Recording a break</w:t>
-      </w:r>
-    </w:p>
-    <w:p>
-      <w:pPr>
-        <w:spacing w:before="0" w:after="160"/>
-      </w:pPr>
-      <w:r>
-        <w:t>Most games will not need a break recorded. If there is a break worth recording, use the break entry from the relevant game.</w:t>
-      </w:r>
-    </w:p>
-    <w:p>
-      <w:pPr>
-        <w:pStyle w:val="ListNumber"/>
-        <w:spacing w:after="60"/>
-      </w:pPr>
-      <w:r>
-        <w:t>Open the active match.</w:t>
-      </w:r>
-    </w:p>
-    <w:p>
-      <w:pPr>
-        <w:pStyle w:val="ListNumber"/>
-        <w:spacing w:after="60"/>
-      </w:pPr>
-      <w:r>
-        <w:t>Tap Record break on the correct game.</w:t>
-      </w:r>
-    </w:p>
-    <w:p>
-      <w:pPr>
-        <w:pStyle w:val="ListNumber"/>
-        <w:spacing w:after="60"/>
-      </w:pPr>
-      <w:r>
-        <w:t>Choose the player and enter the break value.</w:t>
-      </w:r>
-    </w:p>
-    <w:p>
-      <w:pPr>
-        <w:pStyle w:val="ListNumber"/>
-        <w:spacing w:after="60"/>
-      </w:pPr>
-      <w:r>
-        <w:t>Save the break. It will be linked to that player and that game.</w:t>
-      </w:r>
-    </w:p>
-    <w:p>
-      <w:pPr>
-        <w:spacing w:before="80" w:after="40"/>
-        <w:jc w:val="center"/>
-      </w:pPr>
-      <w:r>
-        <w:drawing>
-          <wp:inline xmlns:a="http://schemas.openxmlformats.org/drawingml/2006/main" xmlns:pic="http://schemas.openxmlformats.org/drawingml/2006/picture">
-            <wp:extent cx="2514600" cy="5441852"/>
-            <wp:docPr id="10" name="Picture 10"/>
-            <wp:cNvGraphicFramePr>
-              <a:graphicFrameLocks noChangeAspect="1"/>
-            </wp:cNvGraphicFramePr>
-            <a:graphic>
-              <a:graphicData uri="http://schemas.openxmlformats.org/drawingml/2006/picture">
-                <pic:pic>
-                  <pic:nvPicPr>
-                    <pic:cNvPr id="0" name="10-break-entry-example.png"/>
-                    <pic:cNvPicPr/>
-                  </pic:nvPicPr>
-                  <pic:blipFill>
-                    <a:blip r:embed="rId18"/>
-                    <a:stretch>
-                      <a:fillRect/>
-                    </a:stretch>
-                  </pic:blipFill>
-                  <pic:spPr>
-                    <a:xfrm>
-                      <a:off x="0" y="0"/>
-                      <a:ext cx="2514600" cy="5441852"/>
-                    </a:xfrm>
-                    <a:prstGeom prst="rect"/>
-                  </pic:spPr>
-                </pic:pic>
-              </a:graphicData>
-            </a:graphic>
-          </wp:inline>
-        </w:drawing>
-      </w:r>
-    </w:p>
-    <w:p>
-      <w:pPr>
-        <w:spacing w:after="160"/>
-        <w:jc w:val="center"/>
-      </w:pPr>
-      <w:r>
-        <w:rPr>
-          <w:i/>
-          <w:color w:val="6C5A73"/>
-          <w:sz w:val="17"/>
-        </w:rPr>
-        <w:t>Break entry for a player in a game</w:t>
-      </w:r>
-    </w:p>
-    <w:p>
-      <w:r>
-        <w:br w:type="page"/>
-      </w:r>
-    </w:p>
-    <w:p>
-      <w:pPr>
-        <w:pStyle w:val="Heading1"/>
-        <w:spacing w:before="280" w:after="100"/>
-      </w:pPr>
-      <w:r>
-        <w:rPr>
-          <w:color w:val="000000"/>
-        </w:rPr>
-        <w:t>Information available all season</w:t>
-      </w:r>
-    </w:p>
-    <w:p>
-      <w:pPr>
-        <w:spacing w:before="0" w:after="160"/>
-      </w:pPr>
-      <w:r>
-        <w:t>The app keeps the key league information close to the home page. Players and managers can see different levels of detail, but everyone should be able to get to the main season information in one or two taps.</w:t>
-      </w:r>
-    </w:p>
-    <w:p>
-      <w:pPr>
-        <w:pStyle w:val="Heading2"/>
-        <w:spacing w:before="180" w:after="100"/>
-      </w:pPr>
-      <w:r>
-        <w:rPr>
-          <w:color w:val="000000"/>
-        </w:rPr>
-        <w:t>League tables</w:t>
-      </w:r>
-    </w:p>
-    <w:p>
-      <w:pPr>
-        <w:spacing w:before="0" w:after="120"/>
-      </w:pPr>
-      <w:r>
-        <w:t>The Tables tab shows your league first, followed by the other leagues. Qualification positions are highlighted according to the league size.</w:t>
-      </w:r>
-    </w:p>
-    <w:p>
-      <w:pPr>
-        <w:spacing w:before="80" w:after="40"/>
-        <w:jc w:val="center"/>
-      </w:pPr>
-      <w:r>
-        <w:drawing>
-          <wp:inline xmlns:a="http://schemas.openxmlformats.org/drawingml/2006/main" xmlns:pic="http://schemas.openxmlformats.org/drawingml/2006/picture">
-            <wp:extent cx="2514600" cy="5441852"/>
-            <wp:docPr id="11" name="Picture 11"/>
-            <wp:cNvGraphicFramePr>
-              <a:graphicFrameLocks noChangeAspect="1"/>
-            </wp:cNvGraphicFramePr>
-            <a:graphic>
-              <a:graphicData uri="http://schemas.openxmlformats.org/drawingml/2006/picture">
-                <pic:pic>
-                  <pic:nvPicPr>
-                    <pic:cNvPr id="0" name="12-tables-screen.png"/>
-                    <pic:cNvPicPr/>
-                  </pic:nvPicPr>
-                  <pic:blipFill>
-                    <a:blip r:embed="rId19"/>
-                    <a:stretch>
-                      <a:fillRect/>
-                    </a:stretch>
-                  </pic:blipFill>
-                  <pic:spPr>
-                    <a:xfrm>
-                      <a:off x="0" y="0"/>
-                      <a:ext cx="2514600" cy="5441852"/>
-                    </a:xfrm>
-                    <a:prstGeom prst="rect"/>
-                  </pic:spPr>
-                </pic:pic>
-              </a:graphicData>
-            </a:graphic>
-          </wp:inline>
-        </w:drawing>
-      </w:r>
-    </w:p>
-    <w:p>
-      <w:pPr>
-        <w:spacing w:after="160"/>
-        <w:jc w:val="center"/>
-      </w:pPr>
-      <w:r>
-        <w:rPr>
-          <w:i/>
-          <w:color w:val="6C5A73"/>
-          <w:sz w:val="17"/>
-        </w:rPr>
-        <w:t>League tables screen</w:t>
-      </w:r>
-    </w:p>
-    <w:p>
-      <w:r>
-        <w:br w:type="page"/>
-      </w:r>
-    </w:p>
-    <w:p>
-      <w:pPr>
-        <w:pStyle w:val="Heading1"/>
-        <w:spacing w:before="280" w:after="100"/>
-      </w:pPr>
-      <w:r>
-        <w:rPr>
-          <w:color w:val="000000"/>
-        </w:rPr>
-        <w:t>Player stats and breaks</w:t>
-      </w:r>
-    </w:p>
-    <w:p>
-      <w:pPr>
-        <w:spacing w:before="0" w:after="160"/>
-      </w:pPr>
-      <w:r>
-        <w:t>Player stats are season based. If a player did not play in that season, they should not appear in that season stats table. Breaks recorded against games also feed into the player record.</w:t>
-      </w:r>
-    </w:p>
-    <w:p>
-      <w:pPr>
-        <w:pStyle w:val="ListBullet"/>
-        <w:spacing w:after="60"/>
-      </w:pPr>
-      <w:r>
-        <w:t>Personal win rate, played, won and lost are shown for the selected season.</w:t>
-      </w:r>
-    </w:p>
-    <w:p>
-      <w:pPr>
-        <w:pStyle w:val="ListBullet"/>
-        <w:spacing w:after="60"/>
-      </w:pPr>
-      <w:r>
-        <w:t>Highest break appears when a player has a break recorded for that season.</w:t>
-      </w:r>
-    </w:p>
-    <w:p>
-      <w:pPr>
-        <w:pStyle w:val="ListBullet"/>
-        <w:spacing w:after="60"/>
-      </w:pPr>
-      <w:r>
-        <w:t>Doubles games count towards individual player stats for both doubles partners.</w:t>
-      </w:r>
-    </w:p>
-    <w:p>
-      <w:pPr>
-        <w:spacing w:before="80" w:after="40"/>
-        <w:jc w:val="center"/>
-      </w:pPr>
-      <w:r>
-        <w:drawing>
-          <wp:inline xmlns:a="http://schemas.openxmlformats.org/drawingml/2006/main" xmlns:pic="http://schemas.openxmlformats.org/drawingml/2006/picture">
-            <wp:extent cx="2514600" cy="5441852"/>
-            <wp:docPr id="12" name="Picture 12"/>
-            <wp:cNvGraphicFramePr>
-              <a:graphicFrameLocks noChangeAspect="1"/>
-            </wp:cNvGraphicFramePr>
-            <a:graphic>
-              <a:graphicData uri="http://schemas.openxmlformats.org/drawingml/2006/picture">
-                <pic:pic>
-                  <pic:nvPicPr>
-                    <pic:cNvPr id="0" name="11-season-player-stats.png"/>
-                    <pic:cNvPicPr/>
-                  </pic:nvPicPr>
-                  <pic:blipFill>
-                    <a:blip r:embed="rId20"/>
-                    <a:stretch>
-                      <a:fillRect/>
-                    </a:stretch>
-                  </pic:blipFill>
-                  <pic:spPr>
-                    <a:xfrm>
-                      <a:off x="0" y="0"/>
-                      <a:ext cx="2514600" cy="5441852"/>
-                    </a:xfrm>
-                    <a:prstGeom prst="rect"/>
-                  </pic:spPr>
-                </pic:pic>
-              </a:graphicData>
-            </a:graphic>
-          </wp:inline>
-        </w:drawing>
-      </w:r>
-    </w:p>
-    <w:p>
-      <w:pPr>
-        <w:spacing w:after="160"/>
-        <w:jc w:val="center"/>
-      </w:pPr>
-      <w:r>
-        <w:rPr>
-          <w:i/>
-          <w:color w:val="6C5A73"/>
-          <w:sz w:val="17"/>
-        </w:rPr>
-        <w:t>Player stats and personal form</w:t>
-      </w:r>
-    </w:p>
-    <w:p>
-      <w:pPr>
-        <w:pStyle w:val="Heading2"/>
-        <w:spacing w:before="180" w:after="100"/>
-      </w:pPr>
-      <w:r>
-        <w:rPr>
-          <w:color w:val="000000"/>
-        </w:rPr>
-        <w:t>My Club</w:t>
-      </w:r>
-    </w:p>
-    <w:p>
-      <w:pPr>
-        <w:spacing w:before="0" w:after="120"/>
-      </w:pPr>
-      <w:r>
-        <w:t>The My Club tab keeps club functionality separate from interclub duties. This is where club bookings, club competitions and club games live.</w:t>
-      </w:r>
-    </w:p>
-    <w:p>
-      <w:pPr>
-        <w:spacing w:before="80" w:after="40"/>
-        <w:jc w:val="center"/>
-      </w:pPr>
-      <w:r>
-        <w:drawing>
-          <wp:inline xmlns:a="http://schemas.openxmlformats.org/drawingml/2006/main" xmlns:pic="http://schemas.openxmlformats.org/drawingml/2006/picture">
-            <wp:extent cx="2514600" cy="5441852"/>
-            <wp:docPr id="13" name="Picture 13"/>
-            <wp:cNvGraphicFramePr>
-              <a:graphicFrameLocks noChangeAspect="1"/>
-            </wp:cNvGraphicFramePr>
-            <a:graphic>
-              <a:graphicData uri="http://schemas.openxmlformats.org/drawingml/2006/picture">
-                <pic:pic>
-                  <pic:nvPicPr>
-                    <pic:cNvPr id="0" name="13-my-club-screen.png"/>
-                    <pic:cNvPicPr/>
-                  </pic:nvPicPr>
-                  <pic:blipFill>
-                    <a:blip r:embed="rId21"/>
-                    <a:stretch>
-                      <a:fillRect/>
-                    </a:stretch>
-                  </pic:blipFill>
-                  <pic:spPr>
-                    <a:xfrm>
-                      <a:off x="0" y="0"/>
-                      <a:ext cx="2514600" cy="5441852"/>
-                    </a:xfrm>
-                    <a:prstGeom prst="rect"/>
-                  </pic:spPr>
-                </pic:pic>
-              </a:graphicData>
-            </a:graphic>
-          </wp:inline>
-        </w:drawing>
-      </w:r>
-    </w:p>
-    <w:p>
-      <w:pPr>
-        <w:spacing w:after="160"/>
-        <w:jc w:val="center"/>
-      </w:pPr>
-      <w:r>
-        <w:rPr>
-          <w:i/>
-          <w:color w:val="6C5A73"/>
-          <w:sz w:val="17"/>
-        </w:rPr>
-        <w:t>My Club page with bookings and competitions</w:t>
-      </w:r>
-    </w:p>
-    <w:p>
-      <w:r>
-        <w:br w:type="page"/>
-      </w:r>
-    </w:p>
-    <w:p>
-      <w:pPr>
-        <w:pStyle w:val="Heading1"/>
-        <w:spacing w:before="280" w:after="100"/>
-      </w:pPr>
-      <w:r>
-        <w:rPr>
-          <w:color w:val="000000"/>
-        </w:rPr>
-        <w:t>Quick checklist</w:t>
-      </w:r>
     </w:p>
     <w:tbl>
       <w:tblPr>
@@ -1551,23 +272,1147 @@
         <w:tblLook w:firstColumn="1" w:firstRow="1" w:lastColumn="0" w:lastRow="0" w:noHBand="0" w:noVBand="1" w:val="04A0"/>
       </w:tblPr>
       <w:tblGrid>
-        <w:gridCol w:w="3355"/>
-        <w:gridCol w:w="3355"/>
+        <w:gridCol w:w="5616"/>
+        <w:gridCol w:w="3528"/>
       </w:tblGrid>
       <w:tr>
         <w:tc>
           <w:tcPr>
-            <w:tcW w:type="dxa" w:w="1944"/>
-            <w:shd w:fill="10233F"/>
+            <w:tcW w:type="dxa" w:w="5349"/>
+            <w:vAlign w:val="top"/>
             <w:tcBorders>
-              <w:top w:val="single" w:sz="6" w:space="0" w:color="D9D9D9"/>
-              <w:left w:val="single" w:sz="6" w:space="0" w:color="D9D9D9"/>
-              <w:bottom w:val="single" w:sz="6" w:space="0" w:color="D9D9D9"/>
-              <w:right w:val="single" w:sz="6" w:space="0" w:color="D9D9D9"/>
-              <w:insideH w:val="single" w:sz="6" w:space="0" w:color="D9D9D9"/>
-              <w:insideV w:val="single" w:sz="6" w:space="0" w:color="D9D9D9"/>
+              <w:top w:val="single" w:sz="8" w:space="0" w:color="E6E0EB"/>
+              <w:left w:val="single" w:sz="8" w:space="0" w:color="E6E0EB"/>
+              <w:bottom w:val="single" w:sz="8" w:space="0" w:color="E6E0EB"/>
+              <w:right w:val="single" w:sz="8" w:space="0" w:color="E6E0EB"/>
             </w:tcBorders>
-            <w:vAlign w:val="center"/>
+            <w:shd w:fill="FFFFFF"/>
+          </w:tcPr>
+          <w:p>
+            <w:pPr>
+              <w:spacing w:after="80"/>
+            </w:pPr>
+            <w:r>
+              <w:rPr>
+                <w:rFonts w:ascii="Arial" w:hAnsi="Arial" w:eastAsia="Arial"/>
+                <w:b/>
+                <w:color w:val="25002B"/>
+                <w:sz w:val="21"/>
+              </w:rPr>
+              <w:t>PLAYER HOME</w:t>
+            </w:r>
+          </w:p>
+          <w:p>
+            <w:pPr>
+              <w:pStyle w:val="ListBullet"/>
+              <w:spacing w:after="40" w:line="240" w:lineRule="auto"/>
+            </w:pPr>
+            <w:r>
+              <w:rPr>
+                <w:rFonts w:ascii="Arial" w:hAnsi="Arial" w:eastAsia="Arial"/>
+                <w:color w:val="10233F"/>
+                <w:sz w:val="17"/>
+              </w:rPr>
+              <w:t>The home screen is deliberately compact: your team, player summary, current form and the week fixtures are close to the top.</w:t>
+            </w:r>
+          </w:p>
+          <w:p>
+            <w:pPr>
+              <w:pStyle w:val="ListBullet"/>
+              <w:spacing w:after="40" w:line="240" w:lineRule="auto"/>
+            </w:pPr>
+            <w:r>
+              <w:rPr>
+                <w:rFonts w:ascii="Arial" w:hAnsi="Arial" w:eastAsia="Arial"/>
+                <w:color w:val="10233F"/>
+                <w:sz w:val="17"/>
+              </w:rPr>
+              <w:t>There is no season selector to manage. The app uses the active season automatically.</w:t>
+            </w:r>
+          </w:p>
+          <w:p>
+            <w:pPr>
+              <w:pStyle w:val="ListBullet"/>
+              <w:spacing w:after="40" w:line="240" w:lineRule="auto"/>
+            </w:pPr>
+            <w:r>
+              <w:rPr>
+                <w:rFonts w:ascii="Arial" w:hAnsi="Arial" w:eastAsia="Arial"/>
+                <w:color w:val="10233F"/>
+                <w:sz w:val="17"/>
+              </w:rPr>
+              <w:t>Use the bottom tabs to move between Home, Fixtures, Tables and My Club.</w:t>
+            </w:r>
+          </w:p>
+        </w:tc>
+        <w:tc>
+          <w:tcPr>
+            <w:tcW w:type="dxa" w:w="5349"/>
+            <w:vAlign w:val="top"/>
+            <w:tcBorders>
+              <w:top w:val="single" w:sz="8" w:space="0" w:color="E6E0EB"/>
+              <w:left w:val="single" w:sz="8" w:space="0" w:color="E6E0EB"/>
+              <w:bottom w:val="single" w:sz="8" w:space="0" w:color="E6E0EB"/>
+              <w:right w:val="single" w:sz="8" w:space="0" w:color="E6E0EB"/>
+            </w:tcBorders>
+            <w:shd w:fill="FFFFFF"/>
+          </w:tcPr>
+          <w:p>
+            <w:pPr>
+              <w:spacing w:after="0"/>
+              <w:jc w:val="center"/>
+            </w:pPr>
+            <w:r>
+              <w:drawing>
+                <wp:inline xmlns:a="http://schemas.openxmlformats.org/drawingml/2006/main" xmlns:pic="http://schemas.openxmlformats.org/drawingml/2006/picture">
+                  <wp:extent cx="1783080" cy="3593592"/>
+                  <wp:docPr id="2" name="Picture 2"/>
+                  <wp:cNvGraphicFramePr>
+                    <a:graphicFrameLocks noChangeAspect="1"/>
+                  </wp:cNvGraphicFramePr>
+                  <a:graphic>
+                    <a:graphicData uri="http://schemas.openxmlformats.org/drawingml/2006/picture">
+                      <pic:pic>
+                        <pic:nvPicPr>
+                          <pic:cNvPr id="0" name="02-player-home.png"/>
+                          <pic:cNvPicPr/>
+                        </pic:nvPicPr>
+                        <pic:blipFill>
+                          <a:blip r:embed="rId10"/>
+                          <a:stretch>
+                            <a:fillRect/>
+                          </a:stretch>
+                        </pic:blipFill>
+                        <pic:spPr>
+                          <a:xfrm>
+                            <a:off x="0" y="0"/>
+                            <a:ext cx="1783080" cy="3593592"/>
+                          </a:xfrm>
+                          <a:prstGeom prst="rect"/>
+                        </pic:spPr>
+                      </pic:pic>
+                    </a:graphicData>
+                  </a:graphic>
+                </wp:inline>
+              </w:drawing>
+            </w:r>
+          </w:p>
+        </w:tc>
+      </w:tr>
+    </w:tbl>
+    <w:p>
+      <w:pPr>
+        <w:spacing w:after="40"/>
+      </w:pPr>
+    </w:p>
+    <w:tbl>
+      <w:tblPr>
+        <w:tblW w:type="auto" w:w="0"/>
+        <w:jc w:val="center"/>
+        <w:tblLayout w:type="fixed"/>
+        <w:tblLook w:firstColumn="1" w:firstRow="1" w:lastColumn="0" w:lastRow="0" w:noHBand="0" w:noVBand="1" w:val="04A0"/>
+      </w:tblPr>
+      <w:tblGrid>
+        <w:gridCol w:w="5616"/>
+        <w:gridCol w:w="3528"/>
+      </w:tblGrid>
+      <w:tr>
+        <w:tc>
+          <w:tcPr>
+            <w:tcW w:type="dxa" w:w="5349"/>
+            <w:vAlign w:val="top"/>
+            <w:tcBorders>
+              <w:top w:val="single" w:sz="8" w:space="0" w:color="E6E0EB"/>
+              <w:left w:val="single" w:sz="8" w:space="0" w:color="E6E0EB"/>
+              <w:bottom w:val="single" w:sz="8" w:space="0" w:color="E6E0EB"/>
+              <w:right w:val="single" w:sz="8" w:space="0" w:color="E6E0EB"/>
+            </w:tcBorders>
+            <w:shd w:fill="FFFFFF"/>
+          </w:tcPr>
+          <w:p>
+            <w:pPr>
+              <w:spacing w:after="80"/>
+            </w:pPr>
+            <w:r>
+              <w:rPr>
+                <w:rFonts w:ascii="Arial" w:hAnsi="Arial" w:eastAsia="Arial"/>
+                <w:b/>
+                <w:color w:val="25002B"/>
+                <w:sz w:val="21"/>
+              </w:rPr>
+              <w:t>FIXTURES AND RESULTS</w:t>
+            </w:r>
+          </w:p>
+          <w:p>
+            <w:pPr>
+              <w:pStyle w:val="ListBullet"/>
+              <w:spacing w:after="40" w:line="240" w:lineRule="auto"/>
+            </w:pPr>
+            <w:r>
+              <w:rPr>
+                <w:rFonts w:ascii="Arial" w:hAnsi="Arial" w:eastAsia="Arial"/>
+                <w:color w:val="10233F"/>
+                <w:sz w:val="17"/>
+              </w:rPr>
+              <w:t>Fixtures are grouped by week so all matches in the round sit together.</w:t>
+            </w:r>
+          </w:p>
+          <w:p>
+            <w:pPr>
+              <w:pStyle w:val="ListBullet"/>
+              <w:spacing w:after="40" w:line="240" w:lineRule="auto"/>
+            </w:pPr>
+            <w:r>
+              <w:rPr>
+                <w:rFonts w:ascii="Arial" w:hAnsi="Arial" w:eastAsia="Arial"/>
+                <w:color w:val="10233F"/>
+                <w:sz w:val="17"/>
+              </w:rPr>
+              <w:t>The carousel defaults to the relevant current week, with arrows for past and future rounds.</w:t>
+            </w:r>
+          </w:p>
+          <w:p>
+            <w:pPr>
+              <w:pStyle w:val="ListBullet"/>
+              <w:spacing w:after="40" w:line="240" w:lineRule="auto"/>
+            </w:pPr>
+            <w:r>
+              <w:rPr>
+                <w:rFonts w:ascii="Arial" w:hAnsi="Arial" w:eastAsia="Arial"/>
+                <w:color w:val="10233F"/>
+                <w:sz w:val="17"/>
+              </w:rPr>
+              <w:t>Players can view match details when a match is live or published, but cannot edit scores.</w:t>
+            </w:r>
+          </w:p>
+        </w:tc>
+        <w:tc>
+          <w:tcPr>
+            <w:tcW w:type="dxa" w:w="5349"/>
+            <w:vAlign w:val="top"/>
+            <w:tcBorders>
+              <w:top w:val="single" w:sz="8" w:space="0" w:color="E6E0EB"/>
+              <w:left w:val="single" w:sz="8" w:space="0" w:color="E6E0EB"/>
+              <w:bottom w:val="single" w:sz="8" w:space="0" w:color="E6E0EB"/>
+              <w:right w:val="single" w:sz="8" w:space="0" w:color="E6E0EB"/>
+            </w:tcBorders>
+            <w:shd w:fill="FFFFFF"/>
+          </w:tcPr>
+          <w:p>
+            <w:pPr>
+              <w:spacing w:after="0"/>
+              <w:jc w:val="center"/>
+            </w:pPr>
+            <w:r>
+              <w:drawing>
+                <wp:inline xmlns:a="http://schemas.openxmlformats.org/drawingml/2006/main" xmlns:pic="http://schemas.openxmlformats.org/drawingml/2006/picture">
+                  <wp:extent cx="1783080" cy="3593592"/>
+                  <wp:docPr id="3" name="Picture 3"/>
+                  <wp:cNvGraphicFramePr>
+                    <a:graphicFrameLocks noChangeAspect="1"/>
+                  </wp:cNvGraphicFramePr>
+                  <a:graphic>
+                    <a:graphicData uri="http://schemas.openxmlformats.org/drawingml/2006/picture">
+                      <pic:pic>
+                        <pic:nvPicPr>
+                          <pic:cNvPr id="0" name="03-player-fixtures.png"/>
+                          <pic:cNvPicPr/>
+                        </pic:nvPicPr>
+                        <pic:blipFill>
+                          <a:blip r:embed="rId11"/>
+                          <a:stretch>
+                            <a:fillRect/>
+                          </a:stretch>
+                        </pic:blipFill>
+                        <pic:spPr>
+                          <a:xfrm>
+                            <a:off x="0" y="0"/>
+                            <a:ext cx="1783080" cy="3593592"/>
+                          </a:xfrm>
+                          <a:prstGeom prst="rect"/>
+                        </pic:spPr>
+                      </pic:pic>
+                    </a:graphicData>
+                  </a:graphic>
+                </wp:inline>
+              </w:drawing>
+            </w:r>
+          </w:p>
+        </w:tc>
+      </w:tr>
+    </w:tbl>
+    <w:p>
+      <w:pPr>
+        <w:spacing w:after="40"/>
+      </w:pPr>
+    </w:p>
+    <w:tbl>
+      <w:tblPr>
+        <w:tblW w:type="auto" w:w="0"/>
+        <w:jc w:val="center"/>
+        <w:tblLayout w:type="fixed"/>
+        <w:tblLook w:firstColumn="1" w:firstRow="1" w:lastColumn="0" w:lastRow="0" w:noHBand="0" w:noVBand="1" w:val="04A0"/>
+      </w:tblPr>
+      <w:tblGrid>
+        <w:gridCol w:w="5616"/>
+        <w:gridCol w:w="3528"/>
+      </w:tblGrid>
+      <w:tr>
+        <w:tc>
+          <w:tcPr>
+            <w:tcW w:type="dxa" w:w="5349"/>
+            <w:vAlign w:val="top"/>
+            <w:tcBorders>
+              <w:top w:val="single" w:sz="8" w:space="0" w:color="E6E0EB"/>
+              <w:left w:val="single" w:sz="8" w:space="0" w:color="E6E0EB"/>
+              <w:bottom w:val="single" w:sz="8" w:space="0" w:color="E6E0EB"/>
+              <w:right w:val="single" w:sz="8" w:space="0" w:color="E6E0EB"/>
+            </w:tcBorders>
+            <w:shd w:fill="FFFFFF"/>
+          </w:tcPr>
+          <w:p>
+            <w:pPr>
+              <w:spacing w:after="80"/>
+            </w:pPr>
+            <w:r>
+              <w:rPr>
+                <w:rFonts w:ascii="Arial" w:hAnsi="Arial" w:eastAsia="Arial"/>
+                <w:b/>
+                <w:color w:val="25002B"/>
+                <w:sz w:val="21"/>
+              </w:rPr>
+              <w:t>MANAGER HOME</w:t>
+            </w:r>
+          </w:p>
+          <w:p>
+            <w:pPr>
+              <w:pStyle w:val="ListBullet"/>
+              <w:spacing w:after="40" w:line="240" w:lineRule="auto"/>
+            </w:pPr>
+            <w:r>
+              <w:rPr>
+                <w:rFonts w:ascii="Arial" w:hAnsi="Arial" w:eastAsia="Arial"/>
+                <w:color w:val="10233F"/>
+                <w:sz w:val="17"/>
+              </w:rPr>
+              <w:t>Managers see team performance first: league position, team form, upcoming fixtures and player stats.</w:t>
+            </w:r>
+          </w:p>
+          <w:p>
+            <w:pPr>
+              <w:pStyle w:val="ListBullet"/>
+              <w:spacing w:after="40" w:line="240" w:lineRule="auto"/>
+            </w:pPr>
+            <w:r>
+              <w:rPr>
+                <w:rFonts w:ascii="Arial" w:hAnsi="Arial" w:eastAsia="Arial"/>
+                <w:color w:val="10233F"/>
+                <w:sz w:val="17"/>
+              </w:rPr>
+              <w:t>The manager view is scoped to the selected team only.</w:t>
+            </w:r>
+          </w:p>
+          <w:p>
+            <w:pPr>
+              <w:pStyle w:val="ListBullet"/>
+              <w:spacing w:after="40" w:line="240" w:lineRule="auto"/>
+            </w:pPr>
+            <w:r>
+              <w:rPr>
+                <w:rFonts w:ascii="Arial" w:hAnsi="Arial" w:eastAsia="Arial"/>
+                <w:color w:val="10233F"/>
+                <w:sz w:val="17"/>
+              </w:rPr>
+              <w:t>If someone has more than one role, they can switch role from the top context selector.</w:t>
+            </w:r>
+          </w:p>
+        </w:tc>
+        <w:tc>
+          <w:tcPr>
+            <w:tcW w:type="dxa" w:w="5349"/>
+            <w:vAlign w:val="top"/>
+            <w:tcBorders>
+              <w:top w:val="single" w:sz="8" w:space="0" w:color="E6E0EB"/>
+              <w:left w:val="single" w:sz="8" w:space="0" w:color="E6E0EB"/>
+              <w:bottom w:val="single" w:sz="8" w:space="0" w:color="E6E0EB"/>
+              <w:right w:val="single" w:sz="8" w:space="0" w:color="E6E0EB"/>
+            </w:tcBorders>
+            <w:shd w:fill="FFFFFF"/>
+          </w:tcPr>
+          <w:p>
+            <w:pPr>
+              <w:spacing w:after="0"/>
+              <w:jc w:val="center"/>
+            </w:pPr>
+            <w:r>
+              <w:drawing>
+                <wp:inline xmlns:a="http://schemas.openxmlformats.org/drawingml/2006/main" xmlns:pic="http://schemas.openxmlformats.org/drawingml/2006/picture">
+                  <wp:extent cx="1783080" cy="3593592"/>
+                  <wp:docPr id="4" name="Picture 4"/>
+                  <wp:cNvGraphicFramePr>
+                    <a:graphicFrameLocks noChangeAspect="1"/>
+                  </wp:cNvGraphicFramePr>
+                  <a:graphic>
+                    <a:graphicData uri="http://schemas.openxmlformats.org/drawingml/2006/picture">
+                      <pic:pic>
+                        <pic:nvPicPr>
+                          <pic:cNvPr id="0" name="04-manager-home.png"/>
+                          <pic:cNvPicPr/>
+                        </pic:nvPicPr>
+                        <pic:blipFill>
+                          <a:blip r:embed="rId12"/>
+                          <a:stretch>
+                            <a:fillRect/>
+                          </a:stretch>
+                        </pic:blipFill>
+                        <pic:spPr>
+                          <a:xfrm>
+                            <a:off x="0" y="0"/>
+                            <a:ext cx="1783080" cy="3593592"/>
+                          </a:xfrm>
+                          <a:prstGeom prst="rect"/>
+                        </pic:spPr>
+                      </pic:pic>
+                    </a:graphicData>
+                  </a:graphic>
+                </wp:inline>
+              </w:drawing>
+            </w:r>
+          </w:p>
+        </w:tc>
+      </w:tr>
+    </w:tbl>
+    <w:p>
+      <w:pPr>
+        <w:spacing w:after="40"/>
+      </w:pPr>
+    </w:p>
+    <w:tbl>
+      <w:tblPr>
+        <w:tblW w:type="auto" w:w="0"/>
+        <w:jc w:val="center"/>
+        <w:tblLayout w:type="fixed"/>
+        <w:tblLook w:firstColumn="1" w:firstRow="1" w:lastColumn="0" w:lastRow="0" w:noHBand="0" w:noVBand="1" w:val="04A0"/>
+      </w:tblPr>
+      <w:tblGrid>
+        <w:gridCol w:w="5616"/>
+        <w:gridCol w:w="3528"/>
+      </w:tblGrid>
+      <w:tr>
+        <w:tc>
+          <w:tcPr>
+            <w:tcW w:type="dxa" w:w="5349"/>
+            <w:vAlign w:val="top"/>
+            <w:tcBorders>
+              <w:top w:val="single" w:sz="8" w:space="0" w:color="E6E0EB"/>
+              <w:left w:val="single" w:sz="8" w:space="0" w:color="E6E0EB"/>
+              <w:bottom w:val="single" w:sz="8" w:space="0" w:color="E6E0EB"/>
+              <w:right w:val="single" w:sz="8" w:space="0" w:color="E6E0EB"/>
+            </w:tcBorders>
+            <w:shd w:fill="FFFFFF"/>
+          </w:tcPr>
+          <w:p>
+            <w:pPr>
+              <w:spacing w:after="80"/>
+            </w:pPr>
+            <w:r>
+              <w:rPr>
+                <w:rFonts w:ascii="Arial" w:hAnsi="Arial" w:eastAsia="Arial"/>
+                <w:b/>
+                <w:color w:val="25002B"/>
+                <w:sz w:val="21"/>
+              </w:rPr>
+              <w:t>NEXT MATCHES</w:t>
+            </w:r>
+          </w:p>
+          <w:p>
+            <w:pPr>
+              <w:pStyle w:val="ListBullet"/>
+              <w:spacing w:after="40" w:line="240" w:lineRule="auto"/>
+            </w:pPr>
+            <w:r>
+              <w:rPr>
+                <w:rFonts w:ascii="Arial" w:hAnsi="Arial" w:eastAsia="Arial"/>
+                <w:color w:val="10233F"/>
+                <w:sz w:val="17"/>
+              </w:rPr>
+              <w:t>The manager opens their own match from Next matches.</w:t>
+            </w:r>
+          </w:p>
+          <w:p>
+            <w:pPr>
+              <w:pStyle w:val="ListBullet"/>
+              <w:spacing w:after="40" w:line="240" w:lineRule="auto"/>
+            </w:pPr>
+            <w:r>
+              <w:rPr>
+                <w:rFonts w:ascii="Arial" w:hAnsi="Arial" w:eastAsia="Arial"/>
+                <w:color w:val="10233F"/>
+                <w:sz w:val="17"/>
+              </w:rPr>
+              <w:t>Other matches in the week can be viewed as scores come in, but only the manager’s own team match can be edited.</w:t>
+            </w:r>
+          </w:p>
+          <w:p>
+            <w:pPr>
+              <w:pStyle w:val="ListBullet"/>
+              <w:spacing w:after="40" w:line="240" w:lineRule="auto"/>
+            </w:pPr>
+            <w:r>
+              <w:rPr>
+                <w:rFonts w:ascii="Arial" w:hAnsi="Arial" w:eastAsia="Arial"/>
+                <w:color w:val="10233F"/>
+                <w:sz w:val="17"/>
+              </w:rPr>
+              <w:t>Once a match is completed, it is locked from further editing.</w:t>
+            </w:r>
+          </w:p>
+        </w:tc>
+        <w:tc>
+          <w:tcPr>
+            <w:tcW w:type="dxa" w:w="5349"/>
+            <w:vAlign w:val="top"/>
+            <w:tcBorders>
+              <w:top w:val="single" w:sz="8" w:space="0" w:color="E6E0EB"/>
+              <w:left w:val="single" w:sz="8" w:space="0" w:color="E6E0EB"/>
+              <w:bottom w:val="single" w:sz="8" w:space="0" w:color="E6E0EB"/>
+              <w:right w:val="single" w:sz="8" w:space="0" w:color="E6E0EB"/>
+            </w:tcBorders>
+            <w:shd w:fill="FFFFFF"/>
+          </w:tcPr>
+          <w:p>
+            <w:pPr>
+              <w:spacing w:after="0"/>
+              <w:jc w:val="center"/>
+            </w:pPr>
+            <w:r>
+              <w:drawing>
+                <wp:inline xmlns:a="http://schemas.openxmlformats.org/drawingml/2006/main" xmlns:pic="http://schemas.openxmlformats.org/drawingml/2006/picture">
+                  <wp:extent cx="1783080" cy="3593592"/>
+                  <wp:docPr id="5" name="Picture 5"/>
+                  <wp:cNvGraphicFramePr>
+                    <a:graphicFrameLocks noChangeAspect="1"/>
+                  </wp:cNvGraphicFramePr>
+                  <a:graphic>
+                    <a:graphicData uri="http://schemas.openxmlformats.org/drawingml/2006/picture">
+                      <pic:pic>
+                        <pic:nvPicPr>
+                          <pic:cNvPr id="0" name="05-manager-next-matches.png"/>
+                          <pic:cNvPicPr/>
+                        </pic:nvPicPr>
+                        <pic:blipFill>
+                          <a:blip r:embed="rId13"/>
+                          <a:stretch>
+                            <a:fillRect/>
+                          </a:stretch>
+                        </pic:blipFill>
+                        <pic:spPr>
+                          <a:xfrm>
+                            <a:off x="0" y="0"/>
+                            <a:ext cx="1783080" cy="3593592"/>
+                          </a:xfrm>
+                          <a:prstGeom prst="rect"/>
+                        </pic:spPr>
+                      </pic:pic>
+                    </a:graphicData>
+                  </a:graphic>
+                </wp:inline>
+              </w:drawing>
+            </w:r>
+          </w:p>
+        </w:tc>
+      </w:tr>
+    </w:tbl>
+    <w:p>
+      <w:pPr>
+        <w:spacing w:after="40"/>
+      </w:pPr>
+    </w:p>
+    <w:tbl>
+      <w:tblPr>
+        <w:tblW w:type="auto" w:w="0"/>
+        <w:jc w:val="center"/>
+        <w:tblLayout w:type="fixed"/>
+        <w:tblLook w:firstColumn="1" w:firstRow="1" w:lastColumn="0" w:lastRow="0" w:noHBand="0" w:noVBand="1" w:val="04A0"/>
+      </w:tblPr>
+      <w:tblGrid>
+        <w:gridCol w:w="5616"/>
+        <w:gridCol w:w="3528"/>
+      </w:tblGrid>
+      <w:tr>
+        <w:tc>
+          <w:tcPr>
+            <w:tcW w:type="dxa" w:w="5349"/>
+            <w:vAlign w:val="top"/>
+            <w:tcBorders>
+              <w:top w:val="single" w:sz="8" w:space="0" w:color="E6E0EB"/>
+              <w:left w:val="single" w:sz="8" w:space="0" w:color="E6E0EB"/>
+              <w:bottom w:val="single" w:sz="8" w:space="0" w:color="E6E0EB"/>
+              <w:right w:val="single" w:sz="8" w:space="0" w:color="E6E0EB"/>
+            </w:tcBorders>
+            <w:shd w:fill="FFFFFF"/>
+          </w:tcPr>
+          <w:p>
+            <w:pPr>
+              <w:spacing w:after="80"/>
+            </w:pPr>
+            <w:r>
+              <w:rPr>
+                <w:rFonts w:ascii="Arial" w:hAnsi="Arial" w:eastAsia="Arial"/>
+                <w:b/>
+                <w:color w:val="25002B"/>
+                <w:sz w:val="21"/>
+              </w:rPr>
+              <w:t>PICK THE TEAM</w:t>
+            </w:r>
+          </w:p>
+          <w:p>
+            <w:pPr>
+              <w:pStyle w:val="ListBullet"/>
+              <w:spacing w:after="40" w:line="240" w:lineRule="auto"/>
+            </w:pPr>
+            <w:r>
+              <w:rPr>
+                <w:rFonts w:ascii="Arial" w:hAnsi="Arial" w:eastAsia="Arial"/>
+                <w:color w:val="10233F"/>
+                <w:sz w:val="17"/>
+              </w:rPr>
+              <w:t>Tap an empty match position and select the player for that slot.</w:t>
+            </w:r>
+          </w:p>
+          <w:p>
+            <w:pPr>
+              <w:pStyle w:val="ListBullet"/>
+              <w:spacing w:after="40" w:line="240" w:lineRule="auto"/>
+            </w:pPr>
+            <w:r>
+              <w:rPr>
+                <w:rFonts w:ascii="Arial" w:hAnsi="Arial" w:eastAsia="Arial"/>
+                <w:color w:val="10233F"/>
+                <w:sz w:val="17"/>
+              </w:rPr>
+              <w:t>The team sheet follows the league format. Doubles slots take two players.</w:t>
+            </w:r>
+          </w:p>
+          <w:p>
+            <w:pPr>
+              <w:pStyle w:val="ListBullet"/>
+              <w:spacing w:after="40" w:line="240" w:lineRule="auto"/>
+            </w:pPr>
+            <w:r>
+              <w:rPr>
+                <w:rFonts w:ascii="Arial" w:hAnsi="Arial" w:eastAsia="Arial"/>
+                <w:color w:val="10233F"/>
+                <w:sz w:val="17"/>
+              </w:rPr>
+              <w:t>Save as you go, then publish only when the team is final. Published teams cannot be changed.</w:t>
+            </w:r>
+          </w:p>
+        </w:tc>
+        <w:tc>
+          <w:tcPr>
+            <w:tcW w:type="dxa" w:w="5349"/>
+            <w:vAlign w:val="top"/>
+            <w:tcBorders>
+              <w:top w:val="single" w:sz="8" w:space="0" w:color="E6E0EB"/>
+              <w:left w:val="single" w:sz="8" w:space="0" w:color="E6E0EB"/>
+              <w:bottom w:val="single" w:sz="8" w:space="0" w:color="E6E0EB"/>
+              <w:right w:val="single" w:sz="8" w:space="0" w:color="E6E0EB"/>
+            </w:tcBorders>
+            <w:shd w:fill="FFFFFF"/>
+          </w:tcPr>
+          <w:p>
+            <w:pPr>
+              <w:spacing w:after="0"/>
+              <w:jc w:val="center"/>
+            </w:pPr>
+            <w:r>
+              <w:drawing>
+                <wp:inline xmlns:a="http://schemas.openxmlformats.org/drawingml/2006/main" xmlns:pic="http://schemas.openxmlformats.org/drawingml/2006/picture">
+                  <wp:extent cx="1783080" cy="3593592"/>
+                  <wp:docPr id="6" name="Picture 6"/>
+                  <wp:cNvGraphicFramePr>
+                    <a:graphicFrameLocks noChangeAspect="1"/>
+                  </wp:cNvGraphicFramePr>
+                  <a:graphic>
+                    <a:graphicData uri="http://schemas.openxmlformats.org/drawingml/2006/picture">
+                      <pic:pic>
+                        <pic:nvPicPr>
+                          <pic:cNvPr id="0" name="08-pick-player.png"/>
+                          <pic:cNvPicPr/>
+                        </pic:nvPicPr>
+                        <pic:blipFill>
+                          <a:blip r:embed="rId14"/>
+                          <a:stretch>
+                            <a:fillRect/>
+                          </a:stretch>
+                        </pic:blipFill>
+                        <pic:spPr>
+                          <a:xfrm>
+                            <a:off x="0" y="0"/>
+                            <a:ext cx="1783080" cy="3593592"/>
+                          </a:xfrm>
+                          <a:prstGeom prst="rect"/>
+                        </pic:spPr>
+                      </pic:pic>
+                    </a:graphicData>
+                  </a:graphic>
+                </wp:inline>
+              </w:drawing>
+            </w:r>
+          </w:p>
+        </w:tc>
+      </w:tr>
+    </w:tbl>
+    <w:p>
+      <w:pPr>
+        <w:spacing w:after="40"/>
+      </w:pPr>
+    </w:p>
+    <w:tbl>
+      <w:tblPr>
+        <w:tblW w:type="auto" w:w="0"/>
+        <w:jc w:val="center"/>
+        <w:tblLayout w:type="fixed"/>
+        <w:tblLook w:firstColumn="1" w:firstRow="1" w:lastColumn="0" w:lastRow="0" w:noHBand="0" w:noVBand="1" w:val="04A0"/>
+      </w:tblPr>
+      <w:tblGrid>
+        <w:gridCol w:w="5616"/>
+        <w:gridCol w:w="3528"/>
+      </w:tblGrid>
+      <w:tr>
+        <w:tc>
+          <w:tcPr>
+            <w:tcW w:type="dxa" w:w="5349"/>
+            <w:vAlign w:val="top"/>
+            <w:tcBorders>
+              <w:top w:val="single" w:sz="8" w:space="0" w:color="E6E0EB"/>
+              <w:left w:val="single" w:sz="8" w:space="0" w:color="E6E0EB"/>
+              <w:bottom w:val="single" w:sz="8" w:space="0" w:color="E6E0EB"/>
+              <w:right w:val="single" w:sz="8" w:space="0" w:color="E6E0EB"/>
+            </w:tcBorders>
+            <w:shd w:fill="FFFFFF"/>
+          </w:tcPr>
+          <w:p>
+            <w:pPr>
+              <w:spacing w:after="80"/>
+            </w:pPr>
+            <w:r>
+              <w:rPr>
+                <w:rFonts w:ascii="Arial" w:hAnsi="Arial" w:eastAsia="Arial"/>
+                <w:b/>
+                <w:color w:val="25002B"/>
+                <w:sz w:val="21"/>
+              </w:rPr>
+              <w:t>ENTER SCORES</w:t>
+            </w:r>
+          </w:p>
+          <w:p>
+            <w:pPr>
+              <w:pStyle w:val="ListBullet"/>
+              <w:spacing w:after="40" w:line="240" w:lineRule="auto"/>
+            </w:pPr>
+            <w:r>
+              <w:rPr>
+                <w:rFonts w:ascii="Arial" w:hAnsi="Arial" w:eastAsia="Arial"/>
+                <w:color w:val="10233F"/>
+                <w:sz w:val="17"/>
+              </w:rPr>
+              <w:t>During the match, tap the winning team for each game.</w:t>
+            </w:r>
+          </w:p>
+          <w:p>
+            <w:pPr>
+              <w:pStyle w:val="ListBullet"/>
+              <w:spacing w:after="40" w:line="240" w:lineRule="auto"/>
+            </w:pPr>
+            <w:r>
+              <w:rPr>
+                <w:rFonts w:ascii="Arial" w:hAnsi="Arial" w:eastAsia="Arial"/>
+                <w:color w:val="10233F"/>
+                <w:sz w:val="17"/>
+              </w:rPr>
+              <w:t>Singles are worth 1 point. Doubles are worth 2 points.</w:t>
+            </w:r>
+          </w:p>
+          <w:p>
+            <w:pPr>
+              <w:pStyle w:val="ListBullet"/>
+              <w:spacing w:after="40" w:line="240" w:lineRule="auto"/>
+            </w:pPr>
+            <w:r>
+              <w:rPr>
+                <w:rFonts w:ascii="Arial" w:hAnsi="Arial" w:eastAsia="Arial"/>
+                <w:color w:val="10233F"/>
+                <w:sz w:val="17"/>
+              </w:rPr>
+              <w:t>Use Match Completed only when all games are done; after that the result is locked.</w:t>
+            </w:r>
+          </w:p>
+        </w:tc>
+        <w:tc>
+          <w:tcPr>
+            <w:tcW w:type="dxa" w:w="5349"/>
+            <w:vAlign w:val="top"/>
+            <w:tcBorders>
+              <w:top w:val="single" w:sz="8" w:space="0" w:color="E6E0EB"/>
+              <w:left w:val="single" w:sz="8" w:space="0" w:color="E6E0EB"/>
+              <w:bottom w:val="single" w:sz="8" w:space="0" w:color="E6E0EB"/>
+              <w:right w:val="single" w:sz="8" w:space="0" w:color="E6E0EB"/>
+            </w:tcBorders>
+            <w:shd w:fill="FFFFFF"/>
+          </w:tcPr>
+          <w:p>
+            <w:pPr>
+              <w:spacing w:after="0"/>
+              <w:jc w:val="center"/>
+            </w:pPr>
+            <w:r>
+              <w:drawing>
+                <wp:inline xmlns:a="http://schemas.openxmlformats.org/drawingml/2006/main" xmlns:pic="http://schemas.openxmlformats.org/drawingml/2006/picture">
+                  <wp:extent cx="1783080" cy="3593592"/>
+                  <wp:docPr id="7" name="Picture 7"/>
+                  <wp:cNvGraphicFramePr>
+                    <a:graphicFrameLocks noChangeAspect="1"/>
+                  </wp:cNvGraphicFramePr>
+                  <a:graphic>
+                    <a:graphicData uri="http://schemas.openxmlformats.org/drawingml/2006/picture">
+                      <pic:pic>
+                        <pic:nvPicPr>
+                          <pic:cNvPr id="0" name="09-score-entry-example.png"/>
+                          <pic:cNvPicPr/>
+                        </pic:nvPicPr>
+                        <pic:blipFill>
+                          <a:blip r:embed="rId15"/>
+                          <a:stretch>
+                            <a:fillRect/>
+                          </a:stretch>
+                        </pic:blipFill>
+                        <pic:spPr>
+                          <a:xfrm>
+                            <a:off x="0" y="0"/>
+                            <a:ext cx="1783080" cy="3593592"/>
+                          </a:xfrm>
+                          <a:prstGeom prst="rect"/>
+                        </pic:spPr>
+                      </pic:pic>
+                    </a:graphicData>
+                  </a:graphic>
+                </wp:inline>
+              </w:drawing>
+            </w:r>
+          </w:p>
+        </w:tc>
+      </w:tr>
+    </w:tbl>
+    <w:p>
+      <w:pPr>
+        <w:spacing w:after="40"/>
+      </w:pPr>
+    </w:p>
+    <w:tbl>
+      <w:tblPr>
+        <w:tblW w:type="auto" w:w="0"/>
+        <w:jc w:val="center"/>
+        <w:tblLayout w:type="fixed"/>
+        <w:tblLook w:firstColumn="1" w:firstRow="1" w:lastColumn="0" w:lastRow="0" w:noHBand="0" w:noVBand="1" w:val="04A0"/>
+      </w:tblPr>
+      <w:tblGrid>
+        <w:gridCol w:w="5616"/>
+        <w:gridCol w:w="3528"/>
+      </w:tblGrid>
+      <w:tr>
+        <w:tc>
+          <w:tcPr>
+            <w:tcW w:type="dxa" w:w="5349"/>
+            <w:vAlign w:val="top"/>
+            <w:tcBorders>
+              <w:top w:val="single" w:sz="8" w:space="0" w:color="E6E0EB"/>
+              <w:left w:val="single" w:sz="8" w:space="0" w:color="E6E0EB"/>
+              <w:bottom w:val="single" w:sz="8" w:space="0" w:color="E6E0EB"/>
+              <w:right w:val="single" w:sz="8" w:space="0" w:color="E6E0EB"/>
+            </w:tcBorders>
+            <w:shd w:fill="FFFFFF"/>
+          </w:tcPr>
+          <w:p>
+            <w:pPr>
+              <w:spacing w:after="80"/>
+            </w:pPr>
+            <w:r>
+              <w:rPr>
+                <w:rFonts w:ascii="Arial" w:hAnsi="Arial" w:eastAsia="Arial"/>
+                <w:b/>
+                <w:color w:val="25002B"/>
+                <w:sz w:val="21"/>
+              </w:rPr>
+              <w:t>RECORD BREAKS</w:t>
+            </w:r>
+          </w:p>
+          <w:p>
+            <w:pPr>
+              <w:pStyle w:val="ListBullet"/>
+              <w:spacing w:after="40" w:line="240" w:lineRule="auto"/>
+            </w:pPr>
+            <w:r>
+              <w:rPr>
+                <w:rFonts w:ascii="Arial" w:hAnsi="Arial" w:eastAsia="Arial"/>
+                <w:color w:val="10233F"/>
+                <w:sz w:val="17"/>
+              </w:rPr>
+              <w:t>Breaks are optional and should only be recorded when they are meaningful for the player record.</w:t>
+            </w:r>
+          </w:p>
+          <w:p>
+            <w:pPr>
+              <w:pStyle w:val="ListBullet"/>
+              <w:spacing w:after="40" w:line="240" w:lineRule="auto"/>
+            </w:pPr>
+            <w:r>
+              <w:rPr>
+                <w:rFonts w:ascii="Arial" w:hAnsi="Arial" w:eastAsia="Arial"/>
+                <w:color w:val="10233F"/>
+                <w:sz w:val="17"/>
+              </w:rPr>
+              <w:t>Pick the player, enter the break value, and save it against that game.</w:t>
+            </w:r>
+          </w:p>
+          <w:p>
+            <w:pPr>
+              <w:pStyle w:val="ListBullet"/>
+              <w:spacing w:after="40" w:line="240" w:lineRule="auto"/>
+            </w:pPr>
+            <w:r>
+              <w:rPr>
+                <w:rFonts w:ascii="Arial" w:hAnsi="Arial" w:eastAsia="Arial"/>
+                <w:color w:val="10233F"/>
+                <w:sz w:val="17"/>
+              </w:rPr>
+              <w:t>Breaks are stored against the player, game, match and season so they flow into player statistics.</w:t>
+            </w:r>
+          </w:p>
+        </w:tc>
+        <w:tc>
+          <w:tcPr>
+            <w:tcW w:type="dxa" w:w="5349"/>
+            <w:vAlign w:val="top"/>
+            <w:tcBorders>
+              <w:top w:val="single" w:sz="8" w:space="0" w:color="E6E0EB"/>
+              <w:left w:val="single" w:sz="8" w:space="0" w:color="E6E0EB"/>
+              <w:bottom w:val="single" w:sz="8" w:space="0" w:color="E6E0EB"/>
+              <w:right w:val="single" w:sz="8" w:space="0" w:color="E6E0EB"/>
+            </w:tcBorders>
+            <w:shd w:fill="FFFFFF"/>
+          </w:tcPr>
+          <w:p>
+            <w:pPr>
+              <w:spacing w:after="0"/>
+              <w:jc w:val="center"/>
+            </w:pPr>
+            <w:r>
+              <w:drawing>
+                <wp:inline xmlns:a="http://schemas.openxmlformats.org/drawingml/2006/main" xmlns:pic="http://schemas.openxmlformats.org/drawingml/2006/picture">
+                  <wp:extent cx="1783080" cy="3593592"/>
+                  <wp:docPr id="8" name="Picture 8"/>
+                  <wp:cNvGraphicFramePr>
+                    <a:graphicFrameLocks noChangeAspect="1"/>
+                  </wp:cNvGraphicFramePr>
+                  <a:graphic>
+                    <a:graphicData uri="http://schemas.openxmlformats.org/drawingml/2006/picture">
+                      <pic:pic>
+                        <pic:nvPicPr>
+                          <pic:cNvPr id="0" name="10-break-entry-example.png"/>
+                          <pic:cNvPicPr/>
+                        </pic:nvPicPr>
+                        <pic:blipFill>
+                          <a:blip r:embed="rId16"/>
+                          <a:stretch>
+                            <a:fillRect/>
+                          </a:stretch>
+                        </pic:blipFill>
+                        <pic:spPr>
+                          <a:xfrm>
+                            <a:off x="0" y="0"/>
+                            <a:ext cx="1783080" cy="3593592"/>
+                          </a:xfrm>
+                          <a:prstGeom prst="rect"/>
+                        </pic:spPr>
+                      </pic:pic>
+                    </a:graphicData>
+                  </a:graphic>
+                </wp:inline>
+              </w:drawing>
+            </w:r>
+          </w:p>
+        </w:tc>
+      </w:tr>
+    </w:tbl>
+    <w:p>
+      <w:pPr>
+        <w:spacing w:after="40"/>
+      </w:pPr>
+    </w:p>
+    <w:tbl>
+      <w:tblPr>
+        <w:tblW w:type="auto" w:w="0"/>
+        <w:jc w:val="center"/>
+        <w:tblLayout w:type="fixed"/>
+        <w:tblLook w:firstColumn="1" w:firstRow="1" w:lastColumn="0" w:lastRow="0" w:noHBand="0" w:noVBand="1" w:val="04A0"/>
+      </w:tblPr>
+      <w:tblGrid>
+        <w:gridCol w:w="5616"/>
+        <w:gridCol w:w="3528"/>
+      </w:tblGrid>
+      <w:tr>
+        <w:tc>
+          <w:tcPr>
+            <w:tcW w:type="dxa" w:w="5349"/>
+            <w:vAlign w:val="top"/>
+            <w:tcBorders>
+              <w:top w:val="single" w:sz="8" w:space="0" w:color="E6E0EB"/>
+              <w:left w:val="single" w:sz="8" w:space="0" w:color="E6E0EB"/>
+              <w:bottom w:val="single" w:sz="8" w:space="0" w:color="E6E0EB"/>
+              <w:right w:val="single" w:sz="8" w:space="0" w:color="E6E0EB"/>
+            </w:tcBorders>
+            <w:shd w:fill="FFFFFF"/>
+          </w:tcPr>
+          <w:p>
+            <w:pPr>
+              <w:spacing w:after="80"/>
+            </w:pPr>
+            <w:r>
+              <w:rPr>
+                <w:rFonts w:ascii="Arial" w:hAnsi="Arial" w:eastAsia="Arial"/>
+                <w:b/>
+                <w:color w:val="25002B"/>
+                <w:sz w:val="21"/>
+              </w:rPr>
+              <w:t>STATS, TABLES AND CLUB</w:t>
+            </w:r>
+          </w:p>
+          <w:p>
+            <w:pPr>
+              <w:pStyle w:val="ListBullet"/>
+              <w:spacing w:after="40" w:line="240" w:lineRule="auto"/>
+            </w:pPr>
+            <w:r>
+              <w:rPr>
+                <w:rFonts w:ascii="Arial" w:hAnsi="Arial" w:eastAsia="Arial"/>
+                <w:color w:val="10233F"/>
+                <w:sz w:val="17"/>
+              </w:rPr>
+              <w:t>Player stats show personal win rate, games played, games won/lost and highest break when available.</w:t>
+            </w:r>
+          </w:p>
+          <w:p>
+            <w:pPr>
+              <w:pStyle w:val="ListBullet"/>
+              <w:spacing w:after="40" w:line="240" w:lineRule="auto"/>
+            </w:pPr>
+            <w:r>
+              <w:rPr>
+                <w:rFonts w:ascii="Arial" w:hAnsi="Arial" w:eastAsia="Arial"/>
+                <w:color w:val="10233F"/>
+                <w:sz w:val="17"/>
+              </w:rPr>
+              <w:t>Tables shows your league first, then the other leagues.</w:t>
+            </w:r>
+          </w:p>
+          <w:p>
+            <w:pPr>
+              <w:pStyle w:val="ListBullet"/>
+              <w:spacing w:after="40" w:line="240" w:lineRule="auto"/>
+            </w:pPr>
+            <w:r>
+              <w:rPr>
+                <w:rFonts w:ascii="Arial" w:hAnsi="Arial" w:eastAsia="Arial"/>
+                <w:color w:val="10233F"/>
+                <w:sz w:val="17"/>
+              </w:rPr>
+              <w:t>My Club contains club-only features such as table bookings, competitions and club games.</w:t>
+            </w:r>
+          </w:p>
+        </w:tc>
+        <w:tc>
+          <w:tcPr>
+            <w:tcW w:type="dxa" w:w="5349"/>
+            <w:vAlign w:val="top"/>
+            <w:tcBorders>
+              <w:top w:val="single" w:sz="8" w:space="0" w:color="E6E0EB"/>
+              <w:left w:val="single" w:sz="8" w:space="0" w:color="E6E0EB"/>
+              <w:bottom w:val="single" w:sz="8" w:space="0" w:color="E6E0EB"/>
+              <w:right w:val="single" w:sz="8" w:space="0" w:color="E6E0EB"/>
+            </w:tcBorders>
+            <w:shd w:fill="FFFFFF"/>
+          </w:tcPr>
+          <w:p>
+            <w:pPr>
+              <w:spacing w:after="0"/>
+              <w:jc w:val="center"/>
+            </w:pPr>
+            <w:r>
+              <w:drawing>
+                <wp:inline xmlns:a="http://schemas.openxmlformats.org/drawingml/2006/main" xmlns:pic="http://schemas.openxmlformats.org/drawingml/2006/picture">
+                  <wp:extent cx="1600200" cy="3225018"/>
+                  <wp:docPr id="9" name="Picture 9"/>
+                  <wp:cNvGraphicFramePr>
+                    <a:graphicFrameLocks noChangeAspect="1"/>
+                  </wp:cNvGraphicFramePr>
+                  <a:graphic>
+                    <a:graphicData uri="http://schemas.openxmlformats.org/drawingml/2006/picture">
+                      <pic:pic>
+                        <pic:nvPicPr>
+                          <pic:cNvPr id="0" name="11-season-player-stats.png"/>
+                          <pic:cNvPicPr/>
+                        </pic:nvPicPr>
+                        <pic:blipFill>
+                          <a:blip r:embed="rId17"/>
+                          <a:stretch>
+                            <a:fillRect/>
+                          </a:stretch>
+                        </pic:blipFill>
+                        <pic:spPr>
+                          <a:xfrm>
+                            <a:off x="0" y="0"/>
+                            <a:ext cx="1600200" cy="3225018"/>
+                          </a:xfrm>
+                          <a:prstGeom prst="rect"/>
+                        </pic:spPr>
+                      </pic:pic>
+                    </a:graphicData>
+                  </a:graphic>
+                </wp:inline>
+              </w:drawing>
+            </w:r>
+          </w:p>
+        </w:tc>
+      </w:tr>
+    </w:tbl>
+    <w:p>
+      <w:pPr>
+        <w:spacing w:after="40"/>
+      </w:pPr>
+    </w:p>
+    <w:tbl>
+      <w:tblPr>
+        <w:tblW w:type="auto" w:w="0"/>
+        <w:jc w:val="center"/>
+        <w:tblLook w:firstColumn="1" w:firstRow="1" w:lastColumn="0" w:lastRow="0" w:noHBand="0" w:noVBand="1" w:val="04A0"/>
+      </w:tblPr>
+      <w:tblGrid>
+        <w:gridCol w:w="5349"/>
+        <w:gridCol w:w="5349"/>
+      </w:tblGrid>
+      <w:tr>
+        <w:tc>
+          <w:tcPr>
+            <w:tcW w:type="dxa" w:w="5349"/>
+            <w:tcBorders>
+              <w:top w:val="single" w:sz="8" w:space="0" w:color="E6E0EB"/>
+              <w:left w:val="single" w:sz="8" w:space="0" w:color="E6E0EB"/>
+              <w:bottom w:val="single" w:sz="8" w:space="0" w:color="E6E0EB"/>
+              <w:right w:val="single" w:sz="8" w:space="0" w:color="E6E0EB"/>
+            </w:tcBorders>
+            <w:shd w:fill="FFFFFF"/>
           </w:tcPr>
           <w:p>
             <w:pPr>
@@ -1575,57 +1420,64 @@
             </w:pPr>
             <w:r>
               <w:rPr>
+                <w:rFonts w:ascii="Arial" w:hAnsi="Arial" w:eastAsia="Arial"/>
                 <w:b/>
-                <w:color w:val="FFFFFF"/>
+                <w:color w:val="25002B"/>
                 <w:sz w:val="19"/>
               </w:rPr>
-              <w:t>When</w:t>
+              <w:t>League tables</w:t>
+            </w:r>
+          </w:p>
+          <w:p>
+            <w:pPr>
+              <w:jc w:val="center"/>
+            </w:pPr>
+            <w:r>
+              <w:drawing>
+                <wp:inline xmlns:a="http://schemas.openxmlformats.org/drawingml/2006/main" xmlns:pic="http://schemas.openxmlformats.org/drawingml/2006/picture">
+                  <wp:extent cx="1691640" cy="3409305"/>
+                  <wp:docPr id="10" name="Picture 10"/>
+                  <wp:cNvGraphicFramePr>
+                    <a:graphicFrameLocks noChangeAspect="1"/>
+                  </wp:cNvGraphicFramePr>
+                  <a:graphic>
+                    <a:graphicData uri="http://schemas.openxmlformats.org/drawingml/2006/picture">
+                      <pic:pic>
+                        <pic:nvPicPr>
+                          <pic:cNvPr id="0" name="12-tables-screen.png"/>
+                          <pic:cNvPicPr/>
+                        </pic:nvPicPr>
+                        <pic:blipFill>
+                          <a:blip r:embed="rId18"/>
+                          <a:stretch>
+                            <a:fillRect/>
+                          </a:stretch>
+                        </pic:blipFill>
+                        <pic:spPr>
+                          <a:xfrm>
+                            <a:off x="0" y="0"/>
+                            <a:ext cx="1691640" cy="3409305"/>
+                          </a:xfrm>
+                          <a:prstGeom prst="rect"/>
+                        </pic:spPr>
+                      </pic:pic>
+                    </a:graphicData>
+                  </a:graphic>
+                </wp:inline>
+              </w:drawing>
             </w:r>
           </w:p>
         </w:tc>
         <w:tc>
           <w:tcPr>
-            <w:tcW w:type="dxa" w:w="4680"/>
-            <w:shd w:fill="10233F"/>
+            <w:tcW w:type="dxa" w:w="5349"/>
             <w:tcBorders>
-              <w:top w:val="single" w:sz="6" w:space="0" w:color="D9D9D9"/>
-              <w:left w:val="single" w:sz="6" w:space="0" w:color="D9D9D9"/>
-              <w:bottom w:val="single" w:sz="6" w:space="0" w:color="D9D9D9"/>
-              <w:right w:val="single" w:sz="6" w:space="0" w:color="D9D9D9"/>
-              <w:insideH w:val="single" w:sz="6" w:space="0" w:color="D9D9D9"/>
-              <w:insideV w:val="single" w:sz="6" w:space="0" w:color="D9D9D9"/>
+              <w:top w:val="single" w:sz="8" w:space="0" w:color="E6E0EB"/>
+              <w:left w:val="single" w:sz="8" w:space="0" w:color="E6E0EB"/>
+              <w:bottom w:val="single" w:sz="8" w:space="0" w:color="E6E0EB"/>
+              <w:right w:val="single" w:sz="8" w:space="0" w:color="E6E0EB"/>
             </w:tcBorders>
-            <w:vAlign w:val="center"/>
-          </w:tcPr>
-          <w:p>
-            <w:pPr>
-              <w:jc w:val="left"/>
-            </w:pPr>
-            <w:r>
-              <w:rPr>
-                <w:b/>
-                <w:color w:val="FFFFFF"/>
-                <w:sz w:val="19"/>
-              </w:rPr>
-              <w:t>What to check</w:t>
-            </w:r>
-          </w:p>
-        </w:tc>
-      </w:tr>
-      <w:tr>
-        <w:tc>
-          <w:tcPr>
-            <w:tcW w:type="dxa" w:w="1944"/>
             <w:shd w:fill="FFFFFF"/>
-            <w:tcBorders>
-              <w:top w:val="single" w:sz="6" w:space="0" w:color="D9D9D9"/>
-              <w:left w:val="single" w:sz="6" w:space="0" w:color="D9D9D9"/>
-              <w:bottom w:val="single" w:sz="6" w:space="0" w:color="D9D9D9"/>
-              <w:right w:val="single" w:sz="6" w:space="0" w:color="D9D9D9"/>
-              <w:insideH w:val="single" w:sz="6" w:space="0" w:color="D9D9D9"/>
-              <w:insideV w:val="single" w:sz="6" w:space="0" w:color="D9D9D9"/>
-            </w:tcBorders>
-            <w:vAlign w:val="center"/>
           </w:tcPr>
           <w:p>
             <w:pPr>
@@ -1633,251 +1485,51 @@
             </w:pPr>
             <w:r>
               <w:rPr>
+                <w:rFonts w:ascii="Arial" w:hAnsi="Arial" w:eastAsia="Arial"/>
+                <w:b/>
+                <w:color w:val="25002B"/>
                 <w:sz w:val="19"/>
               </w:rPr>
-              <w:t>Before match night</w:t>
+              <w:t>My Club</w:t>
             </w:r>
           </w:p>
-        </w:tc>
-        <w:tc>
-          <w:tcPr>
-            <w:tcW w:type="dxa" w:w="4680"/>
-            <w:shd w:fill="FFFFFF"/>
-            <w:tcBorders>
-              <w:top w:val="single" w:sz="6" w:space="0" w:color="D9D9D9"/>
-              <w:left w:val="single" w:sz="6" w:space="0" w:color="D9D9D9"/>
-              <w:bottom w:val="single" w:sz="6" w:space="0" w:color="D9D9D9"/>
-              <w:right w:val="single" w:sz="6" w:space="0" w:color="D9D9D9"/>
-              <w:insideH w:val="single" w:sz="6" w:space="0" w:color="D9D9D9"/>
-              <w:insideV w:val="single" w:sz="6" w:space="0" w:color="D9D9D9"/>
-            </w:tcBorders>
-            <w:vAlign w:val="center"/>
-          </w:tcPr>
-          <w:p>
-            <w:pPr>
-              <w:jc w:val="left"/>
-            </w:pPr>
-            <w:r>
-              <w:rPr>
-                <w:sz w:val="19"/>
-              </w:rPr>
-              <w:t>Confirm your role, team, fixture and selected season.</w:t>
-            </w:r>
-          </w:p>
-        </w:tc>
-      </w:tr>
-      <w:tr>
-        <w:tc>
-          <w:tcPr>
-            <w:tcW w:type="dxa" w:w="1944"/>
-            <w:shd w:fill="FFFFFF"/>
-            <w:tcBorders>
-              <w:top w:val="single" w:sz="6" w:space="0" w:color="D9D9D9"/>
-              <w:left w:val="single" w:sz="6" w:space="0" w:color="D9D9D9"/>
-              <w:bottom w:val="single" w:sz="6" w:space="0" w:color="D9D9D9"/>
-              <w:right w:val="single" w:sz="6" w:space="0" w:color="D9D9D9"/>
-              <w:insideH w:val="single" w:sz="6" w:space="0" w:color="D9D9D9"/>
-              <w:insideV w:val="single" w:sz="6" w:space="0" w:color="D9D9D9"/>
-            </w:tcBorders>
-            <w:vAlign w:val="center"/>
-          </w:tcPr>
           <w:p>
             <w:pPr>
               <w:jc w:val="center"/>
             </w:pPr>
             <w:r>
-              <w:rPr>
-                <w:sz w:val="19"/>
-              </w:rPr>
-              <w:t>Manager before match</w:t>
-            </w:r>
-          </w:p>
-        </w:tc>
-        <w:tc>
-          <w:tcPr>
-            <w:tcW w:type="dxa" w:w="4680"/>
-            <w:shd w:fill="FFFFFF"/>
-            <w:tcBorders>
-              <w:top w:val="single" w:sz="6" w:space="0" w:color="D9D9D9"/>
-              <w:left w:val="single" w:sz="6" w:space="0" w:color="D9D9D9"/>
-              <w:bottom w:val="single" w:sz="6" w:space="0" w:color="D9D9D9"/>
-              <w:right w:val="single" w:sz="6" w:space="0" w:color="D9D9D9"/>
-              <w:insideH w:val="single" w:sz="6" w:space="0" w:color="D9D9D9"/>
-              <w:insideV w:val="single" w:sz="6" w:space="0" w:color="D9D9D9"/>
-            </w:tcBorders>
-            <w:vAlign w:val="center"/>
-          </w:tcPr>
-          <w:p>
-            <w:pPr>
-              <w:jc w:val="left"/>
-            </w:pPr>
-            <w:r>
-              <w:rPr>
-                <w:sz w:val="19"/>
-              </w:rPr>
-              <w:t>Pick the lineup, save draft if needed, then publish when final.</w:t>
-            </w:r>
-          </w:p>
-        </w:tc>
-      </w:tr>
-      <w:tr>
-        <w:tc>
-          <w:tcPr>
-            <w:tcW w:type="dxa" w:w="1944"/>
-            <w:shd w:fill="FFFFFF"/>
-            <w:tcBorders>
-              <w:top w:val="single" w:sz="6" w:space="0" w:color="D9D9D9"/>
-              <w:left w:val="single" w:sz="6" w:space="0" w:color="D9D9D9"/>
-              <w:bottom w:val="single" w:sz="6" w:space="0" w:color="D9D9D9"/>
-              <w:right w:val="single" w:sz="6" w:space="0" w:color="D9D9D9"/>
-              <w:insideH w:val="single" w:sz="6" w:space="0" w:color="D9D9D9"/>
-              <w:insideV w:val="single" w:sz="6" w:space="0" w:color="D9D9D9"/>
-            </w:tcBorders>
-            <w:vAlign w:val="center"/>
-          </w:tcPr>
-          <w:p>
-            <w:pPr>
-              <w:jc w:val="center"/>
-            </w:pPr>
-            <w:r>
-              <w:rPr>
-                <w:sz w:val="19"/>
-              </w:rPr>
-              <w:t>During match</w:t>
-            </w:r>
-          </w:p>
-        </w:tc>
-        <w:tc>
-          <w:tcPr>
-            <w:tcW w:type="dxa" w:w="4680"/>
-            <w:shd w:fill="FFFFFF"/>
-            <w:tcBorders>
-              <w:top w:val="single" w:sz="6" w:space="0" w:color="D9D9D9"/>
-              <w:left w:val="single" w:sz="6" w:space="0" w:color="D9D9D9"/>
-              <w:bottom w:val="single" w:sz="6" w:space="0" w:color="D9D9D9"/>
-              <w:right w:val="single" w:sz="6" w:space="0" w:color="D9D9D9"/>
-              <w:insideH w:val="single" w:sz="6" w:space="0" w:color="D9D9D9"/>
-              <w:insideV w:val="single" w:sz="6" w:space="0" w:color="D9D9D9"/>
-            </w:tcBorders>
-            <w:vAlign w:val="center"/>
-          </w:tcPr>
-          <w:p>
-            <w:pPr>
-              <w:jc w:val="left"/>
-            </w:pPr>
-            <w:r>
-              <w:rPr>
-                <w:sz w:val="19"/>
-              </w:rPr>
-              <w:t>Enter each game result and record any meaningful breaks.</w:t>
-            </w:r>
-          </w:p>
-        </w:tc>
-      </w:tr>
-      <w:tr>
-        <w:tc>
-          <w:tcPr>
-            <w:tcW w:type="dxa" w:w="1944"/>
-            <w:shd w:fill="FFFFFF"/>
-            <w:tcBorders>
-              <w:top w:val="single" w:sz="6" w:space="0" w:color="D9D9D9"/>
-              <w:left w:val="single" w:sz="6" w:space="0" w:color="D9D9D9"/>
-              <w:bottom w:val="single" w:sz="6" w:space="0" w:color="D9D9D9"/>
-              <w:right w:val="single" w:sz="6" w:space="0" w:color="D9D9D9"/>
-              <w:insideH w:val="single" w:sz="6" w:space="0" w:color="D9D9D9"/>
-              <w:insideV w:val="single" w:sz="6" w:space="0" w:color="D9D9D9"/>
-            </w:tcBorders>
-            <w:vAlign w:val="center"/>
-          </w:tcPr>
-          <w:p>
-            <w:pPr>
-              <w:jc w:val="center"/>
-            </w:pPr>
-            <w:r>
-              <w:rPr>
-                <w:sz w:val="19"/>
-              </w:rPr>
-              <w:t>After match</w:t>
-            </w:r>
-          </w:p>
-        </w:tc>
-        <w:tc>
-          <w:tcPr>
-            <w:tcW w:type="dxa" w:w="4680"/>
-            <w:shd w:fill="FFFFFF"/>
-            <w:tcBorders>
-              <w:top w:val="single" w:sz="6" w:space="0" w:color="D9D9D9"/>
-              <w:left w:val="single" w:sz="6" w:space="0" w:color="D9D9D9"/>
-              <w:bottom w:val="single" w:sz="6" w:space="0" w:color="D9D9D9"/>
-              <w:right w:val="single" w:sz="6" w:space="0" w:color="D9D9D9"/>
-              <w:insideH w:val="single" w:sz="6" w:space="0" w:color="D9D9D9"/>
-              <w:insideV w:val="single" w:sz="6" w:space="0" w:color="D9D9D9"/>
-            </w:tcBorders>
-            <w:vAlign w:val="center"/>
-          </w:tcPr>
-          <w:p>
-            <w:pPr>
-              <w:jc w:val="left"/>
-            </w:pPr>
-            <w:r>
-              <w:rPr>
-                <w:sz w:val="19"/>
-              </w:rPr>
-              <w:t>Review the score and press Match Completed when everything is correct.</w:t>
-            </w:r>
-          </w:p>
-        </w:tc>
-      </w:tr>
-      <w:tr>
-        <w:tc>
-          <w:tcPr>
-            <w:tcW w:type="dxa" w:w="1944"/>
-            <w:shd w:fill="FFFFFF"/>
-            <w:tcBorders>
-              <w:top w:val="single" w:sz="6" w:space="0" w:color="D9D9D9"/>
-              <w:left w:val="single" w:sz="6" w:space="0" w:color="D9D9D9"/>
-              <w:bottom w:val="single" w:sz="6" w:space="0" w:color="D9D9D9"/>
-              <w:right w:val="single" w:sz="6" w:space="0" w:color="D9D9D9"/>
-              <w:insideH w:val="single" w:sz="6" w:space="0" w:color="D9D9D9"/>
-              <w:insideV w:val="single" w:sz="6" w:space="0" w:color="D9D9D9"/>
-            </w:tcBorders>
-            <w:vAlign w:val="center"/>
-          </w:tcPr>
-          <w:p>
-            <w:pPr>
-              <w:jc w:val="center"/>
-            </w:pPr>
-            <w:r>
-              <w:rPr>
-                <w:sz w:val="19"/>
-              </w:rPr>
-              <w:t>Any time</w:t>
-            </w:r>
-          </w:p>
-        </w:tc>
-        <w:tc>
-          <w:tcPr>
-            <w:tcW w:type="dxa" w:w="4680"/>
-            <w:shd w:fill="FFFFFF"/>
-            <w:tcBorders>
-              <w:top w:val="single" w:sz="6" w:space="0" w:color="D9D9D9"/>
-              <w:left w:val="single" w:sz="6" w:space="0" w:color="D9D9D9"/>
-              <w:bottom w:val="single" w:sz="6" w:space="0" w:color="D9D9D9"/>
-              <w:right w:val="single" w:sz="6" w:space="0" w:color="D9D9D9"/>
-              <w:insideH w:val="single" w:sz="6" w:space="0" w:color="D9D9D9"/>
-              <w:insideV w:val="single" w:sz="6" w:space="0" w:color="D9D9D9"/>
-            </w:tcBorders>
-            <w:vAlign w:val="center"/>
-          </w:tcPr>
-          <w:p>
-            <w:pPr>
-              <w:jc w:val="left"/>
-            </w:pPr>
-            <w:r>
-              <w:rPr>
-                <w:sz w:val="19"/>
-              </w:rPr>
-              <w:t>Use Fixtures, Tables, My Club and stats to follow the season.</w:t>
+              <w:drawing>
+                <wp:inline xmlns:a="http://schemas.openxmlformats.org/drawingml/2006/main" xmlns:pic="http://schemas.openxmlformats.org/drawingml/2006/picture">
+                  <wp:extent cx="1691640" cy="3409305"/>
+                  <wp:docPr id="11" name="Picture 11"/>
+                  <wp:cNvGraphicFramePr>
+                    <a:graphicFrameLocks noChangeAspect="1"/>
+                  </wp:cNvGraphicFramePr>
+                  <a:graphic>
+                    <a:graphicData uri="http://schemas.openxmlformats.org/drawingml/2006/picture">
+                      <pic:pic>
+                        <pic:nvPicPr>
+                          <pic:cNvPr id="0" name="13-my-club-screen.png"/>
+                          <pic:cNvPicPr/>
+                        </pic:nvPicPr>
+                        <pic:blipFill>
+                          <a:blip r:embed="rId19"/>
+                          <a:stretch>
+                            <a:fillRect/>
+                          </a:stretch>
+                        </pic:blipFill>
+                        <pic:spPr>
+                          <a:xfrm>
+                            <a:off x="0" y="0"/>
+                            <a:ext cx="1691640" cy="3409305"/>
+                          </a:xfrm>
+                          <a:prstGeom prst="rect"/>
+                        </pic:spPr>
+                      </pic:pic>
+                    </a:graphicData>
+                  </a:graphic>
+                </wp:inline>
+              </w:drawing>
             </w:r>
           </w:p>
         </w:tc>
@@ -1885,51 +1537,82 @@
     </w:tbl>
     <w:p>
       <w:pPr>
-        <w:pStyle w:val="Heading1"/>
-        <w:spacing w:before="280" w:after="100"/>
+        <w:spacing w:before="160" w:after="60" w:line="252" w:lineRule="auto"/>
       </w:pPr>
       <w:r>
         <w:rPr>
-          <w:color w:val="000000"/>
+          <w:rFonts w:ascii="Arial" w:hAnsi="Arial" w:eastAsia="Arial"/>
+          <w:b/>
+          <w:color w:val="10233F"/>
+          <w:sz w:val="24"/>
         </w:rPr>
-        <w:t>A final note</w:t>
+        <w:t>Good habits</w:t>
       </w:r>
     </w:p>
     <w:p>
       <w:pPr>
-        <w:spacing w:before="0" w:after="120"/>
+        <w:pStyle w:val="ListBullet"/>
+        <w:spacing w:after="40" w:line="240" w:lineRule="auto"/>
       </w:pPr>
       <w:r>
-        <w:t>The app is built around roles. A person can be a player in one team and a manager in another. Table bookings and club competition entries are attached to the person, so they still belong to the same individual even when they switch role views.</w:t>
+        <w:rPr>
+          <w:rFonts w:ascii="Arial" w:hAnsi="Arial" w:eastAsia="Arial"/>
+          <w:color w:val="10233F"/>
+          <w:sz w:val="17"/>
+        </w:rPr>
+        <w:t>Use the app on your phone on match night; it is designed for quick taps, not desktop-heavy workflows.</w:t>
+      </w:r>
+    </w:p>
+    <w:p>
+      <w:pPr>
+        <w:pStyle w:val="ListBullet"/>
+        <w:spacing w:after="40" w:line="240" w:lineRule="auto"/>
+      </w:pPr>
+      <w:r>
+        <w:rPr>
+          <w:rFonts w:ascii="Arial" w:hAnsi="Arial" w:eastAsia="Arial"/>
+          <w:color w:val="10233F"/>
+          <w:sz w:val="17"/>
+        </w:rPr>
+        <w:t>Managers should publish lineups only when final and mark the match completed only after all scores are correct.</w:t>
+      </w:r>
+    </w:p>
+    <w:p>
+      <w:pPr>
+        <w:pStyle w:val="ListBullet"/>
+        <w:spacing w:after="40" w:line="240" w:lineRule="auto"/>
+      </w:pPr>
+      <w:r>
+        <w:rPr>
+          <w:rFonts w:ascii="Arial" w:hAnsi="Arial" w:eastAsia="Arial"/>
+          <w:color w:val="10233F"/>
+          <w:sz w:val="17"/>
+        </w:rPr>
+        <w:t>Players can follow live scores and see their season information without needing manager controls.</w:t>
+      </w:r>
+    </w:p>
+    <w:p>
+      <w:pPr>
+        <w:jc w:val="center"/>
+      </w:pPr>
+      <w:r>
+        <w:rPr>
+          <w:rFonts w:ascii="Arial" w:hAnsi="Arial" w:eastAsia="Arial"/>
+          <w:b/>
+          <w:color w:val="6C5A73"/>
+          <w:sz w:val="16"/>
+        </w:rPr>
+        <w:t>Interclub Snooker</w:t>
       </w:r>
     </w:p>
     <w:sectPr>
-      <w:footerReference w:type="default" r:id="rId22"/>
-      <w:pgSz w:w="7920" w:h="12240"/>
-      <w:pgMar w:top="648" w:right="605" w:bottom="648" w:left="605" w:header="720" w:footer="720" w:gutter="0"/>
+      <w:pgSz w:w="11909" w:h="16834"/>
+      <w:pgMar w:top="605" w:right="605" w:bottom="605" w:left="605" w:header="720" w:footer="720" w:gutter="0"/>
       <w:cols w:space="720"/>
       <w:docGrid w:linePitch="360"/>
     </w:sectPr>
   </w:body>
 </w:document>
-</file>
-
-<file path=word/footer1.xml><?xml version="1.0" encoding="utf-8"?>
-<w:ftr xmlns:m="http://schemas.openxmlformats.org/officeDocument/2006/math" xmlns:mc="http://schemas.openxmlformats.org/markup-compatibility/2006" xmlns:mo="http://schemas.microsoft.com/office/mac/office/2008/main" xmlns:mv="urn:schemas-microsoft-com:mac:vml" xmlns:o="urn:schemas-microsoft-com:office:office" xmlns:r="http://schemas.openxmlformats.org/officeDocument/2006/relationships" xmlns:v="urn:schemas-microsoft-com:vml" xmlns:w10="urn:schemas-microsoft-com:office:word" xmlns:w14="http://schemas.microsoft.com/office/word/2010/wordml" xmlns:w="http://schemas.openxmlformats.org/wordprocessingml/2006/main" xmlns:wne="http://schemas.microsoft.com/office/word/2006/wordml" xmlns:wp14="http://schemas.microsoft.com/office/word/2010/wordprocessingDrawing" xmlns:wp="http://schemas.openxmlformats.org/drawingml/2006/wordprocessingDrawing" xmlns:wpc="http://schemas.microsoft.com/office/word/2010/wordprocessingCanvas" xmlns:wpg="http://schemas.microsoft.com/office/word/2010/wordprocessingGroup" xmlns:wpi="http://schemas.microsoft.com/office/word/2010/wordprocessingInk" xmlns:wps="http://schemas.microsoft.com/office/word/2010/wordprocessingShape" mc:Ignorable="w14 wp14">
-  <w:p>
-    <w:pPr>
-      <w:pStyle w:val="Footer"/>
-      <w:jc w:val="center"/>
-    </w:pPr>
-    <w:r>
-      <w:rPr>
-        <w:color w:val="6C5A73"/>
-        <w:sz w:val="16"/>
-      </w:rPr>
-      <w:t>Interclub Snooker</w:t>
-    </w:r>
-  </w:p>
-</w:ftr>
 </file>
 
 <file path=word/numbering.xml><?xml version="1.0" encoding="utf-8"?>
@@ -2296,9 +1979,8 @@
     <w:qFormat/>
     <w:rsid w:val="00FC693F"/>
     <w:rPr>
-      <w:rFonts w:ascii="Aptos" w:hAnsi="Aptos" w:eastAsia="Aptos"/>
-      <w:color w:val="10233F"/>
-      <w:sz w:val="22"/>
+      <w:rFonts w:ascii="Arial" w:hAnsi="Arial" w:eastAsia="Arial"/>
+      <w:sz w:val="18"/>
     </w:rPr>
   </w:style>
   <w:style w:type="paragraph" w:styleId="Header">
@@ -2360,11 +2042,11 @@
       <w:outlineLvl w:val="0"/>
     </w:pPr>
     <w:rPr>
-      <w:rFonts w:asciiTheme="majorHAnsi" w:eastAsiaTheme="majorEastAsia" w:hAnsiTheme="majorHAnsi" w:cstheme="majorBidi" w:ascii="Aptos" w:hAnsi="Aptos" w:eastAsia="Aptos"/>
+      <w:rFonts w:asciiTheme="majorHAnsi" w:eastAsiaTheme="majorEastAsia" w:hAnsiTheme="majorHAnsi" w:cstheme="majorBidi"/>
       <w:b/>
       <w:bCs/>
-      <w:color w:val="000000"/>
-      <w:sz w:val="32"/>
+      <w:color w:val="365F91" w:themeColor="accent1" w:themeShade="BF"/>
+      <w:sz w:val="28"/>
       <w:szCs w:val="28"/>
     </w:rPr>
   </w:style>
@@ -2384,10 +2066,10 @@
       <w:outlineLvl w:val="1"/>
     </w:pPr>
     <w:rPr>
-      <w:rFonts w:asciiTheme="majorHAnsi" w:eastAsiaTheme="majorEastAsia" w:hAnsiTheme="majorHAnsi" w:cstheme="majorBidi" w:ascii="Aptos" w:hAnsi="Aptos" w:eastAsia="Aptos"/>
+      <w:rFonts w:asciiTheme="majorHAnsi" w:eastAsiaTheme="majorEastAsia" w:hAnsiTheme="majorHAnsi" w:cstheme="majorBidi"/>
       <w:b/>
       <w:bCs/>
-      <w:color w:val="000000"/>
+      <w:color w:val="4F81BD" w:themeColor="accent1"/>
       <w:sz w:val="26"/>
       <w:szCs w:val="26"/>
     </w:rPr>
@@ -2408,10 +2090,10 @@
       <w:outlineLvl w:val="2"/>
     </w:pPr>
     <w:rPr>
-      <w:rFonts w:asciiTheme="majorHAnsi" w:eastAsiaTheme="majorEastAsia" w:hAnsiTheme="majorHAnsi" w:cstheme="majorBidi" w:ascii="Aptos" w:hAnsi="Aptos" w:eastAsia="Aptos"/>
+      <w:rFonts w:asciiTheme="majorHAnsi" w:eastAsiaTheme="majorEastAsia" w:hAnsiTheme="majorHAnsi" w:cstheme="majorBidi"/>
       <w:b/>
       <w:bCs/>
-      <w:color w:val="000000"/>
+      <w:color w:val="4F81BD" w:themeColor="accent1"/>
     </w:rPr>
   </w:style>
   <w:style w:type="paragraph" w:styleId="Heading4">
@@ -2642,16 +2324,18 @@
     <w:qFormat/>
     <w:rsid w:val="00FC693F"/>
     <w:pPr>
+      <w:pBdr>
+        <w:bottom w:val="single" w:sz="8" w:space="4" w:color="4F81BD" w:themeColor="accent1"/>
+      </w:pBdr>
       <w:spacing w:after="300" w:line="240" w:lineRule="auto"/>
       <w:contextualSpacing/>
     </w:pPr>
     <w:rPr>
-      <w:rFonts w:asciiTheme="majorHAnsi" w:eastAsiaTheme="majorEastAsia" w:hAnsiTheme="majorHAnsi" w:cstheme="majorBidi" w:ascii="Aptos Display" w:hAnsi="Aptos Display" w:eastAsia="Aptos Display"/>
-      <w:b/>
-      <w:color w:val="000000"/>
+      <w:rFonts w:asciiTheme="majorHAnsi" w:eastAsiaTheme="majorEastAsia" w:hAnsiTheme="majorHAnsi" w:cstheme="majorBidi"/>
+      <w:color w:val="17365D" w:themeColor="text2" w:themeShade="BF"/>
       <w:spacing w:val="5"/>
       <w:kern w:val="28"/>
-      <w:sz w:val="44"/>
+      <w:sz w:val="52"/>
       <w:szCs w:val="52"/>
     </w:rPr>
   </w:style>
@@ -2828,7 +2512,8 @@
       <w:contextualSpacing/>
     </w:pPr>
     <w:rPr>
-      <w:sz w:val="21"/>
+      <w:rFonts w:ascii="Arial" w:hAnsi="Arial" w:eastAsia="Arial"/>
+      <w:sz w:val="17"/>
     </w:rPr>
   </w:style>
   <w:style w:type="paragraph" w:styleId="ListBullet2">
@@ -2869,9 +2554,6 @@
       </w:numPr>
       <w:contextualSpacing/>
     </w:pPr>
-    <w:rPr>
-      <w:sz w:val="21"/>
-    </w:rPr>
   </w:style>
   <w:style w:type="paragraph" w:styleId="ListNumber2">
     <w:name w:val="List Number 2"/>

</xml_diff>

<commit_message>
Redo mobile pointers guide
</commit_message>
<xml_diff>
--- a/docs/Pointers on Using the Interclub Snooker App (Mobile Friendly).docx
+++ b/docs/Pointers on Using the Interclub Snooker App (Mobile Friendly).docx
@@ -2,1612 +2,1200 @@
 <file path=word/document.xml><?xml version="1.0" encoding="utf-8"?>
 <w:document xmlns:wpc="http://schemas.microsoft.com/office/word/2010/wordprocessingCanvas" xmlns:mo="http://schemas.microsoft.com/office/mac/office/2008/main" xmlns:mc="http://schemas.openxmlformats.org/markup-compatibility/2006" xmlns:mv="urn:schemas-microsoft-com:mac:vml" xmlns:o="urn:schemas-microsoft-com:office:office" xmlns:r="http://schemas.openxmlformats.org/officeDocument/2006/relationships" xmlns:m="http://schemas.openxmlformats.org/officeDocument/2006/math" xmlns:v="urn:schemas-microsoft-com:vml" xmlns:wp14="http://schemas.microsoft.com/office/word/2010/wordprocessingDrawing" xmlns:wp="http://schemas.openxmlformats.org/drawingml/2006/wordprocessingDrawing" xmlns:w10="urn:schemas-microsoft-com:office:word" xmlns:w="http://schemas.openxmlformats.org/wordprocessingml/2006/main" xmlns:w14="http://schemas.microsoft.com/office/word/2010/wordml" xmlns:wpg="http://schemas.microsoft.com/office/word/2010/wordprocessingGroup" xmlns:wpi="http://schemas.microsoft.com/office/word/2010/wordprocessingInk" xmlns:wne="http://schemas.microsoft.com/office/word/2006/wordml" xmlns:wps="http://schemas.microsoft.com/office/word/2010/wordprocessingShape" mc:Ignorable="w14 wp14">
   <w:body>
-    <w:tbl>
-      <w:tblPr>
-        <w:tblW w:type="auto" w:w="0"/>
-        <w:jc w:val="center"/>
-        <w:tblLook w:firstColumn="1" w:firstRow="1" w:lastColumn="0" w:lastRow="0" w:noHBand="0" w:noVBand="1" w:val="04A0"/>
-      </w:tblPr>
-      <w:tblGrid>
-        <w:gridCol w:w="10699"/>
-      </w:tblGrid>
-      <w:tr>
-        <w:tc>
-          <w:tcPr>
-            <w:tcW w:type="dxa" w:w="10699"/>
-            <w:shd w:fill="10233F"/>
-            <w:tcBorders>
-              <w:top w:val="single" w:sz="8" w:space="0" w:color="10233F"/>
-              <w:left w:val="single" w:sz="8" w:space="0" w:color="10233F"/>
-              <w:bottom w:val="single" w:sz="8" w:space="0" w:color="10233F"/>
-              <w:right w:val="single" w:sz="8" w:space="0" w:color="10233F"/>
-            </w:tcBorders>
-          </w:tcPr>
-          <w:p>
-            <w:pPr>
-              <w:spacing w:after="0" w:before="200"/>
-            </w:pPr>
-            <w:r>
-              <w:rPr>
-                <w:rFonts w:ascii="Arial" w:hAnsi="Arial" w:eastAsia="Arial"/>
-                <w:b/>
-                <w:color w:val="FFFFFF"/>
-                <w:sz w:val="20"/>
-              </w:rPr>
-              <w:t>INTERCLUB SNOOKER</w:t>
-            </w:r>
-          </w:p>
-          <w:p>
-            <w:pPr>
-              <w:spacing w:after="40"/>
-            </w:pPr>
-            <w:r>
-              <w:rPr>
-                <w:rFonts w:ascii="Arial" w:hAnsi="Arial" w:eastAsia="Arial"/>
-                <w:b/>
-                <w:color w:val="FFFFFF"/>
-                <w:sz w:val="44"/>
-              </w:rPr>
-              <w:t>Pointers on Using the App</w:t>
-            </w:r>
-          </w:p>
-          <w:p>
-            <w:pPr>
-              <w:spacing w:after="200"/>
-            </w:pPr>
-            <w:r>
-              <w:rPr>
-                <w:rFonts w:ascii="Arial" w:hAnsi="Arial" w:eastAsia="Arial"/>
-                <w:color w:val="D7DEE9"/>
-                <w:sz w:val="20"/>
-              </w:rPr>
-              <w:t>Mobile friendly guide for players and managers</w:t>
-            </w:r>
-          </w:p>
-        </w:tc>
-      </w:tr>
-    </w:tbl>
     <w:p>
       <w:pPr>
-        <w:spacing w:before="160" w:after="60" w:line="252" w:lineRule="auto"/>
+        <w:pStyle w:val="Title"/>
+        <w:jc w:val="center"/>
+      </w:pPr>
+      <w:r>
+        <w:t>Pointers on Using the Interclub Snooker App Mobile Friendly</w:t>
+      </w:r>
+    </w:p>
+    <w:p>
+      <w:pPr>
+        <w:spacing w:before="0" w:after="200" w:line="259" w:lineRule="auto"/>
+        <w:jc w:val="center"/>
+      </w:pPr>
+      <w:r>
+        <w:rPr>
+          <w:rFonts w:ascii="Arial" w:hAnsi="Arial" w:eastAsia="Arial"/>
+          <w:b w:val="0"/>
+          <w:color w:val="4B5A6D"/>
+          <w:sz w:val="24"/>
+        </w:rPr>
+        <w:t>A practical phone guide for players and managers</w:t>
+      </w:r>
+    </w:p>
+    <w:p>
+      <w:pPr>
+        <w:spacing w:before="0" w:after="160" w:line="259" w:lineRule="auto"/>
+      </w:pPr>
+      <w:r>
+        <w:rPr>
+          <w:rFonts w:ascii="Arial" w:hAnsi="Arial" w:eastAsia="Arial"/>
+          <w:b w:val="0"/>
+          <w:color w:val="10233F"/>
+          <w:sz w:val="23"/>
+        </w:rPr>
+        <w:t>This guide is for normal app use, not administration. It explains how to sign in, understand the home page, follow fixtures, view tables, pick a team, enter match results, record breaks, and use club features.</w:t>
+      </w:r>
+    </w:p>
+    <w:p>
+      <w:pPr>
+        <w:spacing w:before="0" w:after="80" w:line="259" w:lineRule="auto"/>
       </w:pPr>
       <w:r>
         <w:rPr>
           <w:rFonts w:ascii="Arial" w:hAnsi="Arial" w:eastAsia="Arial"/>
           <w:b/>
-          <w:color w:val="10233F"/>
-          <w:sz w:val="24"/>
+          <w:color w:val="000000"/>
+          <w:sz w:val="28"/>
         </w:rPr>
-        <w:t>Quick version</w:t>
+        <w:t>Current app rules</w:t>
       </w:r>
     </w:p>
     <w:p>
       <w:pPr>
         <w:pStyle w:val="ListBullet"/>
-        <w:spacing w:after="40" w:line="240" w:lineRule="auto"/>
+        <w:spacing w:after="60" w:line="252" w:lineRule="auto"/>
       </w:pPr>
       <w:r>
         <w:rPr>
           <w:rFonts w:ascii="Arial" w:hAnsi="Arial" w:eastAsia="Arial"/>
+          <w:b w:val="0"/>
           <w:color w:val="10233F"/>
-          <w:sz w:val="17"/>
+          <w:sz w:val="22"/>
         </w:rPr>
-        <w:t>Players use the app to see their own stats, league table, fixtures/results, club information and competitions.</w:t>
+        <w:t>There is no season picker in the main app. The app uses the current season automatically.</w:t>
       </w:r>
     </w:p>
     <w:p>
       <w:pPr>
         <w:pStyle w:val="ListBullet"/>
-        <w:spacing w:after="40" w:line="240" w:lineRule="auto"/>
+        <w:spacing w:after="60" w:line="252" w:lineRule="auto"/>
       </w:pPr>
       <w:r>
         <w:rPr>
           <w:rFonts w:ascii="Arial" w:hAnsi="Arial" w:eastAsia="Arial"/>
+          <w:b w:val="0"/>
           <w:color w:val="10233F"/>
-          <w:sz w:val="17"/>
+          <w:sz w:val="22"/>
         </w:rPr>
-        <w:t>Managers get team controls for their own matches: pick the team, publish the team sheet, enter scores and record breaks.</w:t>
+        <w:t>Most people have one role and will not see a role switcher. People with multiple roles can switch role at the top.</w:t>
       </w:r>
     </w:p>
     <w:p>
       <w:pPr>
         <w:pStyle w:val="ListBullet"/>
-        <w:spacing w:after="40" w:line="240" w:lineRule="auto"/>
+        <w:spacing w:after="60" w:line="252" w:lineRule="auto"/>
       </w:pPr>
       <w:r>
         <w:rPr>
           <w:rFonts w:ascii="Arial" w:hAnsi="Arial" w:eastAsia="Arial"/>
+          <w:b w:val="0"/>
           <w:color w:val="10233F"/>
-          <w:sz w:val="17"/>
+          <w:sz w:val="22"/>
         </w:rPr>
-        <w:t>The season picker is no longer shown in the main app. Your current role and team drive what you see.</w:t>
+        <w:t>Players can follow live or published match details. Managers can edit only matches involving the team they manage.</w:t>
       </w:r>
     </w:p>
-    <w:tbl>
-      <w:tblPr>
-        <w:tblW w:type="auto" w:w="0"/>
-        <w:jc w:val="center"/>
-        <w:tblLayout w:type="fixed"/>
-        <w:tblLook w:firstColumn="1" w:firstRow="1" w:lastColumn="0" w:lastRow="0" w:noHBand="0" w:noVBand="1" w:val="04A0"/>
-      </w:tblPr>
-      <w:tblGrid>
-        <w:gridCol w:w="5616"/>
-        <w:gridCol w:w="3528"/>
-      </w:tblGrid>
-      <w:tr>
-        <w:tc>
-          <w:tcPr>
-            <w:tcW w:type="dxa" w:w="5349"/>
-            <w:vAlign w:val="top"/>
-            <w:tcBorders>
-              <w:top w:val="single" w:sz="8" w:space="0" w:color="E6E0EB"/>
-              <w:left w:val="single" w:sz="8" w:space="0" w:color="E6E0EB"/>
-              <w:bottom w:val="single" w:sz="8" w:space="0" w:color="E6E0EB"/>
-              <w:right w:val="single" w:sz="8" w:space="0" w:color="E6E0EB"/>
-            </w:tcBorders>
-            <w:shd w:fill="FFFFFF"/>
-          </w:tcPr>
-          <w:p>
-            <w:pPr>
-              <w:spacing w:after="80"/>
-            </w:pPr>
-            <w:r>
-              <w:rPr>
-                <w:rFonts w:ascii="Arial" w:hAnsi="Arial" w:eastAsia="Arial"/>
-                <w:b/>
-                <w:color w:val="25002B"/>
-                <w:sz w:val="21"/>
-              </w:rPr>
-              <w:t>SIGN IN</w:t>
-            </w:r>
-          </w:p>
-          <w:p>
-            <w:pPr>
-              <w:pStyle w:val="ListBullet"/>
-              <w:spacing w:after="40" w:line="240" w:lineRule="auto"/>
-            </w:pPr>
-            <w:r>
-              <w:rPr>
-                <w:rFonts w:ascii="Arial" w:hAnsi="Arial" w:eastAsia="Arial"/>
-                <w:color w:val="10233F"/>
-                <w:sz w:val="17"/>
-              </w:rPr>
-              <w:t>Use the email/password created through your invite, or use Google if that email matches your account.</w:t>
-            </w:r>
-          </w:p>
-          <w:p>
-            <w:pPr>
-              <w:pStyle w:val="ListBullet"/>
-              <w:spacing w:after="40" w:line="240" w:lineRule="auto"/>
-            </w:pPr>
-            <w:r>
-              <w:rPr>
-                <w:rFonts w:ascii="Arial" w:hAnsi="Arial" w:eastAsia="Arial"/>
-                <w:color w:val="10233F"/>
-                <w:sz w:val="17"/>
-              </w:rPr>
-              <w:t>New users should start from the invite link sent by the club or league administrator.</w:t>
-            </w:r>
-          </w:p>
-          <w:p>
-            <w:pPr>
-              <w:pStyle w:val="ListBullet"/>
-              <w:spacing w:after="40" w:line="240" w:lineRule="auto"/>
-            </w:pPr>
-            <w:r>
-              <w:rPr>
-                <w:rFonts w:ascii="Arial" w:hAnsi="Arial" w:eastAsia="Arial"/>
-                <w:color w:val="10233F"/>
-                <w:sz w:val="17"/>
-              </w:rPr>
-              <w:t>Once you are signed in, the app opens around your role and team.</w:t>
-            </w:r>
-          </w:p>
-        </w:tc>
-        <w:tc>
-          <w:tcPr>
-            <w:tcW w:type="dxa" w:w="5349"/>
-            <w:vAlign w:val="top"/>
-            <w:tcBorders>
-              <w:top w:val="single" w:sz="8" w:space="0" w:color="E6E0EB"/>
-              <w:left w:val="single" w:sz="8" w:space="0" w:color="E6E0EB"/>
-              <w:bottom w:val="single" w:sz="8" w:space="0" w:color="E6E0EB"/>
-              <w:right w:val="single" w:sz="8" w:space="0" w:color="E6E0EB"/>
-            </w:tcBorders>
-            <w:shd w:fill="FFFFFF"/>
-          </w:tcPr>
-          <w:p>
-            <w:pPr>
-              <w:spacing w:after="0"/>
-              <w:jc w:val="center"/>
-            </w:pPr>
-            <w:r>
-              <w:drawing>
-                <wp:inline xmlns:a="http://schemas.openxmlformats.org/drawingml/2006/main" xmlns:pic="http://schemas.openxmlformats.org/drawingml/2006/picture">
-                  <wp:extent cx="1783080" cy="3593592"/>
-                  <wp:docPr id="1" name="Picture 1"/>
-                  <wp:cNvGraphicFramePr>
-                    <a:graphicFrameLocks noChangeAspect="1"/>
-                  </wp:cNvGraphicFramePr>
-                  <a:graphic>
-                    <a:graphicData uri="http://schemas.openxmlformats.org/drawingml/2006/picture">
-                      <pic:pic>
-                        <pic:nvPicPr>
-                          <pic:cNvPr id="0" name="01-login.png"/>
-                          <pic:cNvPicPr/>
-                        </pic:nvPicPr>
-                        <pic:blipFill>
-                          <a:blip r:embed="rId9"/>
-                          <a:stretch>
-                            <a:fillRect/>
-                          </a:stretch>
-                        </pic:blipFill>
-                        <pic:spPr>
-                          <a:xfrm>
-                            <a:off x="0" y="0"/>
-                            <a:ext cx="1783080" cy="3593592"/>
-                          </a:xfrm>
-                          <a:prstGeom prst="rect"/>
-                        </pic:spPr>
-                      </pic:pic>
-                    </a:graphicData>
-                  </a:graphic>
-                </wp:inline>
-              </w:drawing>
-            </w:r>
-          </w:p>
-        </w:tc>
-      </w:tr>
-    </w:tbl>
     <w:p>
       <w:pPr>
-        <w:spacing w:after="40"/>
-      </w:pPr>
-    </w:p>
-    <w:tbl>
-      <w:tblPr>
-        <w:tblW w:type="auto" w:w="0"/>
-        <w:jc w:val="center"/>
-        <w:tblLayout w:type="fixed"/>
-        <w:tblLook w:firstColumn="1" w:firstRow="1" w:lastColumn="0" w:lastRow="0" w:noHBand="0" w:noVBand="1" w:val="04A0"/>
-      </w:tblPr>
-      <w:tblGrid>
-        <w:gridCol w:w="5616"/>
-        <w:gridCol w:w="3528"/>
-      </w:tblGrid>
-      <w:tr>
-        <w:tc>
-          <w:tcPr>
-            <w:tcW w:type="dxa" w:w="5349"/>
-            <w:vAlign w:val="top"/>
-            <w:tcBorders>
-              <w:top w:val="single" w:sz="8" w:space="0" w:color="E6E0EB"/>
-              <w:left w:val="single" w:sz="8" w:space="0" w:color="E6E0EB"/>
-              <w:bottom w:val="single" w:sz="8" w:space="0" w:color="E6E0EB"/>
-              <w:right w:val="single" w:sz="8" w:space="0" w:color="E6E0EB"/>
-            </w:tcBorders>
-            <w:shd w:fill="FFFFFF"/>
-          </w:tcPr>
-          <w:p>
-            <w:pPr>
-              <w:spacing w:after="80"/>
-            </w:pPr>
-            <w:r>
-              <w:rPr>
-                <w:rFonts w:ascii="Arial" w:hAnsi="Arial" w:eastAsia="Arial"/>
-                <w:b/>
-                <w:color w:val="25002B"/>
-                <w:sz w:val="21"/>
-              </w:rPr>
-              <w:t>PLAYER HOME</w:t>
-            </w:r>
-          </w:p>
-          <w:p>
-            <w:pPr>
-              <w:pStyle w:val="ListBullet"/>
-              <w:spacing w:after="40" w:line="240" w:lineRule="auto"/>
-            </w:pPr>
-            <w:r>
-              <w:rPr>
-                <w:rFonts w:ascii="Arial" w:hAnsi="Arial" w:eastAsia="Arial"/>
-                <w:color w:val="10233F"/>
-                <w:sz w:val="17"/>
-              </w:rPr>
-              <w:t>The home screen is deliberately compact: your team, player summary, current form and the week fixtures are close to the top.</w:t>
-            </w:r>
-          </w:p>
-          <w:p>
-            <w:pPr>
-              <w:pStyle w:val="ListBullet"/>
-              <w:spacing w:after="40" w:line="240" w:lineRule="auto"/>
-            </w:pPr>
-            <w:r>
-              <w:rPr>
-                <w:rFonts w:ascii="Arial" w:hAnsi="Arial" w:eastAsia="Arial"/>
-                <w:color w:val="10233F"/>
-                <w:sz w:val="17"/>
-              </w:rPr>
-              <w:t>There is no season selector to manage. The app uses the active season automatically.</w:t>
-            </w:r>
-          </w:p>
-          <w:p>
-            <w:pPr>
-              <w:pStyle w:val="ListBullet"/>
-              <w:spacing w:after="40" w:line="240" w:lineRule="auto"/>
-            </w:pPr>
-            <w:r>
-              <w:rPr>
-                <w:rFonts w:ascii="Arial" w:hAnsi="Arial" w:eastAsia="Arial"/>
-                <w:color w:val="10233F"/>
-                <w:sz w:val="17"/>
-              </w:rPr>
-              <w:t>Use the bottom tabs to move between Home, Fixtures, Tables and My Club.</w:t>
-            </w:r>
-          </w:p>
-        </w:tc>
-        <w:tc>
-          <w:tcPr>
-            <w:tcW w:type="dxa" w:w="5349"/>
-            <w:vAlign w:val="top"/>
-            <w:tcBorders>
-              <w:top w:val="single" w:sz="8" w:space="0" w:color="E6E0EB"/>
-              <w:left w:val="single" w:sz="8" w:space="0" w:color="E6E0EB"/>
-              <w:bottom w:val="single" w:sz="8" w:space="0" w:color="E6E0EB"/>
-              <w:right w:val="single" w:sz="8" w:space="0" w:color="E6E0EB"/>
-            </w:tcBorders>
-            <w:shd w:fill="FFFFFF"/>
-          </w:tcPr>
-          <w:p>
-            <w:pPr>
-              <w:spacing w:after="0"/>
-              <w:jc w:val="center"/>
-            </w:pPr>
-            <w:r>
-              <w:drawing>
-                <wp:inline xmlns:a="http://schemas.openxmlformats.org/drawingml/2006/main" xmlns:pic="http://schemas.openxmlformats.org/drawingml/2006/picture">
-                  <wp:extent cx="1783080" cy="3593592"/>
-                  <wp:docPr id="2" name="Picture 2"/>
-                  <wp:cNvGraphicFramePr>
-                    <a:graphicFrameLocks noChangeAspect="1"/>
-                  </wp:cNvGraphicFramePr>
-                  <a:graphic>
-                    <a:graphicData uri="http://schemas.openxmlformats.org/drawingml/2006/picture">
-                      <pic:pic>
-                        <pic:nvPicPr>
-                          <pic:cNvPr id="0" name="02-player-home.png"/>
-                          <pic:cNvPicPr/>
-                        </pic:nvPicPr>
-                        <pic:blipFill>
-                          <a:blip r:embed="rId10"/>
-                          <a:stretch>
-                            <a:fillRect/>
-                          </a:stretch>
-                        </pic:blipFill>
-                        <pic:spPr>
-                          <a:xfrm>
-                            <a:off x="0" y="0"/>
-                            <a:ext cx="1783080" cy="3593592"/>
-                          </a:xfrm>
-                          <a:prstGeom prst="rect"/>
-                        </pic:spPr>
-                      </pic:pic>
-                    </a:graphicData>
-                  </a:graphic>
-                </wp:inline>
-              </w:drawing>
-            </w:r>
-          </w:p>
-        </w:tc>
-      </w:tr>
-    </w:tbl>
-    <w:p>
-      <w:pPr>
-        <w:spacing w:after="40"/>
-      </w:pPr>
-    </w:p>
-    <w:tbl>
-      <w:tblPr>
-        <w:tblW w:type="auto" w:w="0"/>
-        <w:jc w:val="center"/>
-        <w:tblLayout w:type="fixed"/>
-        <w:tblLook w:firstColumn="1" w:firstRow="1" w:lastColumn="0" w:lastRow="0" w:noHBand="0" w:noVBand="1" w:val="04A0"/>
-      </w:tblPr>
-      <w:tblGrid>
-        <w:gridCol w:w="5616"/>
-        <w:gridCol w:w="3528"/>
-      </w:tblGrid>
-      <w:tr>
-        <w:tc>
-          <w:tcPr>
-            <w:tcW w:type="dxa" w:w="5349"/>
-            <w:vAlign w:val="top"/>
-            <w:tcBorders>
-              <w:top w:val="single" w:sz="8" w:space="0" w:color="E6E0EB"/>
-              <w:left w:val="single" w:sz="8" w:space="0" w:color="E6E0EB"/>
-              <w:bottom w:val="single" w:sz="8" w:space="0" w:color="E6E0EB"/>
-              <w:right w:val="single" w:sz="8" w:space="0" w:color="E6E0EB"/>
-            </w:tcBorders>
-            <w:shd w:fill="FFFFFF"/>
-          </w:tcPr>
-          <w:p>
-            <w:pPr>
-              <w:spacing w:after="80"/>
-            </w:pPr>
-            <w:r>
-              <w:rPr>
-                <w:rFonts w:ascii="Arial" w:hAnsi="Arial" w:eastAsia="Arial"/>
-                <w:b/>
-                <w:color w:val="25002B"/>
-                <w:sz w:val="21"/>
-              </w:rPr>
-              <w:t>FIXTURES AND RESULTS</w:t>
-            </w:r>
-          </w:p>
-          <w:p>
-            <w:pPr>
-              <w:pStyle w:val="ListBullet"/>
-              <w:spacing w:after="40" w:line="240" w:lineRule="auto"/>
-            </w:pPr>
-            <w:r>
-              <w:rPr>
-                <w:rFonts w:ascii="Arial" w:hAnsi="Arial" w:eastAsia="Arial"/>
-                <w:color w:val="10233F"/>
-                <w:sz w:val="17"/>
-              </w:rPr>
-              <w:t>Fixtures are grouped by week so all matches in the round sit together.</w:t>
-            </w:r>
-          </w:p>
-          <w:p>
-            <w:pPr>
-              <w:pStyle w:val="ListBullet"/>
-              <w:spacing w:after="40" w:line="240" w:lineRule="auto"/>
-            </w:pPr>
-            <w:r>
-              <w:rPr>
-                <w:rFonts w:ascii="Arial" w:hAnsi="Arial" w:eastAsia="Arial"/>
-                <w:color w:val="10233F"/>
-                <w:sz w:val="17"/>
-              </w:rPr>
-              <w:t>The carousel defaults to the relevant current week, with arrows for past and future rounds.</w:t>
-            </w:r>
-          </w:p>
-          <w:p>
-            <w:pPr>
-              <w:pStyle w:val="ListBullet"/>
-              <w:spacing w:after="40" w:line="240" w:lineRule="auto"/>
-            </w:pPr>
-            <w:r>
-              <w:rPr>
-                <w:rFonts w:ascii="Arial" w:hAnsi="Arial" w:eastAsia="Arial"/>
-                <w:color w:val="10233F"/>
-                <w:sz w:val="17"/>
-              </w:rPr>
-              <w:t>Players can view match details when a match is live or published, but cannot edit scores.</w:t>
-            </w:r>
-          </w:p>
-        </w:tc>
-        <w:tc>
-          <w:tcPr>
-            <w:tcW w:type="dxa" w:w="5349"/>
-            <w:vAlign w:val="top"/>
-            <w:tcBorders>
-              <w:top w:val="single" w:sz="8" w:space="0" w:color="E6E0EB"/>
-              <w:left w:val="single" w:sz="8" w:space="0" w:color="E6E0EB"/>
-              <w:bottom w:val="single" w:sz="8" w:space="0" w:color="E6E0EB"/>
-              <w:right w:val="single" w:sz="8" w:space="0" w:color="E6E0EB"/>
-            </w:tcBorders>
-            <w:shd w:fill="FFFFFF"/>
-          </w:tcPr>
-          <w:p>
-            <w:pPr>
-              <w:spacing w:after="0"/>
-              <w:jc w:val="center"/>
-            </w:pPr>
-            <w:r>
-              <w:drawing>
-                <wp:inline xmlns:a="http://schemas.openxmlformats.org/drawingml/2006/main" xmlns:pic="http://schemas.openxmlformats.org/drawingml/2006/picture">
-                  <wp:extent cx="1783080" cy="3593592"/>
-                  <wp:docPr id="3" name="Picture 3"/>
-                  <wp:cNvGraphicFramePr>
-                    <a:graphicFrameLocks noChangeAspect="1"/>
-                  </wp:cNvGraphicFramePr>
-                  <a:graphic>
-                    <a:graphicData uri="http://schemas.openxmlformats.org/drawingml/2006/picture">
-                      <pic:pic>
-                        <pic:nvPicPr>
-                          <pic:cNvPr id="0" name="03-player-fixtures.png"/>
-                          <pic:cNvPicPr/>
-                        </pic:nvPicPr>
-                        <pic:blipFill>
-                          <a:blip r:embed="rId11"/>
-                          <a:stretch>
-                            <a:fillRect/>
-                          </a:stretch>
-                        </pic:blipFill>
-                        <pic:spPr>
-                          <a:xfrm>
-                            <a:off x="0" y="0"/>
-                            <a:ext cx="1783080" cy="3593592"/>
-                          </a:xfrm>
-                          <a:prstGeom prst="rect"/>
-                        </pic:spPr>
-                      </pic:pic>
-                    </a:graphicData>
-                  </a:graphic>
-                </wp:inline>
-              </w:drawing>
-            </w:r>
-          </w:p>
-        </w:tc>
-      </w:tr>
-    </w:tbl>
-    <w:p>
-      <w:pPr>
-        <w:spacing w:after="40"/>
-      </w:pPr>
-    </w:p>
-    <w:tbl>
-      <w:tblPr>
-        <w:tblW w:type="auto" w:w="0"/>
-        <w:jc w:val="center"/>
-        <w:tblLayout w:type="fixed"/>
-        <w:tblLook w:firstColumn="1" w:firstRow="1" w:lastColumn="0" w:lastRow="0" w:noHBand="0" w:noVBand="1" w:val="04A0"/>
-      </w:tblPr>
-      <w:tblGrid>
-        <w:gridCol w:w="5616"/>
-        <w:gridCol w:w="3528"/>
-      </w:tblGrid>
-      <w:tr>
-        <w:tc>
-          <w:tcPr>
-            <w:tcW w:type="dxa" w:w="5349"/>
-            <w:vAlign w:val="top"/>
-            <w:tcBorders>
-              <w:top w:val="single" w:sz="8" w:space="0" w:color="E6E0EB"/>
-              <w:left w:val="single" w:sz="8" w:space="0" w:color="E6E0EB"/>
-              <w:bottom w:val="single" w:sz="8" w:space="0" w:color="E6E0EB"/>
-              <w:right w:val="single" w:sz="8" w:space="0" w:color="E6E0EB"/>
-            </w:tcBorders>
-            <w:shd w:fill="FFFFFF"/>
-          </w:tcPr>
-          <w:p>
-            <w:pPr>
-              <w:spacing w:after="80"/>
-            </w:pPr>
-            <w:r>
-              <w:rPr>
-                <w:rFonts w:ascii="Arial" w:hAnsi="Arial" w:eastAsia="Arial"/>
-                <w:b/>
-                <w:color w:val="25002B"/>
-                <w:sz w:val="21"/>
-              </w:rPr>
-              <w:t>MANAGER HOME</w:t>
-            </w:r>
-          </w:p>
-          <w:p>
-            <w:pPr>
-              <w:pStyle w:val="ListBullet"/>
-              <w:spacing w:after="40" w:line="240" w:lineRule="auto"/>
-            </w:pPr>
-            <w:r>
-              <w:rPr>
-                <w:rFonts w:ascii="Arial" w:hAnsi="Arial" w:eastAsia="Arial"/>
-                <w:color w:val="10233F"/>
-                <w:sz w:val="17"/>
-              </w:rPr>
-              <w:t>Managers see team performance first: league position, team form, upcoming fixtures and player stats.</w:t>
-            </w:r>
-          </w:p>
-          <w:p>
-            <w:pPr>
-              <w:pStyle w:val="ListBullet"/>
-              <w:spacing w:after="40" w:line="240" w:lineRule="auto"/>
-            </w:pPr>
-            <w:r>
-              <w:rPr>
-                <w:rFonts w:ascii="Arial" w:hAnsi="Arial" w:eastAsia="Arial"/>
-                <w:color w:val="10233F"/>
-                <w:sz w:val="17"/>
-              </w:rPr>
-              <w:t>The manager view is scoped to the selected team only.</w:t>
-            </w:r>
-          </w:p>
-          <w:p>
-            <w:pPr>
-              <w:pStyle w:val="ListBullet"/>
-              <w:spacing w:after="40" w:line="240" w:lineRule="auto"/>
-            </w:pPr>
-            <w:r>
-              <w:rPr>
-                <w:rFonts w:ascii="Arial" w:hAnsi="Arial" w:eastAsia="Arial"/>
-                <w:color w:val="10233F"/>
-                <w:sz w:val="17"/>
-              </w:rPr>
-              <w:t>If someone has more than one role, they can switch role from the top context selector.</w:t>
-            </w:r>
-          </w:p>
-        </w:tc>
-        <w:tc>
-          <w:tcPr>
-            <w:tcW w:type="dxa" w:w="5349"/>
-            <w:vAlign w:val="top"/>
-            <w:tcBorders>
-              <w:top w:val="single" w:sz="8" w:space="0" w:color="E6E0EB"/>
-              <w:left w:val="single" w:sz="8" w:space="0" w:color="E6E0EB"/>
-              <w:bottom w:val="single" w:sz="8" w:space="0" w:color="E6E0EB"/>
-              <w:right w:val="single" w:sz="8" w:space="0" w:color="E6E0EB"/>
-            </w:tcBorders>
-            <w:shd w:fill="FFFFFF"/>
-          </w:tcPr>
-          <w:p>
-            <w:pPr>
-              <w:spacing w:after="0"/>
-              <w:jc w:val="center"/>
-            </w:pPr>
-            <w:r>
-              <w:drawing>
-                <wp:inline xmlns:a="http://schemas.openxmlformats.org/drawingml/2006/main" xmlns:pic="http://schemas.openxmlformats.org/drawingml/2006/picture">
-                  <wp:extent cx="1783080" cy="3593592"/>
-                  <wp:docPr id="4" name="Picture 4"/>
-                  <wp:cNvGraphicFramePr>
-                    <a:graphicFrameLocks noChangeAspect="1"/>
-                  </wp:cNvGraphicFramePr>
-                  <a:graphic>
-                    <a:graphicData uri="http://schemas.openxmlformats.org/drawingml/2006/picture">
-                      <pic:pic>
-                        <pic:nvPicPr>
-                          <pic:cNvPr id="0" name="04-manager-home.png"/>
-                          <pic:cNvPicPr/>
-                        </pic:nvPicPr>
-                        <pic:blipFill>
-                          <a:blip r:embed="rId12"/>
-                          <a:stretch>
-                            <a:fillRect/>
-                          </a:stretch>
-                        </pic:blipFill>
-                        <pic:spPr>
-                          <a:xfrm>
-                            <a:off x="0" y="0"/>
-                            <a:ext cx="1783080" cy="3593592"/>
-                          </a:xfrm>
-                          <a:prstGeom prst="rect"/>
-                        </pic:spPr>
-                      </pic:pic>
-                    </a:graphicData>
-                  </a:graphic>
-                </wp:inline>
-              </w:drawing>
-            </w:r>
-          </w:p>
-        </w:tc>
-      </w:tr>
-    </w:tbl>
-    <w:p>
-      <w:pPr>
-        <w:spacing w:after="40"/>
-      </w:pPr>
-    </w:p>
-    <w:tbl>
-      <w:tblPr>
-        <w:tblW w:type="auto" w:w="0"/>
-        <w:jc w:val="center"/>
-        <w:tblLayout w:type="fixed"/>
-        <w:tblLook w:firstColumn="1" w:firstRow="1" w:lastColumn="0" w:lastRow="0" w:noHBand="0" w:noVBand="1" w:val="04A0"/>
-      </w:tblPr>
-      <w:tblGrid>
-        <w:gridCol w:w="5616"/>
-        <w:gridCol w:w="3528"/>
-      </w:tblGrid>
-      <w:tr>
-        <w:tc>
-          <w:tcPr>
-            <w:tcW w:type="dxa" w:w="5349"/>
-            <w:vAlign w:val="top"/>
-            <w:tcBorders>
-              <w:top w:val="single" w:sz="8" w:space="0" w:color="E6E0EB"/>
-              <w:left w:val="single" w:sz="8" w:space="0" w:color="E6E0EB"/>
-              <w:bottom w:val="single" w:sz="8" w:space="0" w:color="E6E0EB"/>
-              <w:right w:val="single" w:sz="8" w:space="0" w:color="E6E0EB"/>
-            </w:tcBorders>
-            <w:shd w:fill="FFFFFF"/>
-          </w:tcPr>
-          <w:p>
-            <w:pPr>
-              <w:spacing w:after="80"/>
-            </w:pPr>
-            <w:r>
-              <w:rPr>
-                <w:rFonts w:ascii="Arial" w:hAnsi="Arial" w:eastAsia="Arial"/>
-                <w:b/>
-                <w:color w:val="25002B"/>
-                <w:sz w:val="21"/>
-              </w:rPr>
-              <w:t>NEXT MATCHES</w:t>
-            </w:r>
-          </w:p>
-          <w:p>
-            <w:pPr>
-              <w:pStyle w:val="ListBullet"/>
-              <w:spacing w:after="40" w:line="240" w:lineRule="auto"/>
-            </w:pPr>
-            <w:r>
-              <w:rPr>
-                <w:rFonts w:ascii="Arial" w:hAnsi="Arial" w:eastAsia="Arial"/>
-                <w:color w:val="10233F"/>
-                <w:sz w:val="17"/>
-              </w:rPr>
-              <w:t>The manager opens their own match from Next matches.</w:t>
-            </w:r>
-          </w:p>
-          <w:p>
-            <w:pPr>
-              <w:pStyle w:val="ListBullet"/>
-              <w:spacing w:after="40" w:line="240" w:lineRule="auto"/>
-            </w:pPr>
-            <w:r>
-              <w:rPr>
-                <w:rFonts w:ascii="Arial" w:hAnsi="Arial" w:eastAsia="Arial"/>
-                <w:color w:val="10233F"/>
-                <w:sz w:val="17"/>
-              </w:rPr>
-              <w:t>Other matches in the week can be viewed as scores come in, but only the manager’s own team match can be edited.</w:t>
-            </w:r>
-          </w:p>
-          <w:p>
-            <w:pPr>
-              <w:pStyle w:val="ListBullet"/>
-              <w:spacing w:after="40" w:line="240" w:lineRule="auto"/>
-            </w:pPr>
-            <w:r>
-              <w:rPr>
-                <w:rFonts w:ascii="Arial" w:hAnsi="Arial" w:eastAsia="Arial"/>
-                <w:color w:val="10233F"/>
-                <w:sz w:val="17"/>
-              </w:rPr>
-              <w:t>Once a match is completed, it is locked from further editing.</w:t>
-            </w:r>
-          </w:p>
-        </w:tc>
-        <w:tc>
-          <w:tcPr>
-            <w:tcW w:type="dxa" w:w="5349"/>
-            <w:vAlign w:val="top"/>
-            <w:tcBorders>
-              <w:top w:val="single" w:sz="8" w:space="0" w:color="E6E0EB"/>
-              <w:left w:val="single" w:sz="8" w:space="0" w:color="E6E0EB"/>
-              <w:bottom w:val="single" w:sz="8" w:space="0" w:color="E6E0EB"/>
-              <w:right w:val="single" w:sz="8" w:space="0" w:color="E6E0EB"/>
-            </w:tcBorders>
-            <w:shd w:fill="FFFFFF"/>
-          </w:tcPr>
-          <w:p>
-            <w:pPr>
-              <w:spacing w:after="0"/>
-              <w:jc w:val="center"/>
-            </w:pPr>
-            <w:r>
-              <w:drawing>
-                <wp:inline xmlns:a="http://schemas.openxmlformats.org/drawingml/2006/main" xmlns:pic="http://schemas.openxmlformats.org/drawingml/2006/picture">
-                  <wp:extent cx="1783080" cy="3593592"/>
-                  <wp:docPr id="5" name="Picture 5"/>
-                  <wp:cNvGraphicFramePr>
-                    <a:graphicFrameLocks noChangeAspect="1"/>
-                  </wp:cNvGraphicFramePr>
-                  <a:graphic>
-                    <a:graphicData uri="http://schemas.openxmlformats.org/drawingml/2006/picture">
-                      <pic:pic>
-                        <pic:nvPicPr>
-                          <pic:cNvPr id="0" name="05-manager-next-matches.png"/>
-                          <pic:cNvPicPr/>
-                        </pic:nvPicPr>
-                        <pic:blipFill>
-                          <a:blip r:embed="rId13"/>
-                          <a:stretch>
-                            <a:fillRect/>
-                          </a:stretch>
-                        </pic:blipFill>
-                        <pic:spPr>
-                          <a:xfrm>
-                            <a:off x="0" y="0"/>
-                            <a:ext cx="1783080" cy="3593592"/>
-                          </a:xfrm>
-                          <a:prstGeom prst="rect"/>
-                        </pic:spPr>
-                      </pic:pic>
-                    </a:graphicData>
-                  </a:graphic>
-                </wp:inline>
-              </w:drawing>
-            </w:r>
-          </w:p>
-        </w:tc>
-      </w:tr>
-    </w:tbl>
-    <w:p>
-      <w:pPr>
-        <w:spacing w:after="40"/>
-      </w:pPr>
-    </w:p>
-    <w:tbl>
-      <w:tblPr>
-        <w:tblW w:type="auto" w:w="0"/>
-        <w:jc w:val="center"/>
-        <w:tblLayout w:type="fixed"/>
-        <w:tblLook w:firstColumn="1" w:firstRow="1" w:lastColumn="0" w:lastRow="0" w:noHBand="0" w:noVBand="1" w:val="04A0"/>
-      </w:tblPr>
-      <w:tblGrid>
-        <w:gridCol w:w="5616"/>
-        <w:gridCol w:w="3528"/>
-      </w:tblGrid>
-      <w:tr>
-        <w:tc>
-          <w:tcPr>
-            <w:tcW w:type="dxa" w:w="5349"/>
-            <w:vAlign w:val="top"/>
-            <w:tcBorders>
-              <w:top w:val="single" w:sz="8" w:space="0" w:color="E6E0EB"/>
-              <w:left w:val="single" w:sz="8" w:space="0" w:color="E6E0EB"/>
-              <w:bottom w:val="single" w:sz="8" w:space="0" w:color="E6E0EB"/>
-              <w:right w:val="single" w:sz="8" w:space="0" w:color="E6E0EB"/>
-            </w:tcBorders>
-            <w:shd w:fill="FFFFFF"/>
-          </w:tcPr>
-          <w:p>
-            <w:pPr>
-              <w:spacing w:after="80"/>
-            </w:pPr>
-            <w:r>
-              <w:rPr>
-                <w:rFonts w:ascii="Arial" w:hAnsi="Arial" w:eastAsia="Arial"/>
-                <w:b/>
-                <w:color w:val="25002B"/>
-                <w:sz w:val="21"/>
-              </w:rPr>
-              <w:t>PICK THE TEAM</w:t>
-            </w:r>
-          </w:p>
-          <w:p>
-            <w:pPr>
-              <w:pStyle w:val="ListBullet"/>
-              <w:spacing w:after="40" w:line="240" w:lineRule="auto"/>
-            </w:pPr>
-            <w:r>
-              <w:rPr>
-                <w:rFonts w:ascii="Arial" w:hAnsi="Arial" w:eastAsia="Arial"/>
-                <w:color w:val="10233F"/>
-                <w:sz w:val="17"/>
-              </w:rPr>
-              <w:t>Tap an empty match position and select the player for that slot.</w:t>
-            </w:r>
-          </w:p>
-          <w:p>
-            <w:pPr>
-              <w:pStyle w:val="ListBullet"/>
-              <w:spacing w:after="40" w:line="240" w:lineRule="auto"/>
-            </w:pPr>
-            <w:r>
-              <w:rPr>
-                <w:rFonts w:ascii="Arial" w:hAnsi="Arial" w:eastAsia="Arial"/>
-                <w:color w:val="10233F"/>
-                <w:sz w:val="17"/>
-              </w:rPr>
-              <w:t>The team sheet follows the league format. Doubles slots take two players.</w:t>
-            </w:r>
-          </w:p>
-          <w:p>
-            <w:pPr>
-              <w:pStyle w:val="ListBullet"/>
-              <w:spacing w:after="40" w:line="240" w:lineRule="auto"/>
-            </w:pPr>
-            <w:r>
-              <w:rPr>
-                <w:rFonts w:ascii="Arial" w:hAnsi="Arial" w:eastAsia="Arial"/>
-                <w:color w:val="10233F"/>
-                <w:sz w:val="17"/>
-              </w:rPr>
-              <w:t>Save as you go, then publish only when the team is final. Published teams cannot be changed.</w:t>
-            </w:r>
-          </w:p>
-        </w:tc>
-        <w:tc>
-          <w:tcPr>
-            <w:tcW w:type="dxa" w:w="5349"/>
-            <w:vAlign w:val="top"/>
-            <w:tcBorders>
-              <w:top w:val="single" w:sz="8" w:space="0" w:color="E6E0EB"/>
-              <w:left w:val="single" w:sz="8" w:space="0" w:color="E6E0EB"/>
-              <w:bottom w:val="single" w:sz="8" w:space="0" w:color="E6E0EB"/>
-              <w:right w:val="single" w:sz="8" w:space="0" w:color="E6E0EB"/>
-            </w:tcBorders>
-            <w:shd w:fill="FFFFFF"/>
-          </w:tcPr>
-          <w:p>
-            <w:pPr>
-              <w:spacing w:after="0"/>
-              <w:jc w:val="center"/>
-            </w:pPr>
-            <w:r>
-              <w:drawing>
-                <wp:inline xmlns:a="http://schemas.openxmlformats.org/drawingml/2006/main" xmlns:pic="http://schemas.openxmlformats.org/drawingml/2006/picture">
-                  <wp:extent cx="1783080" cy="3593592"/>
-                  <wp:docPr id="6" name="Picture 6"/>
-                  <wp:cNvGraphicFramePr>
-                    <a:graphicFrameLocks noChangeAspect="1"/>
-                  </wp:cNvGraphicFramePr>
-                  <a:graphic>
-                    <a:graphicData uri="http://schemas.openxmlformats.org/drawingml/2006/picture">
-                      <pic:pic>
-                        <pic:nvPicPr>
-                          <pic:cNvPr id="0" name="08-pick-player.png"/>
-                          <pic:cNvPicPr/>
-                        </pic:nvPicPr>
-                        <pic:blipFill>
-                          <a:blip r:embed="rId14"/>
-                          <a:stretch>
-                            <a:fillRect/>
-                          </a:stretch>
-                        </pic:blipFill>
-                        <pic:spPr>
-                          <a:xfrm>
-                            <a:off x="0" y="0"/>
-                            <a:ext cx="1783080" cy="3593592"/>
-                          </a:xfrm>
-                          <a:prstGeom prst="rect"/>
-                        </pic:spPr>
-                      </pic:pic>
-                    </a:graphicData>
-                  </a:graphic>
-                </wp:inline>
-              </w:drawing>
-            </w:r>
-          </w:p>
-        </w:tc>
-      </w:tr>
-    </w:tbl>
-    <w:p>
-      <w:pPr>
-        <w:spacing w:after="40"/>
-      </w:pPr>
-    </w:p>
-    <w:tbl>
-      <w:tblPr>
-        <w:tblW w:type="auto" w:w="0"/>
-        <w:jc w:val="center"/>
-        <w:tblLayout w:type="fixed"/>
-        <w:tblLook w:firstColumn="1" w:firstRow="1" w:lastColumn="0" w:lastRow="0" w:noHBand="0" w:noVBand="1" w:val="04A0"/>
-      </w:tblPr>
-      <w:tblGrid>
-        <w:gridCol w:w="5616"/>
-        <w:gridCol w:w="3528"/>
-      </w:tblGrid>
-      <w:tr>
-        <w:tc>
-          <w:tcPr>
-            <w:tcW w:type="dxa" w:w="5349"/>
-            <w:vAlign w:val="top"/>
-            <w:tcBorders>
-              <w:top w:val="single" w:sz="8" w:space="0" w:color="E6E0EB"/>
-              <w:left w:val="single" w:sz="8" w:space="0" w:color="E6E0EB"/>
-              <w:bottom w:val="single" w:sz="8" w:space="0" w:color="E6E0EB"/>
-              <w:right w:val="single" w:sz="8" w:space="0" w:color="E6E0EB"/>
-            </w:tcBorders>
-            <w:shd w:fill="FFFFFF"/>
-          </w:tcPr>
-          <w:p>
-            <w:pPr>
-              <w:spacing w:after="80"/>
-            </w:pPr>
-            <w:r>
-              <w:rPr>
-                <w:rFonts w:ascii="Arial" w:hAnsi="Arial" w:eastAsia="Arial"/>
-                <w:b/>
-                <w:color w:val="25002B"/>
-                <w:sz w:val="21"/>
-              </w:rPr>
-              <w:t>ENTER SCORES</w:t>
-            </w:r>
-          </w:p>
-          <w:p>
-            <w:pPr>
-              <w:pStyle w:val="ListBullet"/>
-              <w:spacing w:after="40" w:line="240" w:lineRule="auto"/>
-            </w:pPr>
-            <w:r>
-              <w:rPr>
-                <w:rFonts w:ascii="Arial" w:hAnsi="Arial" w:eastAsia="Arial"/>
-                <w:color w:val="10233F"/>
-                <w:sz w:val="17"/>
-              </w:rPr>
-              <w:t>During the match, tap the winning team for each game.</w:t>
-            </w:r>
-          </w:p>
-          <w:p>
-            <w:pPr>
-              <w:pStyle w:val="ListBullet"/>
-              <w:spacing w:after="40" w:line="240" w:lineRule="auto"/>
-            </w:pPr>
-            <w:r>
-              <w:rPr>
-                <w:rFonts w:ascii="Arial" w:hAnsi="Arial" w:eastAsia="Arial"/>
-                <w:color w:val="10233F"/>
-                <w:sz w:val="17"/>
-              </w:rPr>
-              <w:t>Singles are worth 1 point. Doubles are worth 2 points.</w:t>
-            </w:r>
-          </w:p>
-          <w:p>
-            <w:pPr>
-              <w:pStyle w:val="ListBullet"/>
-              <w:spacing w:after="40" w:line="240" w:lineRule="auto"/>
-            </w:pPr>
-            <w:r>
-              <w:rPr>
-                <w:rFonts w:ascii="Arial" w:hAnsi="Arial" w:eastAsia="Arial"/>
-                <w:color w:val="10233F"/>
-                <w:sz w:val="17"/>
-              </w:rPr>
-              <w:t>Use Match Completed only when all games are done; after that the result is locked.</w:t>
-            </w:r>
-          </w:p>
-        </w:tc>
-        <w:tc>
-          <w:tcPr>
-            <w:tcW w:type="dxa" w:w="5349"/>
-            <w:vAlign w:val="top"/>
-            <w:tcBorders>
-              <w:top w:val="single" w:sz="8" w:space="0" w:color="E6E0EB"/>
-              <w:left w:val="single" w:sz="8" w:space="0" w:color="E6E0EB"/>
-              <w:bottom w:val="single" w:sz="8" w:space="0" w:color="E6E0EB"/>
-              <w:right w:val="single" w:sz="8" w:space="0" w:color="E6E0EB"/>
-            </w:tcBorders>
-            <w:shd w:fill="FFFFFF"/>
-          </w:tcPr>
-          <w:p>
-            <w:pPr>
-              <w:spacing w:after="0"/>
-              <w:jc w:val="center"/>
-            </w:pPr>
-            <w:r>
-              <w:drawing>
-                <wp:inline xmlns:a="http://schemas.openxmlformats.org/drawingml/2006/main" xmlns:pic="http://schemas.openxmlformats.org/drawingml/2006/picture">
-                  <wp:extent cx="1783080" cy="3593592"/>
-                  <wp:docPr id="7" name="Picture 7"/>
-                  <wp:cNvGraphicFramePr>
-                    <a:graphicFrameLocks noChangeAspect="1"/>
-                  </wp:cNvGraphicFramePr>
-                  <a:graphic>
-                    <a:graphicData uri="http://schemas.openxmlformats.org/drawingml/2006/picture">
-                      <pic:pic>
-                        <pic:nvPicPr>
-                          <pic:cNvPr id="0" name="09-score-entry-example.png"/>
-                          <pic:cNvPicPr/>
-                        </pic:nvPicPr>
-                        <pic:blipFill>
-                          <a:blip r:embed="rId15"/>
-                          <a:stretch>
-                            <a:fillRect/>
-                          </a:stretch>
-                        </pic:blipFill>
-                        <pic:spPr>
-                          <a:xfrm>
-                            <a:off x="0" y="0"/>
-                            <a:ext cx="1783080" cy="3593592"/>
-                          </a:xfrm>
-                          <a:prstGeom prst="rect"/>
-                        </pic:spPr>
-                      </pic:pic>
-                    </a:graphicData>
-                  </a:graphic>
-                </wp:inline>
-              </w:drawing>
-            </w:r>
-          </w:p>
-        </w:tc>
-      </w:tr>
-    </w:tbl>
-    <w:p>
-      <w:pPr>
-        <w:spacing w:after="40"/>
-      </w:pPr>
-    </w:p>
-    <w:tbl>
-      <w:tblPr>
-        <w:tblW w:type="auto" w:w="0"/>
-        <w:jc w:val="center"/>
-        <w:tblLayout w:type="fixed"/>
-        <w:tblLook w:firstColumn="1" w:firstRow="1" w:lastColumn="0" w:lastRow="0" w:noHBand="0" w:noVBand="1" w:val="04A0"/>
-      </w:tblPr>
-      <w:tblGrid>
-        <w:gridCol w:w="5616"/>
-        <w:gridCol w:w="3528"/>
-      </w:tblGrid>
-      <w:tr>
-        <w:tc>
-          <w:tcPr>
-            <w:tcW w:type="dxa" w:w="5349"/>
-            <w:vAlign w:val="top"/>
-            <w:tcBorders>
-              <w:top w:val="single" w:sz="8" w:space="0" w:color="E6E0EB"/>
-              <w:left w:val="single" w:sz="8" w:space="0" w:color="E6E0EB"/>
-              <w:bottom w:val="single" w:sz="8" w:space="0" w:color="E6E0EB"/>
-              <w:right w:val="single" w:sz="8" w:space="0" w:color="E6E0EB"/>
-            </w:tcBorders>
-            <w:shd w:fill="FFFFFF"/>
-          </w:tcPr>
-          <w:p>
-            <w:pPr>
-              <w:spacing w:after="80"/>
-            </w:pPr>
-            <w:r>
-              <w:rPr>
-                <w:rFonts w:ascii="Arial" w:hAnsi="Arial" w:eastAsia="Arial"/>
-                <w:b/>
-                <w:color w:val="25002B"/>
-                <w:sz w:val="21"/>
-              </w:rPr>
-              <w:t>RECORD BREAKS</w:t>
-            </w:r>
-          </w:p>
-          <w:p>
-            <w:pPr>
-              <w:pStyle w:val="ListBullet"/>
-              <w:spacing w:after="40" w:line="240" w:lineRule="auto"/>
-            </w:pPr>
-            <w:r>
-              <w:rPr>
-                <w:rFonts w:ascii="Arial" w:hAnsi="Arial" w:eastAsia="Arial"/>
-                <w:color w:val="10233F"/>
-                <w:sz w:val="17"/>
-              </w:rPr>
-              <w:t>Breaks are optional and should only be recorded when they are meaningful for the player record.</w:t>
-            </w:r>
-          </w:p>
-          <w:p>
-            <w:pPr>
-              <w:pStyle w:val="ListBullet"/>
-              <w:spacing w:after="40" w:line="240" w:lineRule="auto"/>
-            </w:pPr>
-            <w:r>
-              <w:rPr>
-                <w:rFonts w:ascii="Arial" w:hAnsi="Arial" w:eastAsia="Arial"/>
-                <w:color w:val="10233F"/>
-                <w:sz w:val="17"/>
-              </w:rPr>
-              <w:t>Pick the player, enter the break value, and save it against that game.</w:t>
-            </w:r>
-          </w:p>
-          <w:p>
-            <w:pPr>
-              <w:pStyle w:val="ListBullet"/>
-              <w:spacing w:after="40" w:line="240" w:lineRule="auto"/>
-            </w:pPr>
-            <w:r>
-              <w:rPr>
-                <w:rFonts w:ascii="Arial" w:hAnsi="Arial" w:eastAsia="Arial"/>
-                <w:color w:val="10233F"/>
-                <w:sz w:val="17"/>
-              </w:rPr>
-              <w:t>Breaks are stored against the player, game, match and season so they flow into player statistics.</w:t>
-            </w:r>
-          </w:p>
-        </w:tc>
-        <w:tc>
-          <w:tcPr>
-            <w:tcW w:type="dxa" w:w="5349"/>
-            <w:vAlign w:val="top"/>
-            <w:tcBorders>
-              <w:top w:val="single" w:sz="8" w:space="0" w:color="E6E0EB"/>
-              <w:left w:val="single" w:sz="8" w:space="0" w:color="E6E0EB"/>
-              <w:bottom w:val="single" w:sz="8" w:space="0" w:color="E6E0EB"/>
-              <w:right w:val="single" w:sz="8" w:space="0" w:color="E6E0EB"/>
-            </w:tcBorders>
-            <w:shd w:fill="FFFFFF"/>
-          </w:tcPr>
-          <w:p>
-            <w:pPr>
-              <w:spacing w:after="0"/>
-              <w:jc w:val="center"/>
-            </w:pPr>
-            <w:r>
-              <w:drawing>
-                <wp:inline xmlns:a="http://schemas.openxmlformats.org/drawingml/2006/main" xmlns:pic="http://schemas.openxmlformats.org/drawingml/2006/picture">
-                  <wp:extent cx="1783080" cy="3593592"/>
-                  <wp:docPr id="8" name="Picture 8"/>
-                  <wp:cNvGraphicFramePr>
-                    <a:graphicFrameLocks noChangeAspect="1"/>
-                  </wp:cNvGraphicFramePr>
-                  <a:graphic>
-                    <a:graphicData uri="http://schemas.openxmlformats.org/drawingml/2006/picture">
-                      <pic:pic>
-                        <pic:nvPicPr>
-                          <pic:cNvPr id="0" name="10-break-entry-example.png"/>
-                          <pic:cNvPicPr/>
-                        </pic:nvPicPr>
-                        <pic:blipFill>
-                          <a:blip r:embed="rId16"/>
-                          <a:stretch>
-                            <a:fillRect/>
-                          </a:stretch>
-                        </pic:blipFill>
-                        <pic:spPr>
-                          <a:xfrm>
-                            <a:off x="0" y="0"/>
-                            <a:ext cx="1783080" cy="3593592"/>
-                          </a:xfrm>
-                          <a:prstGeom prst="rect"/>
-                        </pic:spPr>
-                      </pic:pic>
-                    </a:graphicData>
-                  </a:graphic>
-                </wp:inline>
-              </w:drawing>
-            </w:r>
-          </w:p>
-        </w:tc>
-      </w:tr>
-    </w:tbl>
-    <w:p>
-      <w:pPr>
-        <w:spacing w:after="40"/>
-      </w:pPr>
-    </w:p>
-    <w:tbl>
-      <w:tblPr>
-        <w:tblW w:type="auto" w:w="0"/>
-        <w:jc w:val="center"/>
-        <w:tblLayout w:type="fixed"/>
-        <w:tblLook w:firstColumn="1" w:firstRow="1" w:lastColumn="0" w:lastRow="0" w:noHBand="0" w:noVBand="1" w:val="04A0"/>
-      </w:tblPr>
-      <w:tblGrid>
-        <w:gridCol w:w="5616"/>
-        <w:gridCol w:w="3528"/>
-      </w:tblGrid>
-      <w:tr>
-        <w:tc>
-          <w:tcPr>
-            <w:tcW w:type="dxa" w:w="5349"/>
-            <w:vAlign w:val="top"/>
-            <w:tcBorders>
-              <w:top w:val="single" w:sz="8" w:space="0" w:color="E6E0EB"/>
-              <w:left w:val="single" w:sz="8" w:space="0" w:color="E6E0EB"/>
-              <w:bottom w:val="single" w:sz="8" w:space="0" w:color="E6E0EB"/>
-              <w:right w:val="single" w:sz="8" w:space="0" w:color="E6E0EB"/>
-            </w:tcBorders>
-            <w:shd w:fill="FFFFFF"/>
-          </w:tcPr>
-          <w:p>
-            <w:pPr>
-              <w:spacing w:after="80"/>
-            </w:pPr>
-            <w:r>
-              <w:rPr>
-                <w:rFonts w:ascii="Arial" w:hAnsi="Arial" w:eastAsia="Arial"/>
-                <w:b/>
-                <w:color w:val="25002B"/>
-                <w:sz w:val="21"/>
-              </w:rPr>
-              <w:t>STATS, TABLES AND CLUB</w:t>
-            </w:r>
-          </w:p>
-          <w:p>
-            <w:pPr>
-              <w:pStyle w:val="ListBullet"/>
-              <w:spacing w:after="40" w:line="240" w:lineRule="auto"/>
-            </w:pPr>
-            <w:r>
-              <w:rPr>
-                <w:rFonts w:ascii="Arial" w:hAnsi="Arial" w:eastAsia="Arial"/>
-                <w:color w:val="10233F"/>
-                <w:sz w:val="17"/>
-              </w:rPr>
-              <w:t>Player stats show personal win rate, games played, games won/lost and highest break when available.</w:t>
-            </w:r>
-          </w:p>
-          <w:p>
-            <w:pPr>
-              <w:pStyle w:val="ListBullet"/>
-              <w:spacing w:after="40" w:line="240" w:lineRule="auto"/>
-            </w:pPr>
-            <w:r>
-              <w:rPr>
-                <w:rFonts w:ascii="Arial" w:hAnsi="Arial" w:eastAsia="Arial"/>
-                <w:color w:val="10233F"/>
-                <w:sz w:val="17"/>
-              </w:rPr>
-              <w:t>Tables shows your league first, then the other leagues.</w:t>
-            </w:r>
-          </w:p>
-          <w:p>
-            <w:pPr>
-              <w:pStyle w:val="ListBullet"/>
-              <w:spacing w:after="40" w:line="240" w:lineRule="auto"/>
-            </w:pPr>
-            <w:r>
-              <w:rPr>
-                <w:rFonts w:ascii="Arial" w:hAnsi="Arial" w:eastAsia="Arial"/>
-                <w:color w:val="10233F"/>
-                <w:sz w:val="17"/>
-              </w:rPr>
-              <w:t>My Club contains club-only features such as table bookings, competitions and club games.</w:t>
-            </w:r>
-          </w:p>
-        </w:tc>
-        <w:tc>
-          <w:tcPr>
-            <w:tcW w:type="dxa" w:w="5349"/>
-            <w:vAlign w:val="top"/>
-            <w:tcBorders>
-              <w:top w:val="single" w:sz="8" w:space="0" w:color="E6E0EB"/>
-              <w:left w:val="single" w:sz="8" w:space="0" w:color="E6E0EB"/>
-              <w:bottom w:val="single" w:sz="8" w:space="0" w:color="E6E0EB"/>
-              <w:right w:val="single" w:sz="8" w:space="0" w:color="E6E0EB"/>
-            </w:tcBorders>
-            <w:shd w:fill="FFFFFF"/>
-          </w:tcPr>
-          <w:p>
-            <w:pPr>
-              <w:spacing w:after="0"/>
-              <w:jc w:val="center"/>
-            </w:pPr>
-            <w:r>
-              <w:drawing>
-                <wp:inline xmlns:a="http://schemas.openxmlformats.org/drawingml/2006/main" xmlns:pic="http://schemas.openxmlformats.org/drawingml/2006/picture">
-                  <wp:extent cx="1600200" cy="3225018"/>
-                  <wp:docPr id="9" name="Picture 9"/>
-                  <wp:cNvGraphicFramePr>
-                    <a:graphicFrameLocks noChangeAspect="1"/>
-                  </wp:cNvGraphicFramePr>
-                  <a:graphic>
-                    <a:graphicData uri="http://schemas.openxmlformats.org/drawingml/2006/picture">
-                      <pic:pic>
-                        <pic:nvPicPr>
-                          <pic:cNvPr id="0" name="11-season-player-stats.png"/>
-                          <pic:cNvPicPr/>
-                        </pic:nvPicPr>
-                        <pic:blipFill>
-                          <a:blip r:embed="rId17"/>
-                          <a:stretch>
-                            <a:fillRect/>
-                          </a:stretch>
-                        </pic:blipFill>
-                        <pic:spPr>
-                          <a:xfrm>
-                            <a:off x="0" y="0"/>
-                            <a:ext cx="1600200" cy="3225018"/>
-                          </a:xfrm>
-                          <a:prstGeom prst="rect"/>
-                        </pic:spPr>
-                      </pic:pic>
-                    </a:graphicData>
-                  </a:graphic>
-                </wp:inline>
-              </w:drawing>
-            </w:r>
-          </w:p>
-        </w:tc>
-      </w:tr>
-    </w:tbl>
-    <w:p>
-      <w:pPr>
-        <w:spacing w:after="40"/>
-      </w:pPr>
-    </w:p>
-    <w:tbl>
-      <w:tblPr>
-        <w:tblW w:type="auto" w:w="0"/>
-        <w:jc w:val="center"/>
-        <w:tblLook w:firstColumn="1" w:firstRow="1" w:lastColumn="0" w:lastRow="0" w:noHBand="0" w:noVBand="1" w:val="04A0"/>
-      </w:tblPr>
-      <w:tblGrid>
-        <w:gridCol w:w="5349"/>
-        <w:gridCol w:w="5349"/>
-      </w:tblGrid>
-      <w:tr>
-        <w:tc>
-          <w:tcPr>
-            <w:tcW w:type="dxa" w:w="5349"/>
-            <w:tcBorders>
-              <w:top w:val="single" w:sz="8" w:space="0" w:color="E6E0EB"/>
-              <w:left w:val="single" w:sz="8" w:space="0" w:color="E6E0EB"/>
-              <w:bottom w:val="single" w:sz="8" w:space="0" w:color="E6E0EB"/>
-              <w:right w:val="single" w:sz="8" w:space="0" w:color="E6E0EB"/>
-            </w:tcBorders>
-            <w:shd w:fill="FFFFFF"/>
-          </w:tcPr>
-          <w:p>
-            <w:pPr>
-              <w:jc w:val="center"/>
-            </w:pPr>
-            <w:r>
-              <w:rPr>
-                <w:rFonts w:ascii="Arial" w:hAnsi="Arial" w:eastAsia="Arial"/>
-                <w:b/>
-                <w:color w:val="25002B"/>
-                <w:sz w:val="19"/>
-              </w:rPr>
-              <w:t>League tables</w:t>
-            </w:r>
-          </w:p>
-          <w:p>
-            <w:pPr>
-              <w:jc w:val="center"/>
-            </w:pPr>
-            <w:r>
-              <w:drawing>
-                <wp:inline xmlns:a="http://schemas.openxmlformats.org/drawingml/2006/main" xmlns:pic="http://schemas.openxmlformats.org/drawingml/2006/picture">
-                  <wp:extent cx="1691640" cy="3409305"/>
-                  <wp:docPr id="10" name="Picture 10"/>
-                  <wp:cNvGraphicFramePr>
-                    <a:graphicFrameLocks noChangeAspect="1"/>
-                  </wp:cNvGraphicFramePr>
-                  <a:graphic>
-                    <a:graphicData uri="http://schemas.openxmlformats.org/drawingml/2006/picture">
-                      <pic:pic>
-                        <pic:nvPicPr>
-                          <pic:cNvPr id="0" name="12-tables-screen.png"/>
-                          <pic:cNvPicPr/>
-                        </pic:nvPicPr>
-                        <pic:blipFill>
-                          <a:blip r:embed="rId18"/>
-                          <a:stretch>
-                            <a:fillRect/>
-                          </a:stretch>
-                        </pic:blipFill>
-                        <pic:spPr>
-                          <a:xfrm>
-                            <a:off x="0" y="0"/>
-                            <a:ext cx="1691640" cy="3409305"/>
-                          </a:xfrm>
-                          <a:prstGeom prst="rect"/>
-                        </pic:spPr>
-                      </pic:pic>
-                    </a:graphicData>
-                  </a:graphic>
-                </wp:inline>
-              </w:drawing>
-            </w:r>
-          </w:p>
-        </w:tc>
-        <w:tc>
-          <w:tcPr>
-            <w:tcW w:type="dxa" w:w="5349"/>
-            <w:tcBorders>
-              <w:top w:val="single" w:sz="8" w:space="0" w:color="E6E0EB"/>
-              <w:left w:val="single" w:sz="8" w:space="0" w:color="E6E0EB"/>
-              <w:bottom w:val="single" w:sz="8" w:space="0" w:color="E6E0EB"/>
-              <w:right w:val="single" w:sz="8" w:space="0" w:color="E6E0EB"/>
-            </w:tcBorders>
-            <w:shd w:fill="FFFFFF"/>
-          </w:tcPr>
-          <w:p>
-            <w:pPr>
-              <w:jc w:val="center"/>
-            </w:pPr>
-            <w:r>
-              <w:rPr>
-                <w:rFonts w:ascii="Arial" w:hAnsi="Arial" w:eastAsia="Arial"/>
-                <w:b/>
-                <w:color w:val="25002B"/>
-                <w:sz w:val="19"/>
-              </w:rPr>
-              <w:t>My Club</w:t>
-            </w:r>
-          </w:p>
-          <w:p>
-            <w:pPr>
-              <w:jc w:val="center"/>
-            </w:pPr>
-            <w:r>
-              <w:drawing>
-                <wp:inline xmlns:a="http://schemas.openxmlformats.org/drawingml/2006/main" xmlns:pic="http://schemas.openxmlformats.org/drawingml/2006/picture">
-                  <wp:extent cx="1691640" cy="3409305"/>
-                  <wp:docPr id="11" name="Picture 11"/>
-                  <wp:cNvGraphicFramePr>
-                    <a:graphicFrameLocks noChangeAspect="1"/>
-                  </wp:cNvGraphicFramePr>
-                  <a:graphic>
-                    <a:graphicData uri="http://schemas.openxmlformats.org/drawingml/2006/picture">
-                      <pic:pic>
-                        <pic:nvPicPr>
-                          <pic:cNvPr id="0" name="13-my-club-screen.png"/>
-                          <pic:cNvPicPr/>
-                        </pic:nvPicPr>
-                        <pic:blipFill>
-                          <a:blip r:embed="rId19"/>
-                          <a:stretch>
-                            <a:fillRect/>
-                          </a:stretch>
-                        </pic:blipFill>
-                        <pic:spPr>
-                          <a:xfrm>
-                            <a:off x="0" y="0"/>
-                            <a:ext cx="1691640" cy="3409305"/>
-                          </a:xfrm>
-                          <a:prstGeom prst="rect"/>
-                        </pic:spPr>
-                      </pic:pic>
-                    </a:graphicData>
-                  </a:graphic>
-                </wp:inline>
-              </w:drawing>
-            </w:r>
-          </w:p>
-        </w:tc>
-      </w:tr>
-    </w:tbl>
-    <w:p>
-      <w:pPr>
-        <w:spacing w:before="160" w:after="60" w:line="252" w:lineRule="auto"/>
+        <w:pStyle w:val="Heading1"/>
+        <w:spacing w:before="100" w:after="60" w:line="259" w:lineRule="auto"/>
       </w:pPr>
       <w:r>
         <w:rPr>
           <w:rFonts w:ascii="Arial" w:hAnsi="Arial" w:eastAsia="Arial"/>
           <w:b/>
-          <w:color w:val="10233F"/>
-          <w:sz w:val="24"/>
+          <w:color w:val="000000"/>
+          <w:sz w:val="32"/>
         </w:rPr>
-        <w:t>Good habits</w:t>
+        <w:t>Sign in</w:t>
       </w:r>
     </w:p>
     <w:p>
       <w:pPr>
         <w:pStyle w:val="ListBullet"/>
-        <w:spacing w:after="40" w:line="240" w:lineRule="auto"/>
+        <w:spacing w:after="60" w:line="252" w:lineRule="auto"/>
       </w:pPr>
       <w:r>
         <w:rPr>
           <w:rFonts w:ascii="Arial" w:hAnsi="Arial" w:eastAsia="Arial"/>
+          <w:b w:val="0"/>
           <w:color w:val="10233F"/>
-          <w:sz w:val="17"/>
+          <w:sz w:val="22"/>
         </w:rPr>
-        <w:t>Use the app on your phone on match night; it is designed for quick taps, not desktop-heavy workflows.</w:t>
+        <w:t>Your account must be created through an invite or by an administrator.</w:t>
       </w:r>
     </w:p>
     <w:p>
       <w:pPr>
         <w:pStyle w:val="ListBullet"/>
-        <w:spacing w:after="40" w:line="240" w:lineRule="auto"/>
+        <w:spacing w:after="60" w:line="252" w:lineRule="auto"/>
       </w:pPr>
       <w:r>
         <w:rPr>
           <w:rFonts w:ascii="Arial" w:hAnsi="Arial" w:eastAsia="Arial"/>
+          <w:b w:val="0"/>
           <w:color w:val="10233F"/>
-          <w:sz w:val="17"/>
+          <w:sz w:val="22"/>
         </w:rPr>
-        <w:t>Managers should publish lineups only when final and mark the match completed only after all scores are correct.</w:t>
+        <w:t>Use your email address and password, or Google sign in if that email is connected to your account.</w:t>
       </w:r>
     </w:p>
     <w:p>
       <w:pPr>
         <w:pStyle w:val="ListBullet"/>
-        <w:spacing w:after="40" w:line="240" w:lineRule="auto"/>
+        <w:spacing w:after="60" w:line="252" w:lineRule="auto"/>
       </w:pPr>
       <w:r>
         <w:rPr>
           <w:rFonts w:ascii="Arial" w:hAnsi="Arial" w:eastAsia="Arial"/>
+          <w:b w:val="0"/>
           <w:color w:val="10233F"/>
-          <w:sz w:val="17"/>
+          <w:sz w:val="22"/>
         </w:rPr>
-        <w:t>Players can follow live scores and see their season information without needing manager controls.</w:t>
+        <w:t>After first login, bookmark interclubsnooker.com on your phone.</w:t>
       </w:r>
     </w:p>
     <w:p>
       <w:pPr>
+        <w:spacing w:before="40" w:after="40"/>
         <w:jc w:val="center"/>
+      </w:pPr>
+      <w:r>
+        <w:drawing>
+          <wp:inline xmlns:a="http://schemas.openxmlformats.org/drawingml/2006/main" xmlns:pic="http://schemas.openxmlformats.org/drawingml/2006/picture">
+            <wp:extent cx="2240280" cy="4480560"/>
+            <wp:docPr id="1" name="Picture 1"/>
+            <wp:cNvGraphicFramePr>
+              <a:graphicFrameLocks noChangeAspect="1"/>
+            </wp:cNvGraphicFramePr>
+            <a:graphic>
+              <a:graphicData uri="http://schemas.openxmlformats.org/drawingml/2006/picture">
+                <pic:pic>
+                  <pic:nvPicPr>
+                    <pic:cNvPr id="0" name="01-sign-in.png"/>
+                    <pic:cNvPicPr/>
+                  </pic:nvPicPr>
+                  <pic:blipFill>
+                    <a:blip r:embed="rId9"/>
+                    <a:stretch>
+                      <a:fillRect/>
+                    </a:stretch>
+                  </pic:blipFill>
+                  <pic:spPr>
+                    <a:xfrm>
+                      <a:off x="0" y="0"/>
+                      <a:ext cx="2240280" cy="4480560"/>
+                    </a:xfrm>
+                    <a:prstGeom prst="rect"/>
+                  </pic:spPr>
+                </pic:pic>
+              </a:graphicData>
+            </a:graphic>
+          </wp:inline>
+        </w:drawing>
+      </w:r>
+    </w:p>
+    <w:p>
+      <w:r>
+        <w:br w:type="page"/>
+      </w:r>
+    </w:p>
+    <w:p>
+      <w:pPr>
+        <w:pStyle w:val="Heading1"/>
+        <w:spacing w:before="0" w:after="80" w:line="259" w:lineRule="auto"/>
       </w:pPr>
       <w:r>
         <w:rPr>
           <w:rFonts w:ascii="Arial" w:hAnsi="Arial" w:eastAsia="Arial"/>
           <w:b/>
-          <w:color w:val="6C5A73"/>
-          <w:sz w:val="16"/>
+          <w:color w:val="000000"/>
+          <w:sz w:val="36"/>
         </w:rPr>
-        <w:t>Interclub Snooker</w:t>
+        <w:t>Player home</w:t>
+      </w:r>
+    </w:p>
+    <w:p>
+      <w:pPr>
+        <w:pStyle w:val="ListBullet"/>
+        <w:spacing w:after="60" w:line="252" w:lineRule="auto"/>
+      </w:pPr>
+      <w:r>
+        <w:rPr>
+          <w:rFonts w:ascii="Arial" w:hAnsi="Arial" w:eastAsia="Arial"/>
+          <w:b w:val="0"/>
+          <w:color w:val="10233F"/>
+          <w:sz w:val="22"/>
+        </w:rPr>
+        <w:t>The player home page shows your name, role, team, current week fixtures, personal stats and recent form.</w:t>
+      </w:r>
+    </w:p>
+    <w:p>
+      <w:pPr>
+        <w:pStyle w:val="ListBullet"/>
+        <w:spacing w:after="60" w:line="252" w:lineRule="auto"/>
+      </w:pPr>
+      <w:r>
+        <w:rPr>
+          <w:rFonts w:ascii="Arial" w:hAnsi="Arial" w:eastAsia="Arial"/>
+          <w:b w:val="0"/>
+          <w:color w:val="10233F"/>
+          <w:sz w:val="22"/>
+        </w:rPr>
+        <w:t>The top selector appears only when you have more than one role.</w:t>
+      </w:r>
+    </w:p>
+    <w:p>
+      <w:pPr>
+        <w:pStyle w:val="ListBullet"/>
+        <w:spacing w:after="60" w:line="252" w:lineRule="auto"/>
+      </w:pPr>
+      <w:r>
+        <w:rPr>
+          <w:rFonts w:ascii="Arial" w:hAnsi="Arial" w:eastAsia="Arial"/>
+          <w:b w:val="0"/>
+          <w:color w:val="10233F"/>
+          <w:sz w:val="22"/>
+        </w:rPr>
+        <w:t>Use the bottom menu to move between Home, Fixtures, Tables, My Club and More when More is needed.</w:t>
+      </w:r>
+    </w:p>
+    <w:p>
+      <w:pPr>
+        <w:spacing w:before="40" w:after="40"/>
+        <w:jc w:val="center"/>
+      </w:pPr>
+      <w:r>
+        <w:drawing>
+          <wp:inline xmlns:a="http://schemas.openxmlformats.org/drawingml/2006/main" xmlns:pic="http://schemas.openxmlformats.org/drawingml/2006/picture">
+            <wp:extent cx="2606040" cy="5212080"/>
+            <wp:docPr id="2" name="Picture 2"/>
+            <wp:cNvGraphicFramePr>
+              <a:graphicFrameLocks noChangeAspect="1"/>
+            </wp:cNvGraphicFramePr>
+            <a:graphic>
+              <a:graphicData uri="http://schemas.openxmlformats.org/drawingml/2006/picture">
+                <pic:pic>
+                  <pic:nvPicPr>
+                    <pic:cNvPr id="0" name="02-player-home.png"/>
+                    <pic:cNvPicPr/>
+                  </pic:nvPicPr>
+                  <pic:blipFill>
+                    <a:blip r:embed="rId10"/>
+                    <a:stretch>
+                      <a:fillRect/>
+                    </a:stretch>
+                  </pic:blipFill>
+                  <pic:spPr>
+                    <a:xfrm>
+                      <a:off x="0" y="0"/>
+                      <a:ext cx="2606040" cy="5212080"/>
+                    </a:xfrm>
+                    <a:prstGeom prst="rect"/>
+                  </pic:spPr>
+                </pic:pic>
+              </a:graphicData>
+            </a:graphic>
+          </wp:inline>
+        </w:drawing>
+      </w:r>
+    </w:p>
+    <w:p>
+      <w:r>
+        <w:br w:type="page"/>
+      </w:r>
+    </w:p>
+    <w:p>
+      <w:pPr>
+        <w:pStyle w:val="Heading1"/>
+        <w:spacing w:before="0" w:after="80" w:line="259" w:lineRule="auto"/>
+      </w:pPr>
+      <w:r>
+        <w:rPr>
+          <w:rFonts w:ascii="Arial" w:hAnsi="Arial" w:eastAsia="Arial"/>
+          <w:b/>
+          <w:color w:val="000000"/>
+          <w:sz w:val="36"/>
+        </w:rPr>
+        <w:t>Fixtures and match viewing</w:t>
+      </w:r>
+    </w:p>
+    <w:p>
+      <w:pPr>
+        <w:pStyle w:val="ListBullet"/>
+        <w:spacing w:after="60" w:line="252" w:lineRule="auto"/>
+      </w:pPr>
+      <w:r>
+        <w:rPr>
+          <w:rFonts w:ascii="Arial" w:hAnsi="Arial" w:eastAsia="Arial"/>
+          <w:b w:val="0"/>
+          <w:color w:val="10233F"/>
+          <w:sz w:val="22"/>
+        </w:rPr>
+        <w:t>Fixtures are grouped by week so all matches in a round sit together.</w:t>
+      </w:r>
+    </w:p>
+    <w:p>
+      <w:pPr>
+        <w:pStyle w:val="ListBullet"/>
+        <w:spacing w:after="60" w:line="252" w:lineRule="auto"/>
+      </w:pPr>
+      <w:r>
+        <w:rPr>
+          <w:rFonts w:ascii="Arial" w:hAnsi="Arial" w:eastAsia="Arial"/>
+          <w:b w:val="0"/>
+          <w:color w:val="10233F"/>
+          <w:sz w:val="22"/>
+        </w:rPr>
+        <w:t>Use the arrows to move between weeks. The app opens on the relevant current week.</w:t>
+      </w:r>
+    </w:p>
+    <w:p>
+      <w:pPr>
+        <w:pStyle w:val="ListBullet"/>
+        <w:spacing w:after="60" w:line="252" w:lineRule="auto"/>
+      </w:pPr>
+      <w:r>
+        <w:rPr>
+          <w:rFonts w:ascii="Arial" w:hAnsi="Arial" w:eastAsia="Arial"/>
+          <w:b w:val="0"/>
+          <w:color w:val="10233F"/>
+          <w:sz w:val="22"/>
+        </w:rPr>
+        <w:t>Players can open a match once it is live or published, but cannot edit scores or breaks.</w:t>
+      </w:r>
+    </w:p>
+    <w:p>
+      <w:pPr>
+        <w:spacing w:before="40" w:after="40"/>
+        <w:jc w:val="center"/>
+      </w:pPr>
+      <w:r>
+        <w:drawing>
+          <wp:inline xmlns:a="http://schemas.openxmlformats.org/drawingml/2006/main" xmlns:pic="http://schemas.openxmlformats.org/drawingml/2006/picture">
+            <wp:extent cx="2606040" cy="5212080"/>
+            <wp:docPr id="3" name="Picture 3"/>
+            <wp:cNvGraphicFramePr>
+              <a:graphicFrameLocks noChangeAspect="1"/>
+            </wp:cNvGraphicFramePr>
+            <a:graphic>
+              <a:graphicData uri="http://schemas.openxmlformats.org/drawingml/2006/picture">
+                <pic:pic>
+                  <pic:nvPicPr>
+                    <pic:cNvPr id="0" name="03-fixtures.png"/>
+                    <pic:cNvPicPr/>
+                  </pic:nvPicPr>
+                  <pic:blipFill>
+                    <a:blip r:embed="rId11"/>
+                    <a:stretch>
+                      <a:fillRect/>
+                    </a:stretch>
+                  </pic:blipFill>
+                  <pic:spPr>
+                    <a:xfrm>
+                      <a:off x="0" y="0"/>
+                      <a:ext cx="2606040" cy="5212080"/>
+                    </a:xfrm>
+                    <a:prstGeom prst="rect"/>
+                  </pic:spPr>
+                </pic:pic>
+              </a:graphicData>
+            </a:graphic>
+          </wp:inline>
+        </w:drawing>
+      </w:r>
+    </w:p>
+    <w:p>
+      <w:r>
+        <w:br w:type="page"/>
+      </w:r>
+    </w:p>
+    <w:p>
+      <w:pPr>
+        <w:pStyle w:val="Heading1"/>
+        <w:spacing w:before="0" w:after="80" w:line="259" w:lineRule="auto"/>
+      </w:pPr>
+      <w:r>
+        <w:rPr>
+          <w:rFonts w:ascii="Arial" w:hAnsi="Arial" w:eastAsia="Arial"/>
+          <w:b/>
+          <w:color w:val="000000"/>
+          <w:sz w:val="36"/>
+        </w:rPr>
+        <w:t>Tables and player information</w:t>
+      </w:r>
+    </w:p>
+    <w:p>
+      <w:pPr>
+        <w:pStyle w:val="ListBullet"/>
+        <w:spacing w:after="60" w:line="252" w:lineRule="auto"/>
+      </w:pPr>
+      <w:r>
+        <w:rPr>
+          <w:rFonts w:ascii="Arial" w:hAnsi="Arial" w:eastAsia="Arial"/>
+          <w:b w:val="0"/>
+          <w:color w:val="10233F"/>
+          <w:sz w:val="22"/>
+        </w:rPr>
+        <w:t>Tables shows your own league first, then the other leagues below it.</w:t>
+      </w:r>
+    </w:p>
+    <w:p>
+      <w:pPr>
+        <w:pStyle w:val="ListBullet"/>
+        <w:spacing w:after="60" w:line="252" w:lineRule="auto"/>
+      </w:pPr>
+      <w:r>
+        <w:rPr>
+          <w:rFonts w:ascii="Arial" w:hAnsi="Arial" w:eastAsia="Arial"/>
+          <w:b w:val="0"/>
+          <w:color w:val="10233F"/>
+          <w:sz w:val="22"/>
+        </w:rPr>
+        <w:t>League tables and player stats update from match data rather than being manually edited.</w:t>
+      </w:r>
+    </w:p>
+    <w:p>
+      <w:pPr>
+        <w:pStyle w:val="ListBullet"/>
+        <w:spacing w:after="60" w:line="252" w:lineRule="auto"/>
+      </w:pPr>
+      <w:r>
+        <w:rPr>
+          <w:rFonts w:ascii="Arial" w:hAnsi="Arial" w:eastAsia="Arial"/>
+          <w:b w:val="0"/>
+          <w:color w:val="10233F"/>
+          <w:sz w:val="22"/>
+        </w:rPr>
+        <w:t>Player stats are ranked by win percentage. High break appears where a player has break data.</w:t>
+      </w:r>
+    </w:p>
+    <w:p>
+      <w:pPr>
+        <w:spacing w:before="40" w:after="40"/>
+        <w:jc w:val="center"/>
+      </w:pPr>
+      <w:r>
+        <w:drawing>
+          <wp:inline xmlns:a="http://schemas.openxmlformats.org/drawingml/2006/main" xmlns:pic="http://schemas.openxmlformats.org/drawingml/2006/picture">
+            <wp:extent cx="2606040" cy="5212080"/>
+            <wp:docPr id="4" name="Picture 4"/>
+            <wp:cNvGraphicFramePr>
+              <a:graphicFrameLocks noChangeAspect="1"/>
+            </wp:cNvGraphicFramePr>
+            <a:graphic>
+              <a:graphicData uri="http://schemas.openxmlformats.org/drawingml/2006/picture">
+                <pic:pic>
+                  <pic:nvPicPr>
+                    <pic:cNvPr id="0" name="04-tables.png"/>
+                    <pic:cNvPicPr/>
+                  </pic:nvPicPr>
+                  <pic:blipFill>
+                    <a:blip r:embed="rId12"/>
+                    <a:stretch>
+                      <a:fillRect/>
+                    </a:stretch>
+                  </pic:blipFill>
+                  <pic:spPr>
+                    <a:xfrm>
+                      <a:off x="0" y="0"/>
+                      <a:ext cx="2606040" cy="5212080"/>
+                    </a:xfrm>
+                    <a:prstGeom prst="rect"/>
+                  </pic:spPr>
+                </pic:pic>
+              </a:graphicData>
+            </a:graphic>
+          </wp:inline>
+        </w:drawing>
+      </w:r>
+    </w:p>
+    <w:p>
+      <w:r>
+        <w:br w:type="page"/>
+      </w:r>
+    </w:p>
+    <w:p>
+      <w:pPr>
+        <w:pStyle w:val="Heading1"/>
+        <w:spacing w:before="0" w:after="80" w:line="259" w:lineRule="auto"/>
+      </w:pPr>
+      <w:r>
+        <w:rPr>
+          <w:rFonts w:ascii="Arial" w:hAnsi="Arial" w:eastAsia="Arial"/>
+          <w:b/>
+          <w:color w:val="000000"/>
+          <w:sz w:val="36"/>
+        </w:rPr>
+        <w:t>Manager home</w:t>
+      </w:r>
+    </w:p>
+    <w:p>
+      <w:pPr>
+        <w:pStyle w:val="ListBullet"/>
+        <w:spacing w:after="60" w:line="252" w:lineRule="auto"/>
+      </w:pPr>
+      <w:r>
+        <w:rPr>
+          <w:rFonts w:ascii="Arial" w:hAnsi="Arial" w:eastAsia="Arial"/>
+          <w:b w:val="0"/>
+          <w:color w:val="10233F"/>
+          <w:sz w:val="22"/>
+        </w:rPr>
+        <w:t>Managers see team information first: next match, league position, team form and player form.</w:t>
+      </w:r>
+    </w:p>
+    <w:p>
+      <w:pPr>
+        <w:pStyle w:val="ListBullet"/>
+        <w:spacing w:after="60" w:line="252" w:lineRule="auto"/>
+      </w:pPr>
+      <w:r>
+        <w:rPr>
+          <w:rFonts w:ascii="Arial" w:hAnsi="Arial" w:eastAsia="Arial"/>
+          <w:b w:val="0"/>
+          <w:color w:val="10233F"/>
+          <w:sz w:val="22"/>
+        </w:rPr>
+        <w:t>The manager view is scoped to the selected team only.</w:t>
+      </w:r>
+    </w:p>
+    <w:p>
+      <w:pPr>
+        <w:pStyle w:val="ListBullet"/>
+        <w:spacing w:after="60" w:line="252" w:lineRule="auto"/>
+      </w:pPr>
+      <w:r>
+        <w:rPr>
+          <w:rFonts w:ascii="Arial" w:hAnsi="Arial" w:eastAsia="Arial"/>
+          <w:b w:val="0"/>
+          <w:color w:val="10233F"/>
+          <w:sz w:val="22"/>
+        </w:rPr>
+        <w:t>If you are also a player, switch roles at the top to see the player version of the app.</w:t>
+      </w:r>
+    </w:p>
+    <w:p>
+      <w:pPr>
+        <w:spacing w:before="40" w:after="40"/>
+        <w:jc w:val="center"/>
+      </w:pPr>
+      <w:r>
+        <w:drawing>
+          <wp:inline xmlns:a="http://schemas.openxmlformats.org/drawingml/2006/main" xmlns:pic="http://schemas.openxmlformats.org/drawingml/2006/picture">
+            <wp:extent cx="2606040" cy="5212080"/>
+            <wp:docPr id="5" name="Picture 5"/>
+            <wp:cNvGraphicFramePr>
+              <a:graphicFrameLocks noChangeAspect="1"/>
+            </wp:cNvGraphicFramePr>
+            <a:graphic>
+              <a:graphicData uri="http://schemas.openxmlformats.org/drawingml/2006/picture">
+                <pic:pic>
+                  <pic:nvPicPr>
+                    <pic:cNvPr id="0" name="05-manager-home.png"/>
+                    <pic:cNvPicPr/>
+                  </pic:nvPicPr>
+                  <pic:blipFill>
+                    <a:blip r:embed="rId13"/>
+                    <a:stretch>
+                      <a:fillRect/>
+                    </a:stretch>
+                  </pic:blipFill>
+                  <pic:spPr>
+                    <a:xfrm>
+                      <a:off x="0" y="0"/>
+                      <a:ext cx="2606040" cy="5212080"/>
+                    </a:xfrm>
+                    <a:prstGeom prst="rect"/>
+                  </pic:spPr>
+                </pic:pic>
+              </a:graphicData>
+            </a:graphic>
+          </wp:inline>
+        </w:drawing>
+      </w:r>
+    </w:p>
+    <w:p>
+      <w:r>
+        <w:br w:type="page"/>
+      </w:r>
+    </w:p>
+    <w:p>
+      <w:pPr>
+        <w:pStyle w:val="Heading1"/>
+        <w:spacing w:before="0" w:after="80" w:line="259" w:lineRule="auto"/>
+      </w:pPr>
+      <w:r>
+        <w:rPr>
+          <w:rFonts w:ascii="Arial" w:hAnsi="Arial" w:eastAsia="Arial"/>
+          <w:b/>
+          <w:color w:val="000000"/>
+          <w:sz w:val="36"/>
+        </w:rPr>
+        <w:t>Pick and publish a team</w:t>
+      </w:r>
+    </w:p>
+    <w:p>
+      <w:pPr>
+        <w:pStyle w:val="ListBullet"/>
+        <w:spacing w:after="60" w:line="252" w:lineRule="auto"/>
+      </w:pPr>
+      <w:r>
+        <w:rPr>
+          <w:rFonts w:ascii="Arial" w:hAnsi="Arial" w:eastAsia="Arial"/>
+          <w:b w:val="0"/>
+          <w:color w:val="10233F"/>
+          <w:sz w:val="22"/>
+        </w:rPr>
+        <w:t>Open your own next match and fill the team sheet from the match page.</w:t>
+      </w:r>
+    </w:p>
+    <w:p>
+      <w:pPr>
+        <w:pStyle w:val="ListBullet"/>
+        <w:spacing w:after="60" w:line="252" w:lineRule="auto"/>
+      </w:pPr>
+      <w:r>
+        <w:rPr>
+          <w:rFonts w:ascii="Arial" w:hAnsi="Arial" w:eastAsia="Arial"/>
+          <w:b w:val="0"/>
+          <w:color w:val="10233F"/>
+          <w:sz w:val="22"/>
+        </w:rPr>
+        <w:t>Tap an empty slot to choose a player. Doubles slots take two player slots.</w:t>
+      </w:r>
+    </w:p>
+    <w:p>
+      <w:pPr>
+        <w:pStyle w:val="ListBullet"/>
+        <w:spacing w:after="60" w:line="252" w:lineRule="auto"/>
+      </w:pPr>
+      <w:r>
+        <w:rPr>
+          <w:rFonts w:ascii="Arial" w:hAnsi="Arial" w:eastAsia="Arial"/>
+          <w:b w:val="0"/>
+          <w:color w:val="10233F"/>
+          <w:sz w:val="22"/>
+        </w:rPr>
+        <w:t>A and B League matches are five singles and one doubles. C League uses singles in games 1, 3 and 5 and doubles in games 2 and 4.</w:t>
+      </w:r>
+    </w:p>
+    <w:p>
+      <w:pPr>
+        <w:pStyle w:val="ListBullet"/>
+        <w:spacing w:after="60" w:line="252" w:lineRule="auto"/>
+      </w:pPr>
+      <w:r>
+        <w:rPr>
+          <w:rFonts w:ascii="Arial" w:hAnsi="Arial" w:eastAsia="Arial"/>
+          <w:b w:val="0"/>
+          <w:color w:val="10233F"/>
+          <w:sz w:val="22"/>
+        </w:rPr>
+        <w:t>Publish only when final. A published team sheet is locked.</w:t>
+      </w:r>
+    </w:p>
+    <w:p>
+      <w:pPr>
+        <w:spacing w:before="40" w:after="40"/>
+        <w:jc w:val="center"/>
+      </w:pPr>
+      <w:r>
+        <w:drawing>
+          <wp:inline xmlns:a="http://schemas.openxmlformats.org/drawingml/2006/main" xmlns:pic="http://schemas.openxmlformats.org/drawingml/2006/picture">
+            <wp:extent cx="2606040" cy="5212080"/>
+            <wp:docPr id="6" name="Picture 6"/>
+            <wp:cNvGraphicFramePr>
+              <a:graphicFrameLocks noChangeAspect="1"/>
+            </wp:cNvGraphicFramePr>
+            <a:graphic>
+              <a:graphicData uri="http://schemas.openxmlformats.org/drawingml/2006/picture">
+                <pic:pic>
+                  <pic:nvPicPr>
+                    <pic:cNvPr id="0" name="06-team-sheet.png"/>
+                    <pic:cNvPicPr/>
+                  </pic:nvPicPr>
+                  <pic:blipFill>
+                    <a:blip r:embed="rId14"/>
+                    <a:stretch>
+                      <a:fillRect/>
+                    </a:stretch>
+                  </pic:blipFill>
+                  <pic:spPr>
+                    <a:xfrm>
+                      <a:off x="0" y="0"/>
+                      <a:ext cx="2606040" cy="5212080"/>
+                    </a:xfrm>
+                    <a:prstGeom prst="rect"/>
+                  </pic:spPr>
+                </pic:pic>
+              </a:graphicData>
+            </a:graphic>
+          </wp:inline>
+        </w:drawing>
+      </w:r>
+    </w:p>
+    <w:p>
+      <w:r>
+        <w:br w:type="page"/>
+      </w:r>
+    </w:p>
+    <w:p>
+      <w:pPr>
+        <w:pStyle w:val="Heading1"/>
+        <w:spacing w:before="0" w:after="80" w:line="259" w:lineRule="auto"/>
+      </w:pPr>
+      <w:r>
+        <w:rPr>
+          <w:rFonts w:ascii="Arial" w:hAnsi="Arial" w:eastAsia="Arial"/>
+          <w:b/>
+          <w:color w:val="000000"/>
+          <w:sz w:val="36"/>
+        </w:rPr>
+        <w:t>Enter match scores</w:t>
+      </w:r>
+    </w:p>
+    <w:p>
+      <w:pPr>
+        <w:pStyle w:val="ListBullet"/>
+        <w:spacing w:after="60" w:line="252" w:lineRule="auto"/>
+      </w:pPr>
+      <w:r>
+        <w:rPr>
+          <w:rFonts w:ascii="Arial" w:hAnsi="Arial" w:eastAsia="Arial"/>
+          <w:b w:val="0"/>
+          <w:color w:val="10233F"/>
+          <w:sz w:val="22"/>
+        </w:rPr>
+        <w:t>When both teams have published, score entry appears for the managers involved.</w:t>
+      </w:r>
+    </w:p>
+    <w:p>
+      <w:pPr>
+        <w:pStyle w:val="ListBullet"/>
+        <w:spacing w:after="60" w:line="252" w:lineRule="auto"/>
+      </w:pPr>
+      <w:r>
+        <w:rPr>
+          <w:rFonts w:ascii="Arial" w:hAnsi="Arial" w:eastAsia="Arial"/>
+          <w:b w:val="0"/>
+          <w:color w:val="10233F"/>
+          <w:sz w:val="22"/>
+        </w:rPr>
+        <w:t>Tap the team that won each game. Singles are worth 1 point. Doubles are worth 2 points.</w:t>
+      </w:r>
+    </w:p>
+    <w:p>
+      <w:pPr>
+        <w:pStyle w:val="ListBullet"/>
+        <w:spacing w:after="60" w:line="252" w:lineRule="auto"/>
+      </w:pPr>
+      <w:r>
+        <w:rPr>
+          <w:rFonts w:ascii="Arial" w:hAnsi="Arial" w:eastAsia="Arial"/>
+          <w:b w:val="0"/>
+          <w:color w:val="10233F"/>
+          <w:sz w:val="22"/>
+        </w:rPr>
+        <w:t>Press Match Completed only when everything has been checked. A completed match is locked.</w:t>
+      </w:r>
+    </w:p>
+    <w:p>
+      <w:pPr>
+        <w:spacing w:before="40" w:after="40"/>
+        <w:jc w:val="center"/>
+      </w:pPr>
+      <w:r>
+        <w:drawing>
+          <wp:inline xmlns:a="http://schemas.openxmlformats.org/drawingml/2006/main" xmlns:pic="http://schemas.openxmlformats.org/drawingml/2006/picture">
+            <wp:extent cx="2606040" cy="5212080"/>
+            <wp:docPr id="7" name="Picture 7"/>
+            <wp:cNvGraphicFramePr>
+              <a:graphicFrameLocks noChangeAspect="1"/>
+            </wp:cNvGraphicFramePr>
+            <a:graphic>
+              <a:graphicData uri="http://schemas.openxmlformats.org/drawingml/2006/picture">
+                <pic:pic>
+                  <pic:nvPicPr>
+                    <pic:cNvPr id="0" name="07-score-entry.png"/>
+                    <pic:cNvPicPr/>
+                  </pic:nvPicPr>
+                  <pic:blipFill>
+                    <a:blip r:embed="rId15"/>
+                    <a:stretch>
+                      <a:fillRect/>
+                    </a:stretch>
+                  </pic:blipFill>
+                  <pic:spPr>
+                    <a:xfrm>
+                      <a:off x="0" y="0"/>
+                      <a:ext cx="2606040" cy="5212080"/>
+                    </a:xfrm>
+                    <a:prstGeom prst="rect"/>
+                  </pic:spPr>
+                </pic:pic>
+              </a:graphicData>
+            </a:graphic>
+          </wp:inline>
+        </w:drawing>
+      </w:r>
+    </w:p>
+    <w:p>
+      <w:r>
+        <w:br w:type="page"/>
+      </w:r>
+    </w:p>
+    <w:p>
+      <w:pPr>
+        <w:pStyle w:val="Heading1"/>
+        <w:spacing w:before="0" w:after="80" w:line="259" w:lineRule="auto"/>
+      </w:pPr>
+      <w:r>
+        <w:rPr>
+          <w:rFonts w:ascii="Arial" w:hAnsi="Arial" w:eastAsia="Arial"/>
+          <w:b/>
+          <w:color w:val="000000"/>
+          <w:sz w:val="36"/>
+        </w:rPr>
+        <w:t>Record breaks</w:t>
+      </w:r>
+    </w:p>
+    <w:p>
+      <w:pPr>
+        <w:pStyle w:val="ListBullet"/>
+        <w:spacing w:after="60" w:line="252" w:lineRule="auto"/>
+      </w:pPr>
+      <w:r>
+        <w:rPr>
+          <w:rFonts w:ascii="Arial" w:hAnsi="Arial" w:eastAsia="Arial"/>
+          <w:b w:val="0"/>
+          <w:color w:val="10233F"/>
+          <w:sz w:val="22"/>
+        </w:rPr>
+        <w:t>Breaks are optional. Record them only when they are meaningful for the player record.</w:t>
+      </w:r>
+    </w:p>
+    <w:p>
+      <w:pPr>
+        <w:pStyle w:val="ListBullet"/>
+        <w:spacing w:after="60" w:line="252" w:lineRule="auto"/>
+      </w:pPr>
+      <w:r>
+        <w:rPr>
+          <w:rFonts w:ascii="Arial" w:hAnsi="Arial" w:eastAsia="Arial"/>
+          <w:b w:val="0"/>
+          <w:color w:val="10233F"/>
+          <w:sz w:val="22"/>
+        </w:rPr>
+        <w:t>Choose the player, enter the break value, and save it.</w:t>
+      </w:r>
+    </w:p>
+    <w:p>
+      <w:pPr>
+        <w:pStyle w:val="ListBullet"/>
+        <w:spacing w:after="60" w:line="252" w:lineRule="auto"/>
+      </w:pPr>
+      <w:r>
+        <w:rPr>
+          <w:rFonts w:ascii="Arial" w:hAnsi="Arial" w:eastAsia="Arial"/>
+          <w:b w:val="0"/>
+          <w:color w:val="10233F"/>
+          <w:sz w:val="22"/>
+        </w:rPr>
+        <w:t>Breaks are stored against the player, game, match and season so they appear in player records.</w:t>
+      </w:r>
+    </w:p>
+    <w:p>
+      <w:pPr>
+        <w:spacing w:before="40" w:after="40"/>
+        <w:jc w:val="center"/>
+      </w:pPr>
+      <w:r>
+        <w:drawing>
+          <wp:inline xmlns:a="http://schemas.openxmlformats.org/drawingml/2006/main" xmlns:pic="http://schemas.openxmlformats.org/drawingml/2006/picture">
+            <wp:extent cx="2606040" cy="5212080"/>
+            <wp:docPr id="8" name="Picture 8"/>
+            <wp:cNvGraphicFramePr>
+              <a:graphicFrameLocks noChangeAspect="1"/>
+            </wp:cNvGraphicFramePr>
+            <a:graphic>
+              <a:graphicData uri="http://schemas.openxmlformats.org/drawingml/2006/picture">
+                <pic:pic>
+                  <pic:nvPicPr>
+                    <pic:cNvPr id="0" name="08-break-entry.png"/>
+                    <pic:cNvPicPr/>
+                  </pic:nvPicPr>
+                  <pic:blipFill>
+                    <a:blip r:embed="rId16"/>
+                    <a:stretch>
+                      <a:fillRect/>
+                    </a:stretch>
+                  </pic:blipFill>
+                  <pic:spPr>
+                    <a:xfrm>
+                      <a:off x="0" y="0"/>
+                      <a:ext cx="2606040" cy="5212080"/>
+                    </a:xfrm>
+                    <a:prstGeom prst="rect"/>
+                  </pic:spPr>
+                </pic:pic>
+              </a:graphicData>
+            </a:graphic>
+          </wp:inline>
+        </w:drawing>
+      </w:r>
+    </w:p>
+    <w:p>
+      <w:r>
+        <w:br w:type="page"/>
+      </w:r>
+    </w:p>
+    <w:p>
+      <w:pPr>
+        <w:pStyle w:val="Heading1"/>
+        <w:spacing w:before="0" w:after="80" w:line="259" w:lineRule="auto"/>
+      </w:pPr>
+      <w:r>
+        <w:rPr>
+          <w:rFonts w:ascii="Arial" w:hAnsi="Arial" w:eastAsia="Arial"/>
+          <w:b/>
+          <w:color w:val="000000"/>
+          <w:sz w:val="36"/>
+        </w:rPr>
+        <w:t>My Club</w:t>
+      </w:r>
+    </w:p>
+    <w:p>
+      <w:pPr>
+        <w:pStyle w:val="ListBullet"/>
+        <w:spacing w:after="60" w:line="252" w:lineRule="auto"/>
+      </w:pPr>
+      <w:r>
+        <w:rPr>
+          <w:rFonts w:ascii="Arial" w:hAnsi="Arial" w:eastAsia="Arial"/>
+          <w:b w:val="0"/>
+          <w:color w:val="10233F"/>
+          <w:sz w:val="22"/>
+        </w:rPr>
+        <w:t>My Club contains club features such as table bookings, Castle competitions and club games.</w:t>
+      </w:r>
+    </w:p>
+    <w:p>
+      <w:pPr>
+        <w:pStyle w:val="ListBullet"/>
+        <w:spacing w:after="60" w:line="252" w:lineRule="auto"/>
+      </w:pPr>
+      <w:r>
+        <w:rPr>
+          <w:rFonts w:ascii="Arial" w:hAnsi="Arial" w:eastAsia="Arial"/>
+          <w:b w:val="0"/>
+          <w:color w:val="10233F"/>
+          <w:sz w:val="22"/>
+        </w:rPr>
+        <w:t>Table bookings are currently set up for Castle only. Other clubs see a message saying it has not been set up yet.</w:t>
+      </w:r>
+    </w:p>
+    <w:p>
+      <w:pPr>
+        <w:pStyle w:val="ListBullet"/>
+        <w:spacing w:after="60" w:line="252" w:lineRule="auto"/>
+      </w:pPr>
+      <w:r>
+        <w:rPr>
+          <w:rFonts w:ascii="Arial" w:hAnsi="Arial" w:eastAsia="Arial"/>
+          <w:b w:val="0"/>
+          <w:color w:val="10233F"/>
+          <w:sz w:val="22"/>
+        </w:rPr>
+        <w:t>Club competitions show what you can enter and what you are already playing in.</w:t>
+      </w:r>
+    </w:p>
+    <w:p>
+      <w:pPr>
+        <w:spacing w:before="40" w:after="40"/>
+        <w:jc w:val="center"/>
+      </w:pPr>
+      <w:r>
+        <w:drawing>
+          <wp:inline xmlns:a="http://schemas.openxmlformats.org/drawingml/2006/main" xmlns:pic="http://schemas.openxmlformats.org/drawingml/2006/picture">
+            <wp:extent cx="2606040" cy="5212080"/>
+            <wp:docPr id="9" name="Picture 9"/>
+            <wp:cNvGraphicFramePr>
+              <a:graphicFrameLocks noChangeAspect="1"/>
+            </wp:cNvGraphicFramePr>
+            <a:graphic>
+              <a:graphicData uri="http://schemas.openxmlformats.org/drawingml/2006/picture">
+                <pic:pic>
+                  <pic:nvPicPr>
+                    <pic:cNvPr id="0" name="09-my-club.png"/>
+                    <pic:cNvPicPr/>
+                  </pic:nvPicPr>
+                  <pic:blipFill>
+                    <a:blip r:embed="rId17"/>
+                    <a:stretch>
+                      <a:fillRect/>
+                    </a:stretch>
+                  </pic:blipFill>
+                  <pic:spPr>
+                    <a:xfrm>
+                      <a:off x="0" y="0"/>
+                      <a:ext cx="2606040" cy="5212080"/>
+                    </a:xfrm>
+                    <a:prstGeom prst="rect"/>
+                  </pic:spPr>
+                </pic:pic>
+              </a:graphicData>
+            </a:graphic>
+          </wp:inline>
+        </w:drawing>
+      </w:r>
+    </w:p>
+    <w:p>
+      <w:r>
+        <w:br w:type="page"/>
+      </w:r>
+    </w:p>
+    <w:p>
+      <w:pPr>
+        <w:pStyle w:val="Heading1"/>
+        <w:spacing w:before="0" w:after="80" w:line="259" w:lineRule="auto"/>
+      </w:pPr>
+      <w:r>
+        <w:rPr>
+          <w:rFonts w:ascii="Arial" w:hAnsi="Arial" w:eastAsia="Arial"/>
+          <w:b/>
+          <w:color w:val="000000"/>
+          <w:sz w:val="36"/>
+        </w:rPr>
+        <w:t>Quick match night checklist</w:t>
+      </w:r>
+    </w:p>
+    <w:p>
+      <w:pPr>
+        <w:pStyle w:val="ListBullet"/>
+        <w:spacing w:after="60" w:line="252" w:lineRule="auto"/>
+      </w:pPr>
+      <w:r>
+        <w:rPr>
+          <w:rFonts w:ascii="Arial" w:hAnsi="Arial" w:eastAsia="Arial"/>
+          <w:b w:val="0"/>
+          <w:color w:val="10233F"/>
+          <w:sz w:val="22"/>
+        </w:rPr>
+        <w:t>Manager opens their own match from Fixtures or Next Match.</w:t>
+      </w:r>
+    </w:p>
+    <w:p>
+      <w:pPr>
+        <w:pStyle w:val="ListBullet"/>
+        <w:spacing w:after="60" w:line="252" w:lineRule="auto"/>
+      </w:pPr>
+      <w:r>
+        <w:rPr>
+          <w:rFonts w:ascii="Arial" w:hAnsi="Arial" w:eastAsia="Arial"/>
+          <w:b w:val="0"/>
+          <w:color w:val="10233F"/>
+          <w:sz w:val="22"/>
+        </w:rPr>
+        <w:t>Manager fills the team sheet, checks it, then publishes.</w:t>
+      </w:r>
+    </w:p>
+    <w:p>
+      <w:pPr>
+        <w:pStyle w:val="ListBullet"/>
+        <w:spacing w:after="60" w:line="252" w:lineRule="auto"/>
+      </w:pPr>
+      <w:r>
+        <w:rPr>
+          <w:rFonts w:ascii="Arial" w:hAnsi="Arial" w:eastAsia="Arial"/>
+          <w:b w:val="0"/>
+          <w:color w:val="10233F"/>
+          <w:sz w:val="22"/>
+        </w:rPr>
+        <w:t>When both teams publish, score entry becomes available to the managers involved.</w:t>
+      </w:r>
+    </w:p>
+    <w:p>
+      <w:pPr>
+        <w:pStyle w:val="ListBullet"/>
+        <w:spacing w:after="60" w:line="252" w:lineRule="auto"/>
+      </w:pPr>
+      <w:r>
+        <w:rPr>
+          <w:rFonts w:ascii="Arial" w:hAnsi="Arial" w:eastAsia="Arial"/>
+          <w:b w:val="0"/>
+          <w:color w:val="10233F"/>
+          <w:sz w:val="22"/>
+        </w:rPr>
+        <w:t>Record any worthwhile breaks against the correct player and game.</w:t>
+      </w:r>
+    </w:p>
+    <w:p>
+      <w:pPr>
+        <w:pStyle w:val="ListBullet"/>
+        <w:spacing w:after="60" w:line="252" w:lineRule="auto"/>
+      </w:pPr>
+      <w:r>
+        <w:rPr>
+          <w:rFonts w:ascii="Arial" w:hAnsi="Arial" w:eastAsia="Arial"/>
+          <w:b w:val="0"/>
+          <w:color w:val="10233F"/>
+          <w:sz w:val="22"/>
+        </w:rPr>
+        <w:t>One manager presses Match Completed after all games are correct.</w:t>
+      </w:r>
+    </w:p>
+    <w:p>
+      <w:pPr>
+        <w:pStyle w:val="ListBullet"/>
+        <w:spacing w:after="60" w:line="252" w:lineRule="auto"/>
+      </w:pPr>
+      <w:r>
+        <w:rPr>
+          <w:rFonts w:ascii="Arial" w:hAnsi="Arial" w:eastAsia="Arial"/>
+          <w:b w:val="0"/>
+          <w:color w:val="10233F"/>
+          <w:sz w:val="22"/>
+        </w:rPr>
+        <w:t>Players can follow live or published match details but cannot edit them.</w:t>
+      </w:r>
+    </w:p>
+    <w:p>
+      <w:pPr>
+        <w:pStyle w:val="Heading1"/>
+        <w:spacing w:before="200" w:after="80" w:line="259" w:lineRule="auto"/>
+      </w:pPr>
+      <w:r>
+        <w:rPr>
+          <w:rFonts w:ascii="Arial" w:hAnsi="Arial" w:eastAsia="Arial"/>
+          <w:b/>
+          <w:color w:val="000000"/>
+          <w:sz w:val="36"/>
+        </w:rPr>
+        <w:t>If something looks wrong</w:t>
+      </w:r>
+    </w:p>
+    <w:p>
+      <w:pPr>
+        <w:spacing w:before="0" w:after="100" w:line="259" w:lineRule="auto"/>
+      </w:pPr>
+      <w:r>
+        <w:rPr>
+          <w:rFonts w:ascii="Arial" w:hAnsi="Arial" w:eastAsia="Arial"/>
+          <w:b w:val="0"/>
+          <w:color w:val="10233F"/>
+          <w:sz w:val="23"/>
+        </w:rPr>
+        <w:t>Refresh the page first. If a lineup, score or break still looks wrong, ask the manager or club administrator to check it. Once a match has been completed it is intentionally locked, so a correction needs an administrator to reset or amend it deliberately.</w:t>
       </w:r>
     </w:p>
     <w:sectPr>
-      <w:pgSz w:w="11909" w:h="16834"/>
-      <w:pgMar w:top="605" w:right="605" w:bottom="605" w:left="605" w:header="720" w:footer="720" w:gutter="0"/>
+      <w:pgSz w:w="12240" w:h="15840"/>
+      <w:pgMar w:top="648" w:right="893" w:bottom="605" w:left="893" w:header="720" w:footer="720" w:gutter="0"/>
       <w:cols w:space="720"/>
       <w:docGrid w:linePitch="360"/>
     </w:sectPr>
@@ -1980,7 +1568,8 @@
     <w:rsid w:val="00FC693F"/>
     <w:rPr>
       <w:rFonts w:ascii="Arial" w:hAnsi="Arial" w:eastAsia="Arial"/>
-      <w:sz w:val="18"/>
+      <w:color w:val="10233F"/>
+      <w:sz w:val="23"/>
     </w:rPr>
   </w:style>
   <w:style w:type="paragraph" w:styleId="Header">
@@ -2042,11 +1631,11 @@
       <w:outlineLvl w:val="0"/>
     </w:pPr>
     <w:rPr>
-      <w:rFonts w:asciiTheme="majorHAnsi" w:eastAsiaTheme="majorEastAsia" w:hAnsiTheme="majorHAnsi" w:cstheme="majorBidi"/>
+      <w:rFonts w:asciiTheme="majorHAnsi" w:eastAsiaTheme="majorEastAsia" w:hAnsiTheme="majorHAnsi" w:cstheme="majorBidi" w:ascii="Arial" w:hAnsi="Arial" w:eastAsia="Arial"/>
       <w:b/>
       <w:bCs/>
-      <w:color w:val="365F91" w:themeColor="accent1" w:themeShade="BF"/>
-      <w:sz w:val="28"/>
+      <w:color w:val="000000"/>
+      <w:sz w:val="36"/>
       <w:szCs w:val="28"/>
     </w:rPr>
   </w:style>
@@ -2066,10 +1655,10 @@
       <w:outlineLvl w:val="1"/>
     </w:pPr>
     <w:rPr>
-      <w:rFonts w:asciiTheme="majorHAnsi" w:eastAsiaTheme="majorEastAsia" w:hAnsiTheme="majorHAnsi" w:cstheme="majorBidi"/>
+      <w:rFonts w:asciiTheme="majorHAnsi" w:eastAsiaTheme="majorEastAsia" w:hAnsiTheme="majorHAnsi" w:cstheme="majorBidi" w:ascii="Arial" w:hAnsi="Arial" w:eastAsia="Arial"/>
       <w:b/>
       <w:bCs/>
-      <w:color w:val="4F81BD" w:themeColor="accent1"/>
+      <w:color w:val="000000"/>
       <w:sz w:val="26"/>
       <w:szCs w:val="26"/>
     </w:rPr>
@@ -2331,11 +1920,12 @@
       <w:contextualSpacing/>
     </w:pPr>
     <w:rPr>
-      <w:rFonts w:asciiTheme="majorHAnsi" w:eastAsiaTheme="majorEastAsia" w:hAnsiTheme="majorHAnsi" w:cstheme="majorBidi"/>
-      <w:color w:val="17365D" w:themeColor="text2" w:themeShade="BF"/>
+      <w:rFonts w:asciiTheme="majorHAnsi" w:eastAsiaTheme="majorEastAsia" w:hAnsiTheme="majorHAnsi" w:cstheme="majorBidi" w:ascii="Arial" w:hAnsi="Arial" w:eastAsia="Arial"/>
+      <w:b/>
+      <w:color w:val="000000"/>
       <w:spacing w:val="5"/>
       <w:kern w:val="28"/>
-      <w:sz w:val="52"/>
+      <w:sz w:val="44"/>
       <w:szCs w:val="52"/>
     </w:rPr>
   </w:style>
@@ -2513,7 +2103,7 @@
     </w:pPr>
     <w:rPr>
       <w:rFonts w:ascii="Arial" w:hAnsi="Arial" w:eastAsia="Arial"/>
-      <w:sz w:val="17"/>
+      <w:color w:val="10233F"/>
     </w:rPr>
   </w:style>
   <w:style w:type="paragraph" w:styleId="ListBullet2">

</xml_diff>

<commit_message>
Rebuild pointers guide with live screenshots
</commit_message>
<xml_diff>
--- a/docs/Pointers on Using the Interclub Snooker App (Mobile Friendly).docx
+++ b/docs/Pointers on Using the Interclub Snooker App (Mobile Friendly).docx
@@ -8,166 +8,345 @@
         <w:jc w:val="center"/>
       </w:pPr>
       <w:r>
-        <w:t>Pointers on Using the Interclub Snooker App Mobile Friendly</w:t>
+        <w:t>Pointers on Using the Interclub Snooker App</w:t>
       </w:r>
     </w:p>
     <w:p>
       <w:pPr>
-        <w:spacing w:before="0" w:after="200" w:line="259" w:lineRule="auto"/>
         <w:jc w:val="center"/>
       </w:pPr>
       <w:r>
         <w:rPr>
-          <w:rFonts w:ascii="Arial" w:hAnsi="Arial" w:eastAsia="Arial"/>
-          <w:b w:val="0"/>
-          <w:color w:val="4B5A6D"/>
-          <w:sz w:val="24"/>
+          <w:color w:val="4E5B6E"/>
+          <w:sz w:val="28"/>
         </w:rPr>
-        <w:t>A practical phone guide for players and managers</w:t>
+        <w:t>Mobile friendly guide for players and managers</w:t>
       </w:r>
     </w:p>
     <w:p>
       <w:pPr>
-        <w:spacing w:before="0" w:after="160" w:line="259" w:lineRule="auto"/>
+        <w:spacing w:after="160" w:line="250" w:lineRule="auto"/>
       </w:pPr>
       <w:r>
-        <w:rPr>
-          <w:rFonts w:ascii="Arial" w:hAnsi="Arial" w:eastAsia="Arial"/>
-          <w:b w:val="0"/>
-          <w:color w:val="10233F"/>
-          <w:sz w:val="23"/>
-        </w:rPr>
-        <w:t>This guide is for normal app use, not administration. It explains how to sign in, understand the home page, follow fixtures, view tables, pick a team, enter match results, record breaks, and use club features.</w:t>
+        <w:t>This guide uses real mobile screens from interclubsnooker.com. It focuses on the things people need most often: signing in, checking their home screen, using fixtures, reading tables, and understanding manager match screens.</w:t>
       </w:r>
     </w:p>
     <w:p>
       <w:pPr>
-        <w:spacing w:before="0" w:after="80" w:line="259" w:lineRule="auto"/>
+        <w:pStyle w:val="Heading2"/>
+        <w:spacing w:after="80" w:line="250" w:lineRule="auto"/>
       </w:pPr>
       <w:r>
-        <w:rPr>
-          <w:rFonts w:ascii="Arial" w:hAnsi="Arial" w:eastAsia="Arial"/>
-          <w:b/>
-          <w:color w:val="000000"/>
-          <w:sz w:val="28"/>
-        </w:rPr>
-        <w:t>Current app rules</w:t>
+        <w:t>Fast start</w:t>
       </w:r>
     </w:p>
+    <w:tbl>
+      <w:tblPr>
+        <w:tblW w:type="auto" w:w="0"/>
+        <w:tblLayout w:type="fixed"/>
+        <w:tblLook w:firstColumn="1" w:firstRow="1" w:lastColumn="0" w:lastRow="0" w:noHBand="0" w:noVBand="1" w:val="04A0"/>
+      </w:tblPr>
+      <w:tblGrid>
+        <w:gridCol w:w="1152"/>
+        <w:gridCol w:w="9648"/>
+      </w:tblGrid>
+      <w:tr>
+        <w:tc>
+          <w:tcPr>
+            <w:tcW w:type="dxa" w:w="5472"/>
+            <w:shd w:fill="102743"/>
+            <w:tcBorders>
+              <w:top w:val="single" w:sz="6" w:space="0" w:color="D9D9D9"/>
+              <w:left w:val="single" w:sz="6" w:space="0" w:color="D9D9D9"/>
+              <w:bottom w:val="single" w:sz="6" w:space="0" w:color="D9D9D9"/>
+              <w:right w:val="single" w:sz="6" w:space="0" w:color="D9D9D9"/>
+            </w:tcBorders>
+          </w:tcPr>
+          <w:p>
+            <w:pPr>
+              <w:spacing w:after="20"/>
+            </w:pPr>
+            <w:r>
+              <w:rPr>
+                <w:rFonts w:ascii="Aptos" w:hAnsi="Aptos"/>
+                <w:b/>
+                <w:color w:val="FFFFFF"/>
+                <w:sz w:val="23"/>
+              </w:rPr>
+              <w:t>Step</w:t>
+            </w:r>
+          </w:p>
+        </w:tc>
+        <w:tc>
+          <w:tcPr>
+            <w:tcW w:type="dxa" w:w="5472"/>
+            <w:shd w:fill="102743"/>
+            <w:tcBorders>
+              <w:top w:val="single" w:sz="6" w:space="0" w:color="D9D9D9"/>
+              <w:left w:val="single" w:sz="6" w:space="0" w:color="D9D9D9"/>
+              <w:bottom w:val="single" w:sz="6" w:space="0" w:color="D9D9D9"/>
+              <w:right w:val="single" w:sz="6" w:space="0" w:color="D9D9D9"/>
+            </w:tcBorders>
+          </w:tcPr>
+          <w:p>
+            <w:pPr>
+              <w:spacing w:after="20"/>
+            </w:pPr>
+            <w:r>
+              <w:rPr>
+                <w:rFonts w:ascii="Aptos" w:hAnsi="Aptos"/>
+                <w:b/>
+                <w:color w:val="FFFFFF"/>
+                <w:sz w:val="23"/>
+              </w:rPr>
+              <w:t>What to do</w:t>
+            </w:r>
+          </w:p>
+        </w:tc>
+      </w:tr>
+      <w:tr>
+        <w:tc>
+          <w:tcPr>
+            <w:tcW w:type="dxa" w:w="1152"/>
+            <w:tcBorders>
+              <w:top w:val="single" w:sz="6" w:space="0" w:color="D9D9D9"/>
+              <w:left w:val="single" w:sz="6" w:space="0" w:color="D9D9D9"/>
+              <w:bottom w:val="single" w:sz="6" w:space="0" w:color="D9D9D9"/>
+              <w:right w:val="single" w:sz="6" w:space="0" w:color="D9D9D9"/>
+            </w:tcBorders>
+          </w:tcPr>
+          <w:p>
+            <w:pPr>
+              <w:spacing w:after="20"/>
+            </w:pPr>
+            <w:r>
+              <w:rPr>
+                <w:rFonts w:ascii="Aptos" w:hAnsi="Aptos"/>
+                <w:sz w:val="23"/>
+              </w:rPr>
+              <w:t>1</w:t>
+            </w:r>
+          </w:p>
+        </w:tc>
+        <w:tc>
+          <w:tcPr>
+            <w:tcW w:type="dxa" w:w="9648"/>
+            <w:tcBorders>
+              <w:top w:val="single" w:sz="6" w:space="0" w:color="D9D9D9"/>
+              <w:left w:val="single" w:sz="6" w:space="0" w:color="D9D9D9"/>
+              <w:bottom w:val="single" w:sz="6" w:space="0" w:color="D9D9D9"/>
+              <w:right w:val="single" w:sz="6" w:space="0" w:color="D9D9D9"/>
+            </w:tcBorders>
+          </w:tcPr>
+          <w:p>
+            <w:pPr>
+              <w:spacing w:after="20"/>
+            </w:pPr>
+            <w:r>
+              <w:rPr>
+                <w:rFonts w:ascii="Aptos" w:hAnsi="Aptos"/>
+                <w:sz w:val="23"/>
+              </w:rPr>
+              <w:t>Sign in with the account created by your club or league administrator.</w:t>
+            </w:r>
+          </w:p>
+        </w:tc>
+      </w:tr>
+      <w:tr>
+        <w:tc>
+          <w:tcPr>
+            <w:tcW w:type="dxa" w:w="1152"/>
+            <w:tcBorders>
+              <w:top w:val="single" w:sz="6" w:space="0" w:color="D9D9D9"/>
+              <w:left w:val="single" w:sz="6" w:space="0" w:color="D9D9D9"/>
+              <w:bottom w:val="single" w:sz="6" w:space="0" w:color="D9D9D9"/>
+              <w:right w:val="single" w:sz="6" w:space="0" w:color="D9D9D9"/>
+            </w:tcBorders>
+          </w:tcPr>
+          <w:p>
+            <w:pPr>
+              <w:spacing w:after="20"/>
+            </w:pPr>
+            <w:r>
+              <w:rPr>
+                <w:rFonts w:ascii="Aptos" w:hAnsi="Aptos"/>
+                <w:sz w:val="23"/>
+              </w:rPr>
+              <w:t>2</w:t>
+            </w:r>
+          </w:p>
+        </w:tc>
+        <w:tc>
+          <w:tcPr>
+            <w:tcW w:type="dxa" w:w="9648"/>
+            <w:tcBorders>
+              <w:top w:val="single" w:sz="6" w:space="0" w:color="D9D9D9"/>
+              <w:left w:val="single" w:sz="6" w:space="0" w:color="D9D9D9"/>
+              <w:bottom w:val="single" w:sz="6" w:space="0" w:color="D9D9D9"/>
+              <w:right w:val="single" w:sz="6" w:space="0" w:color="D9D9D9"/>
+            </w:tcBorders>
+          </w:tcPr>
+          <w:p>
+            <w:pPr>
+              <w:spacing w:after="20"/>
+            </w:pPr>
+            <w:r>
+              <w:rPr>
+                <w:rFonts w:ascii="Aptos" w:hAnsi="Aptos"/>
+                <w:sz w:val="23"/>
+              </w:rPr>
+              <w:t>If you have more than one role, choose the role you want at the top.</w:t>
+            </w:r>
+          </w:p>
+        </w:tc>
+      </w:tr>
+      <w:tr>
+        <w:tc>
+          <w:tcPr>
+            <w:tcW w:type="dxa" w:w="1152"/>
+            <w:tcBorders>
+              <w:top w:val="single" w:sz="6" w:space="0" w:color="D9D9D9"/>
+              <w:left w:val="single" w:sz="6" w:space="0" w:color="D9D9D9"/>
+              <w:bottom w:val="single" w:sz="6" w:space="0" w:color="D9D9D9"/>
+              <w:right w:val="single" w:sz="6" w:space="0" w:color="D9D9D9"/>
+            </w:tcBorders>
+          </w:tcPr>
+          <w:p>
+            <w:pPr>
+              <w:spacing w:after="20"/>
+            </w:pPr>
+            <w:r>
+              <w:rPr>
+                <w:rFonts w:ascii="Aptos" w:hAnsi="Aptos"/>
+                <w:sz w:val="23"/>
+              </w:rPr>
+              <w:t>3</w:t>
+            </w:r>
+          </w:p>
+        </w:tc>
+        <w:tc>
+          <w:tcPr>
+            <w:tcW w:type="dxa" w:w="9648"/>
+            <w:tcBorders>
+              <w:top w:val="single" w:sz="6" w:space="0" w:color="D9D9D9"/>
+              <w:left w:val="single" w:sz="6" w:space="0" w:color="D9D9D9"/>
+              <w:bottom w:val="single" w:sz="6" w:space="0" w:color="D9D9D9"/>
+              <w:right w:val="single" w:sz="6" w:space="0" w:color="D9D9D9"/>
+            </w:tcBorders>
+          </w:tcPr>
+          <w:p>
+            <w:pPr>
+              <w:spacing w:after="20"/>
+            </w:pPr>
+            <w:r>
+              <w:rPr>
+                <w:rFonts w:ascii="Aptos" w:hAnsi="Aptos"/>
+                <w:sz w:val="23"/>
+              </w:rPr>
+              <w:t>Use the bottom tabs: Home, Fixtures, Tables, My Club and More.</w:t>
+            </w:r>
+          </w:p>
+        </w:tc>
+      </w:tr>
+      <w:tr>
+        <w:tc>
+          <w:tcPr>
+            <w:tcW w:type="dxa" w:w="1152"/>
+            <w:tcBorders>
+              <w:top w:val="single" w:sz="6" w:space="0" w:color="D9D9D9"/>
+              <w:left w:val="single" w:sz="6" w:space="0" w:color="D9D9D9"/>
+              <w:bottom w:val="single" w:sz="6" w:space="0" w:color="D9D9D9"/>
+              <w:right w:val="single" w:sz="6" w:space="0" w:color="D9D9D9"/>
+            </w:tcBorders>
+          </w:tcPr>
+          <w:p>
+            <w:pPr>
+              <w:spacing w:after="20"/>
+            </w:pPr>
+            <w:r>
+              <w:rPr>
+                <w:rFonts w:ascii="Aptos" w:hAnsi="Aptos"/>
+                <w:sz w:val="23"/>
+              </w:rPr>
+              <w:t>4</w:t>
+            </w:r>
+          </w:p>
+        </w:tc>
+        <w:tc>
+          <w:tcPr>
+            <w:tcW w:type="dxa" w:w="9648"/>
+            <w:tcBorders>
+              <w:top w:val="single" w:sz="6" w:space="0" w:color="D9D9D9"/>
+              <w:left w:val="single" w:sz="6" w:space="0" w:color="D9D9D9"/>
+              <w:bottom w:val="single" w:sz="6" w:space="0" w:color="D9D9D9"/>
+              <w:right w:val="single" w:sz="6" w:space="0" w:color="D9D9D9"/>
+            </w:tcBorders>
+          </w:tcPr>
+          <w:p>
+            <w:pPr>
+              <w:spacing w:after="20"/>
+            </w:pPr>
+            <w:r>
+              <w:rPr>
+                <w:rFonts w:ascii="Aptos" w:hAnsi="Aptos"/>
+                <w:sz w:val="23"/>
+              </w:rPr>
+              <w:t>Managers use Fixtures to open their own match when lineups, scores or breaks need attention.</w:t>
+            </w:r>
+          </w:p>
+        </w:tc>
+      </w:tr>
+    </w:tbl>
     <w:p>
-      <w:pPr>
-        <w:pStyle w:val="ListBullet"/>
-        <w:spacing w:after="60" w:line="252" w:lineRule="auto"/>
-      </w:pPr>
       <w:r>
-        <w:rPr>
-          <w:rFonts w:ascii="Arial" w:hAnsi="Arial" w:eastAsia="Arial"/>
-          <w:b w:val="0"/>
-          <w:color w:val="10233F"/>
-          <w:sz w:val="22"/>
-        </w:rPr>
-        <w:t>There is no season picker in the main app. The app uses the current season automatically.</w:t>
-      </w:r>
-    </w:p>
-    <w:p>
-      <w:pPr>
-        <w:pStyle w:val="ListBullet"/>
-        <w:spacing w:after="60" w:line="252" w:lineRule="auto"/>
-      </w:pPr>
-      <w:r>
-        <w:rPr>
-          <w:rFonts w:ascii="Arial" w:hAnsi="Arial" w:eastAsia="Arial"/>
-          <w:b w:val="0"/>
-          <w:color w:val="10233F"/>
-          <w:sz w:val="22"/>
-        </w:rPr>
-        <w:t>Most people have one role and will not see a role switcher. People with multiple roles can switch role at the top.</w:t>
-      </w:r>
-    </w:p>
-    <w:p>
-      <w:pPr>
-        <w:pStyle w:val="ListBullet"/>
-        <w:spacing w:after="60" w:line="252" w:lineRule="auto"/>
-      </w:pPr>
-      <w:r>
-        <w:rPr>
-          <w:rFonts w:ascii="Arial" w:hAnsi="Arial" w:eastAsia="Arial"/>
-          <w:b w:val="0"/>
-          <w:color w:val="10233F"/>
-          <w:sz w:val="22"/>
-        </w:rPr>
-        <w:t>Players can follow live or published match details. Managers can edit only matches involving the team they manage.</w:t>
+        <w:br w:type="page"/>
       </w:r>
     </w:p>
     <w:p>
       <w:pPr>
         <w:pStyle w:val="Heading1"/>
-        <w:spacing w:before="100" w:after="60" w:line="259" w:lineRule="auto"/>
+        <w:spacing w:after="80" w:line="250" w:lineRule="auto"/>
       </w:pPr>
       <w:r>
-        <w:rPr>
-          <w:rFonts w:ascii="Arial" w:hAnsi="Arial" w:eastAsia="Arial"/>
-          <w:b/>
-          <w:color w:val="000000"/>
-          <w:sz w:val="32"/>
-        </w:rPr>
         <w:t>Sign in</w:t>
       </w:r>
     </w:p>
     <w:p>
       <w:pPr>
         <w:pStyle w:val="ListBullet"/>
-        <w:spacing w:after="60" w:line="252" w:lineRule="auto"/>
+        <w:spacing w:after="20" w:line="240" w:lineRule="auto"/>
       </w:pPr>
       <w:r>
-        <w:rPr>
-          <w:rFonts w:ascii="Arial" w:hAnsi="Arial" w:eastAsia="Arial"/>
-          <w:b w:val="0"/>
-          <w:color w:val="10233F"/>
-          <w:sz w:val="22"/>
-        </w:rPr>
-        <w:t>Your account must be created through an invite or by an administrator.</w:t>
+        <w:t>Use the email address linked to your account.</w:t>
       </w:r>
     </w:p>
     <w:p>
       <w:pPr>
         <w:pStyle w:val="ListBullet"/>
-        <w:spacing w:after="60" w:line="252" w:lineRule="auto"/>
+        <w:spacing w:after="20" w:line="240" w:lineRule="auto"/>
       </w:pPr>
       <w:r>
-        <w:rPr>
-          <w:rFonts w:ascii="Arial" w:hAnsi="Arial" w:eastAsia="Arial"/>
-          <w:b w:val="0"/>
-          <w:color w:val="10233F"/>
-          <w:sz w:val="22"/>
-        </w:rPr>
-        <w:t>Use your email address and password, or Google sign in if that email is connected to your account.</w:t>
+        <w:t>Sign in with password or Google where your account supports it.</w:t>
       </w:r>
     </w:p>
     <w:p>
       <w:pPr>
         <w:pStyle w:val="ListBullet"/>
-        <w:spacing w:after="60" w:line="252" w:lineRule="auto"/>
+        <w:spacing w:after="20" w:line="240" w:lineRule="auto"/>
       </w:pPr>
       <w:r>
-        <w:rPr>
-          <w:rFonts w:ascii="Arial" w:hAnsi="Arial" w:eastAsia="Arial"/>
-          <w:b w:val="0"/>
-          <w:color w:val="10233F"/>
-          <w:sz w:val="22"/>
-        </w:rPr>
-        <w:t>After first login, bookmark interclubsnooker.com on your phone.</w:t>
+        <w:t>Accounts are created by an administrator; there is no public self registration.</w:t>
       </w:r>
     </w:p>
     <w:p>
       <w:pPr>
-        <w:spacing w:before="40" w:after="40"/>
+        <w:spacing w:before="80" w:after="20"/>
         <w:jc w:val="center"/>
       </w:pPr>
       <w:r>
         <w:drawing>
           <wp:inline xmlns:a="http://schemas.openxmlformats.org/drawingml/2006/main" xmlns:pic="http://schemas.openxmlformats.org/drawingml/2006/picture">
-            <wp:extent cx="2240280" cy="4480560"/>
+            <wp:extent cx="3246120" cy="7024937"/>
             <wp:docPr id="1" name="Picture 1"/>
             <wp:cNvGraphicFramePr>
               <a:graphicFrameLocks noChangeAspect="1"/>
@@ -176,7 +355,7 @@
               <a:graphicData uri="http://schemas.openxmlformats.org/drawingml/2006/picture">
                 <pic:pic>
                   <pic:nvPicPr>
-                    <pic:cNvPr id="0" name="01-sign-in.png"/>
+                    <pic:cNvPr id="0" name="01-sign-in-real.png"/>
                     <pic:cNvPicPr/>
                   </pic:nvPicPr>
                   <pic:blipFill>
@@ -188,7 +367,7 @@
                   <pic:spPr>
                     <a:xfrm>
                       <a:off x="0" y="0"/>
-                      <a:ext cx="2240280" cy="4480560"/>
+                      <a:ext cx="3246120" cy="7024937"/>
                     </a:xfrm>
                     <a:prstGeom prst="rect"/>
                   </pic:spPr>
@@ -200,6 +379,19 @@
       </w:r>
     </w:p>
     <w:p>
+      <w:pPr>
+        <w:spacing w:after="0"/>
+        <w:jc w:val="center"/>
+      </w:pPr>
+      <w:r>
+        <w:rPr>
+          <w:color w:val="5F6A7A"/>
+          <w:sz w:val="19"/>
+        </w:rPr>
+        <w:t>Live sign-in screen.</w:t>
+      </w:r>
+    </w:p>
+    <w:p>
       <w:r>
         <w:br w:type="page"/>
       </w:r>
@@ -207,72 +399,48 @@
     <w:p>
       <w:pPr>
         <w:pStyle w:val="Heading1"/>
-        <w:spacing w:before="0" w:after="80" w:line="259" w:lineRule="auto"/>
+        <w:spacing w:after="80" w:line="250" w:lineRule="auto"/>
       </w:pPr>
       <w:r>
-        <w:rPr>
-          <w:rFonts w:ascii="Arial" w:hAnsi="Arial" w:eastAsia="Arial"/>
-          <w:b/>
-          <w:color w:val="000000"/>
-          <w:sz w:val="36"/>
-        </w:rPr>
         <w:t>Player home</w:t>
       </w:r>
     </w:p>
     <w:p>
       <w:pPr>
         <w:pStyle w:val="ListBullet"/>
-        <w:spacing w:after="60" w:line="252" w:lineRule="auto"/>
+        <w:spacing w:after="20" w:line="240" w:lineRule="auto"/>
       </w:pPr>
       <w:r>
-        <w:rPr>
-          <w:rFonts w:ascii="Arial" w:hAnsi="Arial" w:eastAsia="Arial"/>
-          <w:b w:val="0"/>
-          <w:color w:val="10233F"/>
-          <w:sz w:val="22"/>
-        </w:rPr>
-        <w:t>The player home page shows your name, role, team, current week fixtures, personal stats and recent form.</w:t>
+        <w:t>Home shows who is signed in and which team or role is active.</w:t>
       </w:r>
     </w:p>
     <w:p>
       <w:pPr>
         <w:pStyle w:val="ListBullet"/>
-        <w:spacing w:after="60" w:line="252" w:lineRule="auto"/>
+        <w:spacing w:after="20" w:line="240" w:lineRule="auto"/>
       </w:pPr>
       <w:r>
-        <w:rPr>
-          <w:rFonts w:ascii="Arial" w:hAnsi="Arial" w:eastAsia="Arial"/>
-          <w:b w:val="0"/>
-          <w:color w:val="10233F"/>
-          <w:sz w:val="22"/>
-        </w:rPr>
-        <w:t>The top selector appears only when you have more than one role.</w:t>
+        <w:t>Players see team position, team record, fixtures, recent form, their own stats and individual games.</w:t>
       </w:r>
     </w:p>
     <w:p>
       <w:pPr>
         <w:pStyle w:val="ListBullet"/>
-        <w:spacing w:after="60" w:line="252" w:lineRule="auto"/>
+        <w:spacing w:after="20" w:line="240" w:lineRule="auto"/>
       </w:pPr>
       <w:r>
-        <w:rPr>
-          <w:rFonts w:ascii="Arial" w:hAnsi="Arial" w:eastAsia="Arial"/>
-          <w:b w:val="0"/>
-          <w:color w:val="10233F"/>
-          <w:sz w:val="22"/>
-        </w:rPr>
-        <w:t>Use the bottom menu to move between Home, Fixtures, Tables, My Club and More when More is needed.</w:t>
+        <w:t>The role selector only matters for people with more than one role.</w:t>
       </w:r>
     </w:p>
     <w:p>
       <w:pPr>
-        <w:spacing w:before="40" w:after="40"/>
+        <w:spacing w:before="80" w:after="20"/>
         <w:jc w:val="center"/>
       </w:pPr>
       <w:r>
         <w:drawing>
           <wp:inline xmlns:a="http://schemas.openxmlformats.org/drawingml/2006/main" xmlns:pic="http://schemas.openxmlformats.org/drawingml/2006/picture">
-            <wp:extent cx="2606040" cy="5212080"/>
+            <wp:extent cx="3246120" cy="7024937"/>
             <wp:docPr id="2" name="Picture 2"/>
             <wp:cNvGraphicFramePr>
               <a:graphicFrameLocks noChangeAspect="1"/>
@@ -281,7 +449,7 @@
               <a:graphicData uri="http://schemas.openxmlformats.org/drawingml/2006/picture">
                 <pic:pic>
                   <pic:nvPicPr>
-                    <pic:cNvPr id="0" name="02-player-home.png"/>
+                    <pic:cNvPr id="0" name="02-player-home-real.png"/>
                     <pic:cNvPicPr/>
                   </pic:nvPicPr>
                   <pic:blipFill>
@@ -293,7 +461,7 @@
                   <pic:spPr>
                     <a:xfrm>
                       <a:off x="0" y="0"/>
-                      <a:ext cx="2606040" cy="5212080"/>
+                      <a:ext cx="3246120" cy="7024937"/>
                     </a:xfrm>
                     <a:prstGeom prst="rect"/>
                   </pic:spPr>
@@ -305,6 +473,19 @@
       </w:r>
     </w:p>
     <w:p>
+      <w:pPr>
+        <w:spacing w:after="0"/>
+        <w:jc w:val="center"/>
+      </w:pPr>
+      <w:r>
+        <w:rPr>
+          <w:color w:val="5F6A7A"/>
+          <w:sz w:val="19"/>
+        </w:rPr>
+        <w:t>Live player home screen.</w:t>
+      </w:r>
+    </w:p>
+    <w:p>
       <w:r>
         <w:br w:type="page"/>
       </w:r>
@@ -312,72 +493,48 @@
     <w:p>
       <w:pPr>
         <w:pStyle w:val="Heading1"/>
-        <w:spacing w:before="0" w:after="80" w:line="259" w:lineRule="auto"/>
+        <w:spacing w:after="80" w:line="250" w:lineRule="auto"/>
       </w:pPr>
       <w:r>
-        <w:rPr>
-          <w:rFonts w:ascii="Arial" w:hAnsi="Arial" w:eastAsia="Arial"/>
-          <w:b/>
-          <w:color w:val="000000"/>
-          <w:sz w:val="36"/>
-        </w:rPr>
-        <w:t>Fixtures and match viewing</w:t>
+        <w:t>Fixtures and results</w:t>
       </w:r>
     </w:p>
     <w:p>
       <w:pPr>
         <w:pStyle w:val="ListBullet"/>
-        <w:spacing w:after="60" w:line="252" w:lineRule="auto"/>
+        <w:spacing w:after="20" w:line="240" w:lineRule="auto"/>
       </w:pPr>
       <w:r>
-        <w:rPr>
-          <w:rFonts w:ascii="Arial" w:hAnsi="Arial" w:eastAsia="Arial"/>
-          <w:b w:val="0"/>
-          <w:color w:val="10233F"/>
-          <w:sz w:val="22"/>
-        </w:rPr>
-        <w:t>Fixtures are grouped by week so all matches in a round sit together.</w:t>
+        <w:t>Fixtures are grouped by week in one panel.</w:t>
       </w:r>
     </w:p>
     <w:p>
       <w:pPr>
         <w:pStyle w:val="ListBullet"/>
-        <w:spacing w:after="60" w:line="252" w:lineRule="auto"/>
+        <w:spacing w:after="20" w:line="240" w:lineRule="auto"/>
       </w:pPr>
       <w:r>
-        <w:rPr>
-          <w:rFonts w:ascii="Arial" w:hAnsi="Arial" w:eastAsia="Arial"/>
-          <w:b w:val="0"/>
-          <w:color w:val="10233F"/>
-          <w:sz w:val="22"/>
-        </w:rPr>
-        <w:t>Use the arrows to move between weeks. The app opens on the relevant current week.</w:t>
+        <w:t>Players can follow scores and results in their own league.</w:t>
       </w:r>
     </w:p>
     <w:p>
       <w:pPr>
         <w:pStyle w:val="ListBullet"/>
-        <w:spacing w:after="60" w:line="252" w:lineRule="auto"/>
+        <w:spacing w:after="20" w:line="240" w:lineRule="auto"/>
       </w:pPr>
       <w:r>
-        <w:rPr>
-          <w:rFonts w:ascii="Arial" w:hAnsi="Arial" w:eastAsia="Arial"/>
-          <w:b w:val="0"/>
-          <w:color w:val="10233F"/>
-          <w:sz w:val="22"/>
-        </w:rPr>
-        <w:t>Players can open a match once it is live or published, but cannot edit scores or breaks.</w:t>
+        <w:t>Managers see extra match actions only for their own team match.</w:t>
       </w:r>
     </w:p>
     <w:p>
       <w:pPr>
-        <w:spacing w:before="40" w:after="40"/>
+        <w:spacing w:before="80" w:after="20"/>
         <w:jc w:val="center"/>
       </w:pPr>
       <w:r>
         <w:drawing>
           <wp:inline xmlns:a="http://schemas.openxmlformats.org/drawingml/2006/main" xmlns:pic="http://schemas.openxmlformats.org/drawingml/2006/picture">
-            <wp:extent cx="2606040" cy="5212080"/>
+            <wp:extent cx="3246120" cy="7024937"/>
             <wp:docPr id="3" name="Picture 3"/>
             <wp:cNvGraphicFramePr>
               <a:graphicFrameLocks noChangeAspect="1"/>
@@ -386,7 +543,7 @@
               <a:graphicData uri="http://schemas.openxmlformats.org/drawingml/2006/picture">
                 <pic:pic>
                   <pic:nvPicPr>
-                    <pic:cNvPr id="0" name="03-fixtures.png"/>
+                    <pic:cNvPr id="0" name="03-fixtures-real.png"/>
                     <pic:cNvPicPr/>
                   </pic:nvPicPr>
                   <pic:blipFill>
@@ -398,7 +555,7 @@
                   <pic:spPr>
                     <a:xfrm>
                       <a:off x="0" y="0"/>
-                      <a:ext cx="2606040" cy="5212080"/>
+                      <a:ext cx="3246120" cy="7024937"/>
                     </a:xfrm>
                     <a:prstGeom prst="rect"/>
                   </pic:spPr>
@@ -410,6 +567,19 @@
       </w:r>
     </w:p>
     <w:p>
+      <w:pPr>
+        <w:spacing w:after="0"/>
+        <w:jc w:val="center"/>
+      </w:pPr>
+      <w:r>
+        <w:rPr>
+          <w:color w:val="5F6A7A"/>
+          <w:sz w:val="19"/>
+        </w:rPr>
+        <w:t>Live fixtures and results screen.</w:t>
+      </w:r>
+    </w:p>
+    <w:p>
       <w:r>
         <w:br w:type="page"/>
       </w:r>
@@ -417,72 +587,48 @@
     <w:p>
       <w:pPr>
         <w:pStyle w:val="Heading1"/>
-        <w:spacing w:before="0" w:after="80" w:line="259" w:lineRule="auto"/>
+        <w:spacing w:after="80" w:line="250" w:lineRule="auto"/>
       </w:pPr>
       <w:r>
-        <w:rPr>
-          <w:rFonts w:ascii="Arial" w:hAnsi="Arial" w:eastAsia="Arial"/>
-          <w:b/>
-          <w:color w:val="000000"/>
-          <w:sz w:val="36"/>
-        </w:rPr>
-        <w:t>Tables and player information</w:t>
+        <w:t>Tables</w:t>
       </w:r>
     </w:p>
     <w:p>
       <w:pPr>
         <w:pStyle w:val="ListBullet"/>
-        <w:spacing w:after="60" w:line="252" w:lineRule="auto"/>
+        <w:spacing w:after="20" w:line="240" w:lineRule="auto"/>
       </w:pPr>
       <w:r>
-        <w:rPr>
-          <w:rFonts w:ascii="Arial" w:hAnsi="Arial" w:eastAsia="Arial"/>
-          <w:b w:val="0"/>
-          <w:color w:val="10233F"/>
-          <w:sz w:val="22"/>
-        </w:rPr>
-        <w:t>Tables shows your own league first, then the other leagues below it.</w:t>
+        <w:t>Your league appears first, then the other leagues below it.</w:t>
       </w:r>
     </w:p>
     <w:p>
       <w:pPr>
         <w:pStyle w:val="ListBullet"/>
-        <w:spacing w:after="60" w:line="252" w:lineRule="auto"/>
+        <w:spacing w:after="20" w:line="240" w:lineRule="auto"/>
       </w:pPr>
       <w:r>
-        <w:rPr>
-          <w:rFonts w:ascii="Arial" w:hAnsi="Arial" w:eastAsia="Arial"/>
-          <w:b w:val="0"/>
-          <w:color w:val="10233F"/>
-          <w:sz w:val="22"/>
-        </w:rPr>
-        <w:t>League tables and player stats update from match data rather than being manually edited.</w:t>
+        <w:t>Use this tab for standings rather than hunting through fixtures.</w:t>
       </w:r>
     </w:p>
     <w:p>
       <w:pPr>
         <w:pStyle w:val="ListBullet"/>
-        <w:spacing w:after="60" w:line="252" w:lineRule="auto"/>
+        <w:spacing w:after="20" w:line="240" w:lineRule="auto"/>
       </w:pPr>
       <w:r>
-        <w:rPr>
-          <w:rFonts w:ascii="Arial" w:hAnsi="Arial" w:eastAsia="Arial"/>
-          <w:b w:val="0"/>
-          <w:color w:val="10233F"/>
-          <w:sz w:val="22"/>
-        </w:rPr>
-        <w:t>Player stats are ranked by win percentage. High break appears where a player has break data.</w:t>
+        <w:t>League and player tables can be shared where the app allows sharing.</w:t>
       </w:r>
     </w:p>
     <w:p>
       <w:pPr>
-        <w:spacing w:before="40" w:after="40"/>
+        <w:spacing w:before="80" w:after="20"/>
         <w:jc w:val="center"/>
       </w:pPr>
       <w:r>
         <w:drawing>
           <wp:inline xmlns:a="http://schemas.openxmlformats.org/drawingml/2006/main" xmlns:pic="http://schemas.openxmlformats.org/drawingml/2006/picture">
-            <wp:extent cx="2606040" cy="5212080"/>
+            <wp:extent cx="3246120" cy="7024937"/>
             <wp:docPr id="4" name="Picture 4"/>
             <wp:cNvGraphicFramePr>
               <a:graphicFrameLocks noChangeAspect="1"/>
@@ -491,7 +637,7 @@
               <a:graphicData uri="http://schemas.openxmlformats.org/drawingml/2006/picture">
                 <pic:pic>
                   <pic:nvPicPr>
-                    <pic:cNvPr id="0" name="04-tables.png"/>
+                    <pic:cNvPr id="0" name="04-tables-real.png"/>
                     <pic:cNvPicPr/>
                   </pic:nvPicPr>
                   <pic:blipFill>
@@ -503,7 +649,7 @@
                   <pic:spPr>
                     <a:xfrm>
                       <a:off x="0" y="0"/>
-                      <a:ext cx="2606040" cy="5212080"/>
+                      <a:ext cx="3246120" cy="7024937"/>
                     </a:xfrm>
                     <a:prstGeom prst="rect"/>
                   </pic:spPr>
@@ -515,6 +661,19 @@
       </w:r>
     </w:p>
     <w:p>
+      <w:pPr>
+        <w:spacing w:after="0"/>
+        <w:jc w:val="center"/>
+      </w:pPr>
+      <w:r>
+        <w:rPr>
+          <w:color w:val="5F6A7A"/>
+          <w:sz w:val="19"/>
+        </w:rPr>
+        <w:t>Live tables screen.</w:t>
+      </w:r>
+    </w:p>
+    <w:p>
       <w:r>
         <w:br w:type="page"/>
       </w:r>
@@ -522,72 +681,48 @@
     <w:p>
       <w:pPr>
         <w:pStyle w:val="Heading1"/>
-        <w:spacing w:before="0" w:after="80" w:line="259" w:lineRule="auto"/>
+        <w:spacing w:after="80" w:line="250" w:lineRule="auto"/>
       </w:pPr>
       <w:r>
-        <w:rPr>
-          <w:rFonts w:ascii="Arial" w:hAnsi="Arial" w:eastAsia="Arial"/>
-          <w:b/>
-          <w:color w:val="000000"/>
-          <w:sz w:val="36"/>
-        </w:rPr>
-        <w:t>Manager home</w:t>
+        <w:t>My Club</w:t>
       </w:r>
     </w:p>
     <w:p>
       <w:pPr>
         <w:pStyle w:val="ListBullet"/>
-        <w:spacing w:after="60" w:line="252" w:lineRule="auto"/>
+        <w:spacing w:after="20" w:line="240" w:lineRule="auto"/>
       </w:pPr>
       <w:r>
-        <w:rPr>
-          <w:rFonts w:ascii="Arial" w:hAnsi="Arial" w:eastAsia="Arial"/>
-          <w:b w:val="0"/>
-          <w:color w:val="10233F"/>
-          <w:sz w:val="22"/>
-        </w:rPr>
-        <w:t>Managers see team information first: next match, league position, team form and player form.</w:t>
+        <w:t>My Club keeps club activity separate from interclub duties.</w:t>
       </w:r>
     </w:p>
     <w:p>
       <w:pPr>
         <w:pStyle w:val="ListBullet"/>
-        <w:spacing w:after="60" w:line="252" w:lineRule="auto"/>
+        <w:spacing w:after="20" w:line="240" w:lineRule="auto"/>
       </w:pPr>
       <w:r>
-        <w:rPr>
-          <w:rFonts w:ascii="Arial" w:hAnsi="Arial" w:eastAsia="Arial"/>
-          <w:b w:val="0"/>
-          <w:color w:val="10233F"/>
-          <w:sz w:val="22"/>
-        </w:rPr>
-        <w:t>The manager view is scoped to the selected team only.</w:t>
+        <w:t>Castle users can book tables and enter Castle club competitions.</w:t>
       </w:r>
     </w:p>
     <w:p>
       <w:pPr>
         <w:pStyle w:val="ListBullet"/>
-        <w:spacing w:after="60" w:line="252" w:lineRule="auto"/>
+        <w:spacing w:after="20" w:line="240" w:lineRule="auto"/>
       </w:pPr>
       <w:r>
-        <w:rPr>
-          <w:rFonts w:ascii="Arial" w:hAnsi="Arial" w:eastAsia="Arial"/>
-          <w:b w:val="0"/>
-          <w:color w:val="10233F"/>
-          <w:sz w:val="22"/>
-        </w:rPr>
-        <w:t>If you are also a player, switch roles at the top to see the player version of the app.</w:t>
+        <w:t>Other clubs will see table booking once it has been set up for that club.</w:t>
       </w:r>
     </w:p>
     <w:p>
       <w:pPr>
-        <w:spacing w:before="40" w:after="40"/>
+        <w:spacing w:before="80" w:after="20"/>
         <w:jc w:val="center"/>
       </w:pPr>
       <w:r>
         <w:drawing>
           <wp:inline xmlns:a="http://schemas.openxmlformats.org/drawingml/2006/main" xmlns:pic="http://schemas.openxmlformats.org/drawingml/2006/picture">
-            <wp:extent cx="2606040" cy="5212080"/>
+            <wp:extent cx="3246120" cy="7024937"/>
             <wp:docPr id="5" name="Picture 5"/>
             <wp:cNvGraphicFramePr>
               <a:graphicFrameLocks noChangeAspect="1"/>
@@ -596,7 +731,7 @@
               <a:graphicData uri="http://schemas.openxmlformats.org/drawingml/2006/picture">
                 <pic:pic>
                   <pic:nvPicPr>
-                    <pic:cNvPr id="0" name="05-manager-home.png"/>
+                    <pic:cNvPr id="0" name="05-my-club-real.png"/>
                     <pic:cNvPicPr/>
                   </pic:nvPicPr>
                   <pic:blipFill>
@@ -608,7 +743,7 @@
                   <pic:spPr>
                     <a:xfrm>
                       <a:off x="0" y="0"/>
-                      <a:ext cx="2606040" cy="5212080"/>
+                      <a:ext cx="3246120" cy="7024937"/>
                     </a:xfrm>
                     <a:prstGeom prst="rect"/>
                   </pic:spPr>
@@ -620,6 +755,19 @@
       </w:r>
     </w:p>
     <w:p>
+      <w:pPr>
+        <w:spacing w:after="0"/>
+        <w:jc w:val="center"/>
+      </w:pPr>
+      <w:r>
+        <w:rPr>
+          <w:color w:val="5F6A7A"/>
+          <w:sz w:val="19"/>
+        </w:rPr>
+        <w:t>Live My Club screen.</w:t>
+      </w:r>
+    </w:p>
+    <w:p>
       <w:r>
         <w:br w:type="page"/>
       </w:r>
@@ -627,87 +775,48 @@
     <w:p>
       <w:pPr>
         <w:pStyle w:val="Heading1"/>
-        <w:spacing w:before="0" w:after="80" w:line="259" w:lineRule="auto"/>
+        <w:spacing w:after="80" w:line="250" w:lineRule="auto"/>
       </w:pPr>
       <w:r>
-        <w:rPr>
-          <w:rFonts w:ascii="Arial" w:hAnsi="Arial" w:eastAsia="Arial"/>
-          <w:b/>
-          <w:color w:val="000000"/>
-          <w:sz w:val="36"/>
-        </w:rPr>
-        <w:t>Pick and publish a team</w:t>
+        <w:t>Manager home</w:t>
       </w:r>
     </w:p>
     <w:p>
       <w:pPr>
         <w:pStyle w:val="ListBullet"/>
-        <w:spacing w:after="60" w:line="252" w:lineRule="auto"/>
+        <w:spacing w:after="20" w:line="240" w:lineRule="auto"/>
       </w:pPr>
       <w:r>
-        <w:rPr>
-          <w:rFonts w:ascii="Arial" w:hAnsi="Arial" w:eastAsia="Arial"/>
-          <w:b w:val="0"/>
-          <w:color w:val="10233F"/>
-          <w:sz w:val="22"/>
-        </w:rPr>
-        <w:t>Open your own next match and fill the team sheet from the match page.</w:t>
+        <w:t>Managers see team-focused information first.</w:t>
       </w:r>
     </w:p>
     <w:p>
       <w:pPr>
         <w:pStyle w:val="ListBullet"/>
-        <w:spacing w:after="60" w:line="252" w:lineRule="auto"/>
+        <w:spacing w:after="20" w:line="240" w:lineRule="auto"/>
       </w:pPr>
       <w:r>
-        <w:rPr>
-          <w:rFonts w:ascii="Arial" w:hAnsi="Arial" w:eastAsia="Arial"/>
-          <w:b w:val="0"/>
-          <w:color w:val="10233F"/>
-          <w:sz w:val="22"/>
-        </w:rPr>
-        <w:t>Tap an empty slot to choose a player. Doubles slots take two player slots.</w:t>
+        <w:t>A manager who is also a player can change role at the top and gets the correct view for that role.</w:t>
       </w:r>
     </w:p>
     <w:p>
       <w:pPr>
         <w:pStyle w:val="ListBullet"/>
-        <w:spacing w:after="60" w:line="252" w:lineRule="auto"/>
+        <w:spacing w:after="20" w:line="240" w:lineRule="auto"/>
       </w:pPr>
       <w:r>
-        <w:rPr>
-          <w:rFonts w:ascii="Arial" w:hAnsi="Arial" w:eastAsia="Arial"/>
-          <w:b w:val="0"/>
-          <w:color w:val="10233F"/>
-          <w:sz w:val="22"/>
-        </w:rPr>
-        <w:t>A and B League matches are five singles and one doubles. C League uses singles in games 1, 3 and 5 and doubles in games 2 and 4.</w:t>
+        <w:t>Use Fixtures to manage the next match rather than looking for separate admin controls.</w:t>
       </w:r>
     </w:p>
     <w:p>
       <w:pPr>
-        <w:pStyle w:val="ListBullet"/>
-        <w:spacing w:after="60" w:line="252" w:lineRule="auto"/>
-      </w:pPr>
-      <w:r>
-        <w:rPr>
-          <w:rFonts w:ascii="Arial" w:hAnsi="Arial" w:eastAsia="Arial"/>
-          <w:b w:val="0"/>
-          <w:color w:val="10233F"/>
-          <w:sz w:val="22"/>
-        </w:rPr>
-        <w:t>Publish only when final. A published team sheet is locked.</w:t>
-      </w:r>
-    </w:p>
-    <w:p>
-      <w:pPr>
-        <w:spacing w:before="40" w:after="40"/>
+        <w:spacing w:before="80" w:after="20"/>
         <w:jc w:val="center"/>
       </w:pPr>
       <w:r>
         <w:drawing>
           <wp:inline xmlns:a="http://schemas.openxmlformats.org/drawingml/2006/main" xmlns:pic="http://schemas.openxmlformats.org/drawingml/2006/picture">
-            <wp:extent cx="2606040" cy="5212080"/>
+            <wp:extent cx="3246120" cy="7024937"/>
             <wp:docPr id="6" name="Picture 6"/>
             <wp:cNvGraphicFramePr>
               <a:graphicFrameLocks noChangeAspect="1"/>
@@ -716,7 +825,7 @@
               <a:graphicData uri="http://schemas.openxmlformats.org/drawingml/2006/picture">
                 <pic:pic>
                   <pic:nvPicPr>
-                    <pic:cNvPr id="0" name="06-team-sheet.png"/>
+                    <pic:cNvPr id="0" name="06-manager-home-real.png"/>
                     <pic:cNvPicPr/>
                   </pic:nvPicPr>
                   <pic:blipFill>
@@ -728,7 +837,7 @@
                   <pic:spPr>
                     <a:xfrm>
                       <a:off x="0" y="0"/>
-                      <a:ext cx="2606040" cy="5212080"/>
+                      <a:ext cx="3246120" cy="7024937"/>
                     </a:xfrm>
                     <a:prstGeom prst="rect"/>
                   </pic:spPr>
@@ -740,6 +849,19 @@
       </w:r>
     </w:p>
     <w:p>
+      <w:pPr>
+        <w:spacing w:after="0"/>
+        <w:jc w:val="center"/>
+      </w:pPr>
+      <w:r>
+        <w:rPr>
+          <w:color w:val="5F6A7A"/>
+          <w:sz w:val="19"/>
+        </w:rPr>
+        <w:t>Live manager home screen.</w:t>
+      </w:r>
+    </w:p>
+    <w:p>
       <w:r>
         <w:br w:type="page"/>
       </w:r>
@@ -747,72 +869,48 @@
     <w:p>
       <w:pPr>
         <w:pStyle w:val="Heading1"/>
-        <w:spacing w:before="0" w:after="80" w:line="259" w:lineRule="auto"/>
+        <w:spacing w:after="80" w:line="250" w:lineRule="auto"/>
       </w:pPr>
       <w:r>
-        <w:rPr>
-          <w:rFonts w:ascii="Arial" w:hAnsi="Arial" w:eastAsia="Arial"/>
-          <w:b/>
-          <w:color w:val="000000"/>
-          <w:sz w:val="36"/>
-        </w:rPr>
-        <w:t>Enter match scores</w:t>
+        <w:t>Managing a match</w:t>
       </w:r>
     </w:p>
     <w:p>
       <w:pPr>
         <w:pStyle w:val="ListBullet"/>
-        <w:spacing w:after="60" w:line="252" w:lineRule="auto"/>
+        <w:spacing w:after="20" w:line="240" w:lineRule="auto"/>
       </w:pPr>
       <w:r>
-        <w:rPr>
-          <w:rFonts w:ascii="Arial" w:hAnsi="Arial" w:eastAsia="Arial"/>
-          <w:b w:val="0"/>
-          <w:color w:val="10233F"/>
-          <w:sz w:val="22"/>
-        </w:rPr>
-        <w:t>When both teams have published, score entry appears for the managers involved.</w:t>
+        <w:t>Open your team match from Fixtures when manager actions are available.</w:t>
       </w:r>
     </w:p>
     <w:p>
       <w:pPr>
         <w:pStyle w:val="ListBullet"/>
-        <w:spacing w:after="60" w:line="252" w:lineRule="auto"/>
+        <w:spacing w:after="20" w:line="240" w:lineRule="auto"/>
       </w:pPr>
       <w:r>
-        <w:rPr>
-          <w:rFonts w:ascii="Arial" w:hAnsi="Arial" w:eastAsia="Arial"/>
-          <w:b w:val="0"/>
-          <w:color w:val="10233F"/>
-          <w:sz w:val="22"/>
-        </w:rPr>
-        <w:t>Tap the team that won each game. Singles are worth 1 point. Doubles are worth 2 points.</w:t>
+        <w:t>Published lineups and completed matches are locked, so check carefully before finalising.</w:t>
       </w:r>
     </w:p>
     <w:p>
       <w:pPr>
         <w:pStyle w:val="ListBullet"/>
-        <w:spacing w:after="60" w:line="252" w:lineRule="auto"/>
+        <w:spacing w:after="20" w:line="240" w:lineRule="auto"/>
       </w:pPr>
       <w:r>
-        <w:rPr>
-          <w:rFonts w:ascii="Arial" w:hAnsi="Arial" w:eastAsia="Arial"/>
-          <w:b w:val="0"/>
-          <w:color w:val="10233F"/>
-          <w:sz w:val="22"/>
-        </w:rPr>
-        <w:t>Press Match Completed only when everything has been checked. A completed match is locked.</w:t>
+        <w:t>A completed match shows the score, game winners, breaks and lineups.</w:t>
       </w:r>
     </w:p>
     <w:p>
       <w:pPr>
-        <w:spacing w:before="40" w:after="40"/>
+        <w:spacing w:before="80" w:after="20"/>
         <w:jc w:val="center"/>
       </w:pPr>
       <w:r>
         <w:drawing>
           <wp:inline xmlns:a="http://schemas.openxmlformats.org/drawingml/2006/main" xmlns:pic="http://schemas.openxmlformats.org/drawingml/2006/picture">
-            <wp:extent cx="2606040" cy="5212080"/>
+            <wp:extent cx="3246120" cy="7024937"/>
             <wp:docPr id="7" name="Picture 7"/>
             <wp:cNvGraphicFramePr>
               <a:graphicFrameLocks noChangeAspect="1"/>
@@ -821,7 +919,7 @@
               <a:graphicData uri="http://schemas.openxmlformats.org/drawingml/2006/picture">
                 <pic:pic>
                   <pic:nvPicPr>
-                    <pic:cNvPr id="0" name="07-score-entry.png"/>
+                    <pic:cNvPr id="0" name="08-match-detail-real.png"/>
                     <pic:cNvPicPr/>
                   </pic:nvPicPr>
                   <pic:blipFill>
@@ -833,7 +931,7 @@
                   <pic:spPr>
                     <a:xfrm>
                       <a:off x="0" y="0"/>
-                      <a:ext cx="2606040" cy="5212080"/>
+                      <a:ext cx="3246120" cy="7024937"/>
                     </a:xfrm>
                     <a:prstGeom prst="rect"/>
                   </pic:spPr>
@@ -845,6 +943,19 @@
       </w:r>
     </w:p>
     <w:p>
+      <w:pPr>
+        <w:spacing w:after="0"/>
+        <w:jc w:val="center"/>
+      </w:pPr>
+      <w:r>
+        <w:rPr>
+          <w:color w:val="5F6A7A"/>
+          <w:sz w:val="19"/>
+        </w:rPr>
+        <w:t>Live completed match detail screen.</w:t>
+      </w:r>
+    </w:p>
+    <w:p>
       <w:r>
         <w:br w:type="page"/>
       </w:r>
@@ -852,72 +963,48 @@
     <w:p>
       <w:pPr>
         <w:pStyle w:val="Heading1"/>
-        <w:spacing w:before="0" w:after="80" w:line="259" w:lineRule="auto"/>
+        <w:spacing w:after="80" w:line="250" w:lineRule="auto"/>
       </w:pPr>
       <w:r>
-        <w:rPr>
-          <w:rFonts w:ascii="Arial" w:hAnsi="Arial" w:eastAsia="Arial"/>
-          <w:b/>
-          <w:color w:val="000000"/>
-          <w:sz w:val="36"/>
-        </w:rPr>
-        <w:t>Record breaks</w:t>
+        <w:t>Scores and breaks</w:t>
       </w:r>
     </w:p>
     <w:p>
       <w:pPr>
         <w:pStyle w:val="ListBullet"/>
-        <w:spacing w:after="60" w:line="252" w:lineRule="auto"/>
+        <w:spacing w:after="20" w:line="240" w:lineRule="auto"/>
       </w:pPr>
       <w:r>
-        <w:rPr>
-          <w:rFonts w:ascii="Arial" w:hAnsi="Arial" w:eastAsia="Arial"/>
-          <w:b w:val="0"/>
-          <w:color w:val="10233F"/>
-          <w:sz w:val="22"/>
-        </w:rPr>
-        <w:t>Breaks are optional. Record them only when they are meaningful for the player record.</w:t>
+        <w:t>Singles are worth 1 point. Doubles are worth 2 points.</w:t>
       </w:r>
     </w:p>
     <w:p>
       <w:pPr>
         <w:pStyle w:val="ListBullet"/>
-        <w:spacing w:after="60" w:line="252" w:lineRule="auto"/>
+        <w:spacing w:after="20" w:line="240" w:lineRule="auto"/>
       </w:pPr>
       <w:r>
-        <w:rPr>
-          <w:rFonts w:ascii="Arial" w:hAnsi="Arial" w:eastAsia="Arial"/>
-          <w:b w:val="0"/>
-          <w:color w:val="10233F"/>
-          <w:sz w:val="22"/>
-        </w:rPr>
-        <w:t>Choose the player, enter the break value, and save it.</w:t>
+        <w:t>Breaks are optional and should be recorded only when they matter for player records.</w:t>
       </w:r>
     </w:p>
     <w:p>
       <w:pPr>
         <w:pStyle w:val="ListBullet"/>
-        <w:spacing w:after="60" w:line="252" w:lineRule="auto"/>
+        <w:spacing w:after="20" w:line="240" w:lineRule="auto"/>
       </w:pPr>
       <w:r>
-        <w:rPr>
-          <w:rFonts w:ascii="Arial" w:hAnsi="Arial" w:eastAsia="Arial"/>
-          <w:b w:val="0"/>
-          <w:color w:val="10233F"/>
-          <w:sz w:val="22"/>
-        </w:rPr>
-        <w:t>Breaks are stored against the player, game, match and season so they appear in player records.</w:t>
+        <w:t>Once the match is completed, editing is locked and players can view the details without changing them.</w:t>
       </w:r>
     </w:p>
     <w:p>
       <w:pPr>
-        <w:spacing w:before="40" w:after="40"/>
+        <w:spacing w:before="80" w:after="20"/>
         <w:jc w:val="center"/>
       </w:pPr>
       <w:r>
         <w:drawing>
           <wp:inline xmlns:a="http://schemas.openxmlformats.org/drawingml/2006/main" xmlns:pic="http://schemas.openxmlformats.org/drawingml/2006/picture">
-            <wp:extent cx="2606040" cy="5212080"/>
+            <wp:extent cx="3246120" cy="7024937"/>
             <wp:docPr id="8" name="Picture 8"/>
             <wp:cNvGraphicFramePr>
               <a:graphicFrameLocks noChangeAspect="1"/>
@@ -926,7 +1013,7 @@
               <a:graphicData uri="http://schemas.openxmlformats.org/drawingml/2006/picture">
                 <pic:pic>
                   <pic:nvPicPr>
-                    <pic:cNvPr id="0" name="08-break-entry.png"/>
+                    <pic:cNvPr id="0" name="09-match-detail-breaks-real.png"/>
                     <pic:cNvPicPr/>
                   </pic:nvPicPr>
                   <pic:blipFill>
@@ -938,7 +1025,7 @@
                   <pic:spPr>
                     <a:xfrm>
                       <a:off x="0" y="0"/>
-                      <a:ext cx="2606040" cy="5212080"/>
+                      <a:ext cx="3246120" cy="7024937"/>
                     </a:xfrm>
                     <a:prstGeom prst="rect"/>
                   </pic:spPr>
@@ -950,6 +1037,19 @@
       </w:r>
     </w:p>
     <w:p>
+      <w:pPr>
+        <w:spacing w:after="0"/>
+        <w:jc w:val="center"/>
+      </w:pPr>
+      <w:r>
+        <w:rPr>
+          <w:color w:val="5F6A7A"/>
+          <w:sz w:val="19"/>
+        </w:rPr>
+        <w:t>Live match detail with score and break information.</w:t>
+      </w:r>
+    </w:p>
+    <w:p>
       <w:r>
         <w:br w:type="page"/>
       </w:r>
@@ -957,72 +1057,66 @@
     <w:p>
       <w:pPr>
         <w:pStyle w:val="Heading1"/>
-        <w:spacing w:before="0" w:after="80" w:line="259" w:lineRule="auto"/>
+        <w:spacing w:after="80" w:line="250" w:lineRule="auto"/>
       </w:pPr>
       <w:r>
-        <w:rPr>
-          <w:rFonts w:ascii="Arial" w:hAnsi="Arial" w:eastAsia="Arial"/>
-          <w:b/>
-          <w:color w:val="000000"/>
-          <w:sz w:val="36"/>
-        </w:rPr>
-        <w:t>My Club</w:t>
+        <w:t>Bottom navigation</w:t>
       </w:r>
     </w:p>
     <w:p>
       <w:pPr>
         <w:pStyle w:val="ListBullet"/>
-        <w:spacing w:after="60" w:line="252" w:lineRule="auto"/>
+        <w:spacing w:after="20" w:line="240" w:lineRule="auto"/>
       </w:pPr>
       <w:r>
-        <w:rPr>
-          <w:rFonts w:ascii="Arial" w:hAnsi="Arial" w:eastAsia="Arial"/>
-          <w:b w:val="0"/>
-          <w:color w:val="10233F"/>
-          <w:sz w:val="22"/>
-        </w:rPr>
-        <w:t>My Club contains club features such as table bookings, Castle competitions and club games.</w:t>
+        <w:t>Home: your summary and the most useful information for your role.</w:t>
       </w:r>
     </w:p>
     <w:p>
       <w:pPr>
         <w:pStyle w:val="ListBullet"/>
-        <w:spacing w:after="60" w:line="252" w:lineRule="auto"/>
+        <w:spacing w:after="20" w:line="240" w:lineRule="auto"/>
       </w:pPr>
       <w:r>
-        <w:rPr>
-          <w:rFonts w:ascii="Arial" w:hAnsi="Arial" w:eastAsia="Arial"/>
-          <w:b w:val="0"/>
-          <w:color w:val="10233F"/>
-          <w:sz w:val="22"/>
-        </w:rPr>
-        <w:t>Table bookings are currently set up for Castle only. Other clubs see a message saying it has not been set up yet.</w:t>
+        <w:t>Fixtures: weekly fixtures, results, live scores and manager match actions.</w:t>
       </w:r>
     </w:p>
     <w:p>
       <w:pPr>
         <w:pStyle w:val="ListBullet"/>
-        <w:spacing w:after="60" w:line="252" w:lineRule="auto"/>
+        <w:spacing w:after="20" w:line="240" w:lineRule="auto"/>
       </w:pPr>
       <w:r>
-        <w:rPr>
-          <w:rFonts w:ascii="Arial" w:hAnsi="Arial" w:eastAsia="Arial"/>
-          <w:b w:val="0"/>
-          <w:color w:val="10233F"/>
-          <w:sz w:val="22"/>
-        </w:rPr>
-        <w:t>Club competitions show what you can enter and what you are already playing in.</w:t>
+        <w:t>Tables: league tables and player stats.</w:t>
       </w:r>
     </w:p>
     <w:p>
       <w:pPr>
-        <w:spacing w:before="40" w:after="40"/>
+        <w:pStyle w:val="ListBullet"/>
+        <w:spacing w:after="20" w:line="240" w:lineRule="auto"/>
+      </w:pPr>
+      <w:r>
+        <w:t>My Club: bookings, competitions and club activity.</w:t>
+      </w:r>
+    </w:p>
+    <w:p>
+      <w:pPr>
+        <w:pStyle w:val="ListBullet"/>
+        <w:spacing w:after="20" w:line="240" w:lineRule="auto"/>
+      </w:pPr>
+      <w:r>
+        <w:t>More: less frequent items such as friendlies.</w:t>
+      </w:r>
+    </w:p>
+    <w:p>
+      <w:pPr>
+        <w:spacing w:before="80" w:after="20"/>
         <w:jc w:val="center"/>
       </w:pPr>
       <w:r>
         <w:drawing>
           <wp:inline xmlns:a="http://schemas.openxmlformats.org/drawingml/2006/main" xmlns:pic="http://schemas.openxmlformats.org/drawingml/2006/picture">
-            <wp:extent cx="2606040" cy="5212080"/>
+            <wp:extent cx="3246120" cy="7024937"/>
             <wp:docPr id="9" name="Picture 9"/>
             <wp:cNvGraphicFramePr>
               <a:graphicFrameLocks noChangeAspect="1"/>
@@ -1031,7 +1125,7 @@
               <a:graphicData uri="http://schemas.openxmlformats.org/drawingml/2006/picture">
                 <pic:pic>
                   <pic:nvPicPr>
-                    <pic:cNvPr id="0" name="09-my-club.png"/>
+                    <pic:cNvPr id="0" name="05-more-real.png"/>
                     <pic:cNvPicPr/>
                   </pic:nvPicPr>
                   <pic:blipFill>
@@ -1043,7 +1137,7 @@
                   <pic:spPr>
                     <a:xfrm>
                       <a:off x="0" y="0"/>
-                      <a:ext cx="2606040" cy="5212080"/>
+                      <a:ext cx="3246120" cy="7024937"/>
                     </a:xfrm>
                     <a:prstGeom prst="rect"/>
                   </pic:spPr>
@@ -1055,6 +1149,19 @@
       </w:r>
     </w:p>
     <w:p>
+      <w:pPr>
+        <w:spacing w:after="0"/>
+        <w:jc w:val="center"/>
+      </w:pPr>
+      <w:r>
+        <w:rPr>
+          <w:color w:val="5F6A7A"/>
+          <w:sz w:val="19"/>
+        </w:rPr>
+        <w:t>Live More screen.</w:t>
+      </w:r>
+    </w:p>
+    <w:p>
       <w:r>
         <w:br w:type="page"/>
       </w:r>
@@ -1062,140 +1169,42 @@
     <w:p>
       <w:pPr>
         <w:pStyle w:val="Heading1"/>
-        <w:spacing w:before="0" w:after="80" w:line="259" w:lineRule="auto"/>
+        <w:spacing w:after="80" w:line="250" w:lineRule="auto"/>
       </w:pPr>
       <w:r>
-        <w:rPr>
-          <w:rFonts w:ascii="Arial" w:hAnsi="Arial" w:eastAsia="Arial"/>
-          <w:b/>
-          <w:color w:val="000000"/>
-          <w:sz w:val="36"/>
-        </w:rPr>
-        <w:t>Quick match night checklist</w:t>
+        <w:t>Important manager note</w:t>
       </w:r>
     </w:p>
     <w:p>
       <w:pPr>
         <w:pStyle w:val="ListBullet"/>
-        <w:spacing w:after="60" w:line="252" w:lineRule="auto"/>
+        <w:spacing w:after="20" w:line="240" w:lineRule="auto"/>
       </w:pPr>
       <w:r>
-        <w:rPr>
-          <w:rFonts w:ascii="Arial" w:hAnsi="Arial" w:eastAsia="Arial"/>
-          <w:b w:val="0"/>
-          <w:color w:val="10233F"/>
-          <w:sz w:val="22"/>
-        </w:rPr>
-        <w:t>Manager opens their own match from Fixtures or Next Match.</w:t>
+        <w:t>For a live team-picking screenshot, the production app needs an active unlocked fixture. The current live test data shown here is already completed and locked.</w:t>
       </w:r>
     </w:p>
     <w:p>
       <w:pPr>
         <w:pStyle w:val="ListBullet"/>
-        <w:spacing w:after="60" w:line="252" w:lineRule="auto"/>
+        <w:spacing w:after="20" w:line="240" w:lineRule="auto"/>
       </w:pPr>
       <w:r>
-        <w:rPr>
-          <w:rFonts w:ascii="Arial" w:hAnsi="Arial" w:eastAsia="Arial"/>
-          <w:b w:val="0"/>
-          <w:color w:val="10233F"/>
-          <w:sz w:val="22"/>
-        </w:rPr>
-        <w:t>Manager fills the team sheet, checks it, then publishes.</w:t>
+        <w:t>When an active fixture is available, the same Fixtures route is where managers pick teams, publish lineups, enter scores and record breaks.</w:t>
       </w:r>
     </w:p>
     <w:p>
       <w:pPr>
         <w:pStyle w:val="ListBullet"/>
-        <w:spacing w:after="60" w:line="252" w:lineRule="auto"/>
+        <w:spacing w:after="20" w:line="240" w:lineRule="auto"/>
       </w:pPr>
       <w:r>
-        <w:rPr>
-          <w:rFonts w:ascii="Arial" w:hAnsi="Arial" w:eastAsia="Arial"/>
-          <w:b w:val="0"/>
-          <w:color w:val="10233F"/>
-          <w:sz w:val="22"/>
-        </w:rPr>
-        <w:t>When both teams publish, score entry becomes available to the managers involved.</w:t>
-      </w:r>
-    </w:p>
-    <w:p>
-      <w:pPr>
-        <w:pStyle w:val="ListBullet"/>
-        <w:spacing w:after="60" w:line="252" w:lineRule="auto"/>
-      </w:pPr>
-      <w:r>
-        <w:rPr>
-          <w:rFonts w:ascii="Arial" w:hAnsi="Arial" w:eastAsia="Arial"/>
-          <w:b w:val="0"/>
-          <w:color w:val="10233F"/>
-          <w:sz w:val="22"/>
-        </w:rPr>
-        <w:t>Record any worthwhile breaks against the correct player and game.</w:t>
-      </w:r>
-    </w:p>
-    <w:p>
-      <w:pPr>
-        <w:pStyle w:val="ListBullet"/>
-        <w:spacing w:after="60" w:line="252" w:lineRule="auto"/>
-      </w:pPr>
-      <w:r>
-        <w:rPr>
-          <w:rFonts w:ascii="Arial" w:hAnsi="Arial" w:eastAsia="Arial"/>
-          <w:b w:val="0"/>
-          <w:color w:val="10233F"/>
-          <w:sz w:val="22"/>
-        </w:rPr>
-        <w:t>One manager presses Match Completed after all games are correct.</w:t>
-      </w:r>
-    </w:p>
-    <w:p>
-      <w:pPr>
-        <w:pStyle w:val="ListBullet"/>
-        <w:spacing w:after="60" w:line="252" w:lineRule="auto"/>
-      </w:pPr>
-      <w:r>
-        <w:rPr>
-          <w:rFonts w:ascii="Arial" w:hAnsi="Arial" w:eastAsia="Arial"/>
-          <w:b w:val="0"/>
-          <w:color w:val="10233F"/>
-          <w:sz w:val="22"/>
-        </w:rPr>
-        <w:t>Players can follow live or published match details but cannot edit them.</w:t>
-      </w:r>
-    </w:p>
-    <w:p>
-      <w:pPr>
-        <w:pStyle w:val="Heading1"/>
-        <w:spacing w:before="200" w:after="80" w:line="259" w:lineRule="auto"/>
-      </w:pPr>
-      <w:r>
-        <w:rPr>
-          <w:rFonts w:ascii="Arial" w:hAnsi="Arial" w:eastAsia="Arial"/>
-          <w:b/>
-          <w:color w:val="000000"/>
-          <w:sz w:val="36"/>
-        </w:rPr>
-        <w:t>If something looks wrong</w:t>
-      </w:r>
-    </w:p>
-    <w:p>
-      <w:pPr>
-        <w:spacing w:before="0" w:after="100" w:line="259" w:lineRule="auto"/>
-      </w:pPr>
-      <w:r>
-        <w:rPr>
-          <w:rFonts w:ascii="Arial" w:hAnsi="Arial" w:eastAsia="Arial"/>
-          <w:b w:val="0"/>
-          <w:color w:val="10233F"/>
-          <w:sz w:val="23"/>
-        </w:rPr>
-        <w:t>Refresh the page first. If a lineup, score or break still looks wrong, ask the manager or club administrator to check it. Once a match has been completed it is intentionally locked, so a correction needs an administrator to reset or amend it deliberately.</w:t>
+        <w:t>This guide can be refreshed quickly with new real screenshots once an active test match is loaded.</w:t>
       </w:r>
     </w:p>
     <w:sectPr>
       <w:pgSz w:w="12240" w:h="15840"/>
-      <w:pgMar w:top="648" w:right="893" w:bottom="605" w:left="893" w:header="720" w:footer="720" w:gutter="0"/>
+      <w:pgMar w:top="504" w:right="648" w:bottom="504" w:left="648" w:header="720" w:footer="720" w:gutter="0"/>
       <w:cols w:space="720"/>
       <w:docGrid w:linePitch="360"/>
     </w:sectPr>
@@ -1567,9 +1576,9 @@
     <w:qFormat/>
     <w:rsid w:val="00FC693F"/>
     <w:rPr>
-      <w:rFonts w:ascii="Arial" w:hAnsi="Arial" w:eastAsia="Arial"/>
-      <w:color w:val="10233F"/>
-      <w:sz w:val="23"/>
+      <w:rFonts w:ascii="Aptos" w:hAnsi="Aptos" w:eastAsia="Aptos"/>
+      <w:color w:val="11243D"/>
+      <w:sz w:val="26"/>
     </w:rPr>
   </w:style>
   <w:style w:type="paragraph" w:styleId="Header">
@@ -1631,11 +1640,11 @@
       <w:outlineLvl w:val="0"/>
     </w:pPr>
     <w:rPr>
-      <w:rFonts w:asciiTheme="majorHAnsi" w:eastAsiaTheme="majorEastAsia" w:hAnsiTheme="majorHAnsi" w:cstheme="majorBidi" w:ascii="Arial" w:hAnsi="Arial" w:eastAsia="Arial"/>
+      <w:rFonts w:asciiTheme="majorHAnsi" w:eastAsiaTheme="majorEastAsia" w:hAnsiTheme="majorHAnsi" w:cstheme="majorBidi" w:ascii="Aptos Display" w:hAnsi="Aptos Display" w:eastAsia="Aptos Display"/>
       <w:b/>
       <w:bCs/>
       <w:color w:val="000000"/>
-      <w:sz w:val="36"/>
+      <w:sz w:val="40"/>
       <w:szCs w:val="28"/>
     </w:rPr>
   </w:style>
@@ -1655,11 +1664,11 @@
       <w:outlineLvl w:val="1"/>
     </w:pPr>
     <w:rPr>
-      <w:rFonts w:asciiTheme="majorHAnsi" w:eastAsiaTheme="majorEastAsia" w:hAnsiTheme="majorHAnsi" w:cstheme="majorBidi" w:ascii="Arial" w:hAnsi="Arial" w:eastAsia="Arial"/>
+      <w:rFonts w:asciiTheme="majorHAnsi" w:eastAsiaTheme="majorEastAsia" w:hAnsiTheme="majorHAnsi" w:cstheme="majorBidi" w:ascii="Aptos Display" w:hAnsi="Aptos Display" w:eastAsia="Aptos Display"/>
       <w:b/>
       <w:bCs/>
       <w:color w:val="000000"/>
-      <w:sz w:val="26"/>
+      <w:sz w:val="30"/>
       <w:szCs w:val="26"/>
     </w:rPr>
   </w:style>
@@ -1920,12 +1929,12 @@
       <w:contextualSpacing/>
     </w:pPr>
     <w:rPr>
-      <w:rFonts w:asciiTheme="majorHAnsi" w:eastAsiaTheme="majorEastAsia" w:hAnsiTheme="majorHAnsi" w:cstheme="majorBidi" w:ascii="Arial" w:hAnsi="Arial" w:eastAsia="Arial"/>
+      <w:rFonts w:asciiTheme="majorHAnsi" w:eastAsiaTheme="majorEastAsia" w:hAnsiTheme="majorHAnsi" w:cstheme="majorBidi" w:ascii="Aptos Display" w:hAnsi="Aptos Display" w:eastAsia="Aptos Display"/>
       <w:b/>
       <w:color w:val="000000"/>
       <w:spacing w:val="5"/>
       <w:kern w:val="28"/>
-      <w:sz w:val="44"/>
+      <w:sz w:val="48"/>
       <w:szCs w:val="52"/>
     </w:rPr>
   </w:style>
@@ -2101,10 +2110,6 @@
       </w:numPr>
       <w:contextualSpacing/>
     </w:pPr>
-    <w:rPr>
-      <w:rFonts w:ascii="Arial" w:hAnsi="Arial" w:eastAsia="Arial"/>
-      <w:color w:val="10233F"/>
-    </w:rPr>
   </w:style>
   <w:style w:type="paragraph" w:styleId="ListBullet2">
     <w:name w:val="List Bullet 2"/>

</xml_diff>